<commit_message>
Deploying to gh-pages from @ d-morrison/rme@681ecbc98189c402dbb227cb58a826c5d0c8da2d 🚀
</commit_message>
<xml_diff>
--- a/chapters/count-regression-handout.docx
+++ b/chapters/count-regression-handout.docx
@@ -39347,7 +39347,7 @@
               <w:rPr>
                 <w:rStyle w:val="CommentTok"/>
               </w:rPr>
-              <w:t xml:space="preserve">#&gt;     hivstat + sexabuse + hplsns, data = needles, init.theta = 0.08315440712, </w:t>
+              <w:t xml:space="preserve">#&gt;     hivstat + sexabuse + hplsns, data = needles, init.theta = 0.0903642555, </w:t>
             </w:r>
             <w:r>
               <w:br/>
@@ -39383,7 +39383,7 @@
               <w:rPr>
                 <w:rStyle w:val="CommentTok"/>
               </w:rPr>
-              <w:t xml:space="preserve">#&gt;                             Estimate Std. Error z value Pr(&gt;|z|)    </w:t>
+              <w:t xml:space="preserve">#&gt;                             Estimate Std. Error z value Pr(&gt;|z|)   </w:t>
             </w:r>
             <w:r>
               <w:br/>
@@ -39392,7 +39392,7 @@
               <w:rPr>
                 <w:rStyle w:val="CommentTok"/>
               </w:rPr>
-              <w:t xml:space="preserve">#&gt; (Intercept)                   6.4536     1.8421    3.50  0.00046 ***</w:t>
+              <w:t xml:space="preserve">#&gt; (Intercept)                   2.8948     1.9293    1.50   0.1335   </w:t>
             </w:r>
             <w:r>
               <w:br/>
@@ -39401,7 +39401,7 @@
               <w:rPr>
                 <w:rStyle w:val="CommentTok"/>
               </w:rPr>
-              <w:t xml:space="preserve">#&gt; homelesshomeless              1.1508     0.7366    1.56  0.11820    </w:t>
+              <w:t xml:space="preserve">#&gt; homelesshomeless              2.5534     0.8024    3.18   0.0015 **</w:t>
             </w:r>
             <w:r>
               <w:br/>
@@ -39410,7 +39410,7 @@
               <w:rPr>
                 <w:rStyle w:val="CommentTok"/>
               </w:rPr>
-              <w:t xml:space="preserve">#&gt; age                          -0.1485     0.0433   -3.43  0.00059 ***</w:t>
+              <w:t xml:space="preserve">#&gt; age                          -0.0729     0.0447   -1.63   0.1027   </w:t>
             </w:r>
             <w:r>
               <w:br/>
@@ -39419,7 +39419,7 @@
               <w:rPr>
                 <w:rStyle w:val="CommentTok"/>
               </w:rPr>
-              <w:t xml:space="preserve">#&gt; sexF                          0.2198     0.8179    0.27  0.78813    </w:t>
+              <w:t xml:space="preserve">#&gt; sexF                         -0.5545     0.8869   -0.63   0.5318   </w:t>
             </w:r>
             <w:r>
               <w:br/>
@@ -39428,7 +39428,7 @@
               <w:rPr>
                 <w:rStyle w:val="CommentTok"/>
               </w:rPr>
-              <w:t xml:space="preserve">#&gt; ethnAA                        1.5958     0.8890    1.79  0.07265 .  </w:t>
+              <w:t xml:space="preserve">#&gt; ethnAA                        0.9100     0.9416    0.97   0.3339   </w:t>
             </w:r>
             <w:r>
               <w:br/>
@@ -39437,7 +39437,7 @@
               <w:rPr>
                 <w:rStyle w:val="CommentTok"/>
               </w:rPr>
-              <w:t xml:space="preserve">#&gt; ethnHispanic                  3.7763     1.5240    2.48  0.01322 *  </w:t>
+              <w:t xml:space="preserve">#&gt; ethnHispanic                  2.6222     1.5835    1.66   0.0977 . </w:t>
             </w:r>
             <w:r>
               <w:br/>
@@ -39446,7 +39446,7 @@
               <w:rPr>
                 <w:rStyle w:val="CommentTok"/>
               </w:rPr>
-              <w:t xml:space="preserve">#&gt; ethnOther                    -3.2365     2.2663   -1.43  0.15327    </w:t>
+              <w:t xml:space="preserve">#&gt; ethnOther                    -1.5963     2.1745   -0.73   0.4629   </w:t>
             </w:r>
             <w:r>
               <w:br/>
@@ -39455,7 +39455,7 @@
               <w:rPr>
                 <w:rStyle w:val="CommentTok"/>
               </w:rPr>
-              <w:t xml:space="preserve">#&gt; polydrugmultiple drugs used  -4.0532     1.0898   -3.72  0.00020 ***</w:t>
+              <w:t xml:space="preserve">#&gt; polydrugmultiple drugs used  -3.7062     1.3330   -2.78   0.0054 **</w:t>
             </w:r>
             <w:r>
               <w:br/>
@@ -39464,7 +39464,7 @@
               <w:rPr>
                 <w:rStyle w:val="CommentTok"/>
               </w:rPr>
-              <w:t xml:space="preserve">#&gt; hivstatHIV+                  -1.1548     1.3185   -0.88  0.38113    </w:t>
+              <w:t xml:space="preserve">#&gt; hivstatHIV+                  -3.4809     1.5036   -2.32   0.0206 * </w:t>
             </w:r>
             <w:r>
               <w:br/>
@@ -39473,7 +39473,7 @@
               <w:rPr>
                 <w:rStyle w:val="CommentTok"/>
               </w:rPr>
-              <w:t xml:space="preserve">#&gt; sexabuseyes                  -2.6449     1.0772   -2.46  0.01408 *  </w:t>
+              <w:t xml:space="preserve">#&gt; sexabuseyes                  -1.5612     1.2484   -1.25   0.2111   </w:t>
             </w:r>
             <w:r>
               <w:br/>
@@ -39482,7 +39482,7 @@
               <w:rPr>
                 <w:rStyle w:val="CommentTok"/>
               </w:rPr>
-              <w:t xml:space="preserve">#&gt; hplsns                        0.0948     0.0648    1.46  0.14306    </w:t>
+              <w:t xml:space="preserve">#&gt; hplsns                       -0.0449     0.0685   -0.66   0.5119   </w:t>
             </w:r>
             <w:r>
               <w:br/>
@@ -39518,7 +39518,7 @@
               <w:rPr>
                 <w:rStyle w:val="CommentTok"/>
               </w:rPr>
-              <w:t xml:space="preserve">#&gt; (Dispersion parameter for Negative Binomial(0.0913) family taken to be 1)</w:t>
+              <w:t xml:space="preserve">#&gt; (Dispersion parameter for Negative Binomial(0.0899) family taken to be 1)</w:t>
             </w:r>
             <w:r>
               <w:br/>
@@ -39536,7 +39536,7 @@
               <w:rPr>
                 <w:rStyle w:val="CommentTok"/>
               </w:rPr>
-              <w:t xml:space="preserve">#&gt;     Null deviance: 62.231  on 108  degrees of freedom</w:t>
+              <w:t xml:space="preserve">#&gt;     Null deviance: 61.511  on 108  degrees of freedom</w:t>
             </w:r>
             <w:r>
               <w:br/>
@@ -39545,7 +39545,7 @@
               <w:rPr>
                 <w:rStyle w:val="CommentTok"/>
               </w:rPr>
-              <w:t xml:space="preserve">#&gt; Residual deviance: 60.031  on  98  degrees of freedom</w:t>
+              <w:t xml:space="preserve">#&gt; Residual deviance: 52.284  on  98  degrees of freedom</w:t>
             </w:r>
             <w:r>
               <w:br/>
@@ -39563,7 +39563,7 @@
               <w:rPr>
                 <w:rStyle w:val="CommentTok"/>
               </w:rPr>
-              <w:t xml:space="preserve">#&gt; AIC: 267.9</w:t>
+              <w:t xml:space="preserve">#&gt; AIC: 261.5</w:t>
             </w:r>
             <w:r>
               <w:br/>
@@ -39608,7 +39608,7 @@
               <w:rPr>
                 <w:rStyle w:val="CommentTok"/>
               </w:rPr>
-              <w:t xml:space="preserve">#&gt;               Theta:  0.0832 </w:t>
+              <w:t xml:space="preserve">#&gt;               Theta:  0.0904 </w:t>
             </w:r>
             <w:r>
               <w:br/>
@@ -39617,7 +39617,7 @@
               <w:rPr>
                 <w:rStyle w:val="CommentTok"/>
               </w:rPr>
-              <w:t xml:space="preserve">#&gt;           Std. Err.:  0.0216 </w:t>
+              <w:t xml:space="preserve">#&gt;           Std. Err.:  0.0239 </w:t>
             </w:r>
             <w:r>
               <w:br/>
@@ -39644,7 +39644,7 @@
               <w:rPr>
                 <w:rStyle w:val="CommentTok"/>
               </w:rPr>
-              <w:t xml:space="preserve">#&gt;  2 x log-likelihood:  -243.8880</w:t>
+              <w:t xml:space="preserve">#&gt;  2 x log-likelihood:  -237.5430</w:t>
             </w:r>
           </w:p>
           <w:bookmarkEnd w:id="88"/>
@@ -40111,11 +40111,11 @@
               <w:tblLook w:firstRow="1" w:lastRow="0" w:firstColumn="0" w:lastColumn="0" w:noHBand="0" w:noVBand="0" w:val="0020"/>
             </w:tblPr>
             <w:tblGrid>
-              <w:gridCol w:w="3046"/>
-              <w:gridCol w:w="1523"/>
-              <w:gridCol w:w="1320"/>
-              <w:gridCol w:w="1015"/>
-              <w:gridCol w:w="1015"/>
+              <w:gridCol w:w="2970"/>
+              <w:gridCol w:w="1485"/>
+              <w:gridCol w:w="1287"/>
+              <w:gridCol w:w="1089"/>
+              <w:gridCol w:w="1089"/>
             </w:tblGrid>
             <w:tr>
               <w:trPr>
@@ -40236,7 +40236,7 @@
                     <w:jc w:val="center"/>
                   </w:pPr>
                   <w:r>
-                    <w:t xml:space="preserve">6.454</w:t>
+                    <w:t xml:space="preserve">2.895</w:t>
                   </w:r>
                 </w:p>
               </w:tc>
@@ -40249,7 +40249,7 @@
                     <w:jc w:val="center"/>
                   </w:pPr>
                   <w:r>
-                    <w:t xml:space="preserve">1.842</w:t>
+                    <w:t xml:space="preserve">1.929</w:t>
                   </w:r>
                 </w:p>
               </w:tc>
@@ -40303,7 +40303,7 @@
                     <w:jc w:val="center"/>
                   </w:pPr>
                   <w:r>
-                    <w:t xml:space="preserve">1.151</w:t>
+                    <w:t xml:space="preserve">2.553</w:t>
                   </w:r>
                 </w:p>
               </w:tc>
@@ -40316,7 +40316,7 @@
                     <w:jc w:val="center"/>
                   </w:pPr>
                   <w:r>
-                    <w:t xml:space="preserve">0.7366</w:t>
+                    <w:t xml:space="preserve">0.8024</w:t>
                   </w:r>
                 </w:p>
               </w:tc>
@@ -40370,7 +40370,7 @@
                     <w:jc w:val="center"/>
                   </w:pPr>
                   <w:r>
-                    <w:t xml:space="preserve">-0.1485</w:t>
+                    <w:t xml:space="preserve">-0.07291</w:t>
                   </w:r>
                 </w:p>
               </w:tc>
@@ -40383,7 +40383,7 @@
                     <w:jc w:val="center"/>
                   </w:pPr>
                   <w:r>
-                    <w:t xml:space="preserve">0.04326</w:t>
+                    <w:t xml:space="preserve">0.04468</w:t>
                   </w:r>
                 </w:p>
               </w:tc>
@@ -40437,7 +40437,7 @@
                     <w:jc w:val="center"/>
                   </w:pPr>
                   <w:r>
-                    <w:t xml:space="preserve">0.2198</w:t>
+                    <w:t xml:space="preserve">-0.5545</w:t>
                   </w:r>
                 </w:p>
               </w:tc>
@@ -40450,7 +40450,7 @@
                     <w:jc w:val="center"/>
                   </w:pPr>
                   <w:r>
-                    <w:t xml:space="preserve">0.8179</w:t>
+                    <w:t xml:space="preserve">0.8869</w:t>
                   </w:r>
                 </w:p>
               </w:tc>
@@ -40504,7 +40504,7 @@
                     <w:jc w:val="center"/>
                   </w:pPr>
                   <w:r>
-                    <w:t xml:space="preserve">1.596</w:t>
+                    <w:t xml:space="preserve">0.91</w:t>
                   </w:r>
                 </w:p>
               </w:tc>
@@ -40517,7 +40517,7 @@
                     <w:jc w:val="center"/>
                   </w:pPr>
                   <w:r>
-                    <w:t xml:space="preserve">0.889</w:t>
+                    <w:t xml:space="preserve">0.9416</w:t>
                   </w:r>
                 </w:p>
               </w:tc>
@@ -40571,7 +40571,7 @@
                     <w:jc w:val="center"/>
                   </w:pPr>
                   <w:r>
-                    <w:t xml:space="preserve">3.776</w:t>
+                    <w:t xml:space="preserve">2.622</w:t>
                   </w:r>
                 </w:p>
               </w:tc>
@@ -40584,7 +40584,7 @@
                     <w:jc w:val="center"/>
                   </w:pPr>
                   <w:r>
-                    <w:t xml:space="preserve">1.524</w:t>
+                    <w:t xml:space="preserve">1.584</w:t>
                   </w:r>
                 </w:p>
               </w:tc>
@@ -40638,7 +40638,7 @@
                     <w:jc w:val="center"/>
                   </w:pPr>
                   <w:r>
-                    <w:t xml:space="preserve">-3.236</w:t>
+                    <w:t xml:space="preserve">-1.596</w:t>
                   </w:r>
                 </w:p>
               </w:tc>
@@ -40651,7 +40651,7 @@
                     <w:jc w:val="center"/>
                   </w:pPr>
                   <w:r>
-                    <w:t xml:space="preserve">2.266</w:t>
+                    <w:t xml:space="preserve">2.175</w:t>
                   </w:r>
                 </w:p>
               </w:tc>
@@ -40705,7 +40705,7 @@
                     <w:jc w:val="center"/>
                   </w:pPr>
                   <w:r>
-                    <w:t xml:space="preserve">-4.053</w:t>
+                    <w:t xml:space="preserve">-3.706</w:t>
                   </w:r>
                 </w:p>
               </w:tc>
@@ -40718,7 +40718,7 @@
                     <w:jc w:val="center"/>
                   </w:pPr>
                   <w:r>
-                    <w:t xml:space="preserve">1.09</w:t>
+                    <w:t xml:space="preserve">1.333</w:t>
                   </w:r>
                 </w:p>
               </w:tc>
@@ -40772,7 +40772,7 @@
                     <w:jc w:val="center"/>
                   </w:pPr>
                   <w:r>
-                    <w:t xml:space="preserve">-1.155</w:t>
+                    <w:t xml:space="preserve">-3.481</w:t>
                   </w:r>
                 </w:p>
               </w:tc>
@@ -40785,7 +40785,7 @@
                     <w:jc w:val="center"/>
                   </w:pPr>
                   <w:r>
-                    <w:t xml:space="preserve">1.319</w:t>
+                    <w:t xml:space="preserve">1.504</w:t>
                   </w:r>
                 </w:p>
               </w:tc>
@@ -40839,7 +40839,7 @@
                     <w:jc w:val="center"/>
                   </w:pPr>
                   <w:r>
-                    <w:t xml:space="preserve">-2.645</w:t>
+                    <w:t xml:space="preserve">-1.561</w:t>
                   </w:r>
                 </w:p>
               </w:tc>
@@ -40852,7 +40852,7 @@
                     <w:jc w:val="center"/>
                   </w:pPr>
                   <w:r>
-                    <w:t xml:space="preserve">1.077</w:t>
+                    <w:t xml:space="preserve">1.248</w:t>
                   </w:r>
                 </w:p>
               </w:tc>
@@ -40906,7 +40906,7 @@
                     <w:jc w:val="center"/>
                   </w:pPr>
                   <w:r>
-                    <w:t xml:space="preserve">0.09484</w:t>
+                    <w:t xml:space="preserve">-0.0449</w:t>
                   </w:r>
                 </w:p>
               </w:tc>
@@ -40919,7 +40919,7 @@
                     <w:jc w:val="center"/>
                   </w:pPr>
                   <w:r>
-                    <w:t xml:space="preserve">0.06476</w:t>
+                    <w:t xml:space="preserve">0.06845</w:t>
                   </w:r>
                 </w:p>
               </w:tc>

</xml_diff>

<commit_message>
Deploying to gh-pages from @ d-morrison/rme@7c32cdd32741836d512a21e8e11dcf6ea58c4431 🚀
</commit_message>
<xml_diff>
--- a/chapters/count-regression-handout.docx
+++ b/chapters/count-regression-handout.docx
@@ -39347,7 +39347,7 @@
               <w:rPr>
                 <w:rStyle w:val="CommentTok"/>
               </w:rPr>
-              <w:t xml:space="preserve">#&gt;     hivstat + sexabuse + hplsns, data = needles, init.theta = 0.0903642555, </w:t>
+              <w:t xml:space="preserve">#&gt;     hivstat + sexabuse + hplsns, data = needles, init.theta = 0.08315440712, </w:t>
             </w:r>
             <w:r>
               <w:br/>
@@ -39383,7 +39383,7 @@
               <w:rPr>
                 <w:rStyle w:val="CommentTok"/>
               </w:rPr>
-              <w:t xml:space="preserve">#&gt;                             Estimate Std. Error z value Pr(&gt;|z|)   </w:t>
+              <w:t xml:space="preserve">#&gt;                             Estimate Std. Error z value Pr(&gt;|z|)    </w:t>
             </w:r>
             <w:r>
               <w:br/>
@@ -39392,7 +39392,7 @@
               <w:rPr>
                 <w:rStyle w:val="CommentTok"/>
               </w:rPr>
-              <w:t xml:space="preserve">#&gt; (Intercept)                   2.8948     1.9293    1.50   0.1335   </w:t>
+              <w:t xml:space="preserve">#&gt; (Intercept)                   6.4536     1.8421    3.50  0.00046 ***</w:t>
             </w:r>
             <w:r>
               <w:br/>
@@ -39401,7 +39401,7 @@
               <w:rPr>
                 <w:rStyle w:val="CommentTok"/>
               </w:rPr>
-              <w:t xml:space="preserve">#&gt; homelesshomeless              2.5534     0.8024    3.18   0.0015 **</w:t>
+              <w:t xml:space="preserve">#&gt; homelesshomeless              1.1508     0.7366    1.56  0.11820    </w:t>
             </w:r>
             <w:r>
               <w:br/>
@@ -39410,7 +39410,7 @@
               <w:rPr>
                 <w:rStyle w:val="CommentTok"/>
               </w:rPr>
-              <w:t xml:space="preserve">#&gt; age                          -0.0729     0.0447   -1.63   0.1027   </w:t>
+              <w:t xml:space="preserve">#&gt; age                          -0.1485     0.0433   -3.43  0.00059 ***</w:t>
             </w:r>
             <w:r>
               <w:br/>
@@ -39419,7 +39419,7 @@
               <w:rPr>
                 <w:rStyle w:val="CommentTok"/>
               </w:rPr>
-              <w:t xml:space="preserve">#&gt; sexF                         -0.5545     0.8869   -0.63   0.5318   </w:t>
+              <w:t xml:space="preserve">#&gt; sexF                          0.2198     0.8179    0.27  0.78813    </w:t>
             </w:r>
             <w:r>
               <w:br/>
@@ -39428,7 +39428,7 @@
               <w:rPr>
                 <w:rStyle w:val="CommentTok"/>
               </w:rPr>
-              <w:t xml:space="preserve">#&gt; ethnAA                        0.9100     0.9416    0.97   0.3339   </w:t>
+              <w:t xml:space="preserve">#&gt; ethnAA                        1.5958     0.8890    1.79  0.07265 .  </w:t>
             </w:r>
             <w:r>
               <w:br/>
@@ -39437,7 +39437,7 @@
               <w:rPr>
                 <w:rStyle w:val="CommentTok"/>
               </w:rPr>
-              <w:t xml:space="preserve">#&gt; ethnHispanic                  2.6222     1.5835    1.66   0.0977 . </w:t>
+              <w:t xml:space="preserve">#&gt; ethnHispanic                  3.7763     1.5240    2.48  0.01322 *  </w:t>
             </w:r>
             <w:r>
               <w:br/>
@@ -39446,7 +39446,7 @@
               <w:rPr>
                 <w:rStyle w:val="CommentTok"/>
               </w:rPr>
-              <w:t xml:space="preserve">#&gt; ethnOther                    -1.5963     2.1745   -0.73   0.4629   </w:t>
+              <w:t xml:space="preserve">#&gt; ethnOther                    -3.2365     2.2663   -1.43  0.15327    </w:t>
             </w:r>
             <w:r>
               <w:br/>
@@ -39455,7 +39455,7 @@
               <w:rPr>
                 <w:rStyle w:val="CommentTok"/>
               </w:rPr>
-              <w:t xml:space="preserve">#&gt; polydrugmultiple drugs used  -3.7062     1.3330   -2.78   0.0054 **</w:t>
+              <w:t xml:space="preserve">#&gt; polydrugmultiple drugs used  -4.0532     1.0898   -3.72  0.00020 ***</w:t>
             </w:r>
             <w:r>
               <w:br/>
@@ -39464,7 +39464,7 @@
               <w:rPr>
                 <w:rStyle w:val="CommentTok"/>
               </w:rPr>
-              <w:t xml:space="preserve">#&gt; hivstatHIV+                  -3.4809     1.5036   -2.32   0.0206 * </w:t>
+              <w:t xml:space="preserve">#&gt; hivstatHIV+                  -1.1548     1.3185   -0.88  0.38113    </w:t>
             </w:r>
             <w:r>
               <w:br/>
@@ -39473,7 +39473,7 @@
               <w:rPr>
                 <w:rStyle w:val="CommentTok"/>
               </w:rPr>
-              <w:t xml:space="preserve">#&gt; sexabuseyes                  -1.5612     1.2484   -1.25   0.2111   </w:t>
+              <w:t xml:space="preserve">#&gt; sexabuseyes                  -2.6449     1.0772   -2.46  0.01408 *  </w:t>
             </w:r>
             <w:r>
               <w:br/>
@@ -39482,7 +39482,7 @@
               <w:rPr>
                 <w:rStyle w:val="CommentTok"/>
               </w:rPr>
-              <w:t xml:space="preserve">#&gt; hplsns                       -0.0449     0.0685   -0.66   0.5119   </w:t>
+              <w:t xml:space="preserve">#&gt; hplsns                        0.0948     0.0648    1.46  0.14306    </w:t>
             </w:r>
             <w:r>
               <w:br/>
@@ -39518,7 +39518,7 @@
               <w:rPr>
                 <w:rStyle w:val="CommentTok"/>
               </w:rPr>
-              <w:t xml:space="preserve">#&gt; (Dispersion parameter for Negative Binomial(0.0899) family taken to be 1)</w:t>
+              <w:t xml:space="preserve">#&gt; (Dispersion parameter for Negative Binomial(0.0913) family taken to be 1)</w:t>
             </w:r>
             <w:r>
               <w:br/>
@@ -39536,7 +39536,7 @@
               <w:rPr>
                 <w:rStyle w:val="CommentTok"/>
               </w:rPr>
-              <w:t xml:space="preserve">#&gt;     Null deviance: 61.511  on 108  degrees of freedom</w:t>
+              <w:t xml:space="preserve">#&gt;     Null deviance: 62.231  on 108  degrees of freedom</w:t>
             </w:r>
             <w:r>
               <w:br/>
@@ -39545,7 +39545,7 @@
               <w:rPr>
                 <w:rStyle w:val="CommentTok"/>
               </w:rPr>
-              <w:t xml:space="preserve">#&gt; Residual deviance: 52.284  on  98  degrees of freedom</w:t>
+              <w:t xml:space="preserve">#&gt; Residual deviance: 60.031  on  98  degrees of freedom</w:t>
             </w:r>
             <w:r>
               <w:br/>
@@ -39563,7 +39563,7 @@
               <w:rPr>
                 <w:rStyle w:val="CommentTok"/>
               </w:rPr>
-              <w:t xml:space="preserve">#&gt; AIC: 261.5</w:t>
+              <w:t xml:space="preserve">#&gt; AIC: 267.9</w:t>
             </w:r>
             <w:r>
               <w:br/>
@@ -39608,7 +39608,7 @@
               <w:rPr>
                 <w:rStyle w:val="CommentTok"/>
               </w:rPr>
-              <w:t xml:space="preserve">#&gt;               Theta:  0.0904 </w:t>
+              <w:t xml:space="preserve">#&gt;               Theta:  0.0832 </w:t>
             </w:r>
             <w:r>
               <w:br/>
@@ -39617,7 +39617,7 @@
               <w:rPr>
                 <w:rStyle w:val="CommentTok"/>
               </w:rPr>
-              <w:t xml:space="preserve">#&gt;           Std. Err.:  0.0239 </w:t>
+              <w:t xml:space="preserve">#&gt;           Std. Err.:  0.0216 </w:t>
             </w:r>
             <w:r>
               <w:br/>
@@ -39644,7 +39644,7 @@
               <w:rPr>
                 <w:rStyle w:val="CommentTok"/>
               </w:rPr>
-              <w:t xml:space="preserve">#&gt;  2 x log-likelihood:  -237.5430</w:t>
+              <w:t xml:space="preserve">#&gt;  2 x log-likelihood:  -243.8880</w:t>
             </w:r>
           </w:p>
           <w:bookmarkEnd w:id="88"/>
@@ -40111,11 +40111,11 @@
               <w:tblLook w:firstRow="1" w:lastRow="0" w:firstColumn="0" w:lastColumn="0" w:noHBand="0" w:noVBand="0" w:val="0020"/>
             </w:tblPr>
             <w:tblGrid>
-              <w:gridCol w:w="2970"/>
-              <w:gridCol w:w="1485"/>
-              <w:gridCol w:w="1287"/>
-              <w:gridCol w:w="1089"/>
-              <w:gridCol w:w="1089"/>
+              <w:gridCol w:w="3046"/>
+              <w:gridCol w:w="1523"/>
+              <w:gridCol w:w="1320"/>
+              <w:gridCol w:w="1015"/>
+              <w:gridCol w:w="1015"/>
             </w:tblGrid>
             <w:tr>
               <w:trPr>
@@ -40236,7 +40236,7 @@
                     <w:jc w:val="center"/>
                   </w:pPr>
                   <w:r>
-                    <w:t xml:space="preserve">2.895</w:t>
+                    <w:t xml:space="preserve">6.454</w:t>
                   </w:r>
                 </w:p>
               </w:tc>
@@ -40249,7 +40249,7 @@
                     <w:jc w:val="center"/>
                   </w:pPr>
                   <w:r>
-                    <w:t xml:space="preserve">1.929</w:t>
+                    <w:t xml:space="preserve">1.842</w:t>
                   </w:r>
                 </w:p>
               </w:tc>
@@ -40303,7 +40303,7 @@
                     <w:jc w:val="center"/>
                   </w:pPr>
                   <w:r>
-                    <w:t xml:space="preserve">2.553</w:t>
+                    <w:t xml:space="preserve">1.151</w:t>
                   </w:r>
                 </w:p>
               </w:tc>
@@ -40316,7 +40316,7 @@
                     <w:jc w:val="center"/>
                   </w:pPr>
                   <w:r>
-                    <w:t xml:space="preserve">0.8024</w:t>
+                    <w:t xml:space="preserve">0.7366</w:t>
                   </w:r>
                 </w:p>
               </w:tc>
@@ -40370,7 +40370,7 @@
                     <w:jc w:val="center"/>
                   </w:pPr>
                   <w:r>
-                    <w:t xml:space="preserve">-0.07291</w:t>
+                    <w:t xml:space="preserve">-0.1485</w:t>
                   </w:r>
                 </w:p>
               </w:tc>
@@ -40383,7 +40383,7 @@
                     <w:jc w:val="center"/>
                   </w:pPr>
                   <w:r>
-                    <w:t xml:space="preserve">0.04468</w:t>
+                    <w:t xml:space="preserve">0.04326</w:t>
                   </w:r>
                 </w:p>
               </w:tc>
@@ -40437,7 +40437,7 @@
                     <w:jc w:val="center"/>
                   </w:pPr>
                   <w:r>
-                    <w:t xml:space="preserve">-0.5545</w:t>
+                    <w:t xml:space="preserve">0.2198</w:t>
                   </w:r>
                 </w:p>
               </w:tc>
@@ -40450,7 +40450,7 @@
                     <w:jc w:val="center"/>
                   </w:pPr>
                   <w:r>
-                    <w:t xml:space="preserve">0.8869</w:t>
+                    <w:t xml:space="preserve">0.8179</w:t>
                   </w:r>
                 </w:p>
               </w:tc>
@@ -40504,7 +40504,7 @@
                     <w:jc w:val="center"/>
                   </w:pPr>
                   <w:r>
-                    <w:t xml:space="preserve">0.91</w:t>
+                    <w:t xml:space="preserve">1.596</w:t>
                   </w:r>
                 </w:p>
               </w:tc>
@@ -40517,7 +40517,7 @@
                     <w:jc w:val="center"/>
                   </w:pPr>
                   <w:r>
-                    <w:t xml:space="preserve">0.9416</w:t>
+                    <w:t xml:space="preserve">0.889</w:t>
                   </w:r>
                 </w:p>
               </w:tc>
@@ -40571,7 +40571,7 @@
                     <w:jc w:val="center"/>
                   </w:pPr>
                   <w:r>
-                    <w:t xml:space="preserve">2.622</w:t>
+                    <w:t xml:space="preserve">3.776</w:t>
                   </w:r>
                 </w:p>
               </w:tc>
@@ -40584,7 +40584,7 @@
                     <w:jc w:val="center"/>
                   </w:pPr>
                   <w:r>
-                    <w:t xml:space="preserve">1.584</w:t>
+                    <w:t xml:space="preserve">1.524</w:t>
                   </w:r>
                 </w:p>
               </w:tc>
@@ -40638,7 +40638,7 @@
                     <w:jc w:val="center"/>
                   </w:pPr>
                   <w:r>
-                    <w:t xml:space="preserve">-1.596</w:t>
+                    <w:t xml:space="preserve">-3.236</w:t>
                   </w:r>
                 </w:p>
               </w:tc>
@@ -40651,7 +40651,7 @@
                     <w:jc w:val="center"/>
                   </w:pPr>
                   <w:r>
-                    <w:t xml:space="preserve">2.175</w:t>
+                    <w:t xml:space="preserve">2.266</w:t>
                   </w:r>
                 </w:p>
               </w:tc>
@@ -40705,7 +40705,7 @@
                     <w:jc w:val="center"/>
                   </w:pPr>
                   <w:r>
-                    <w:t xml:space="preserve">-3.706</w:t>
+                    <w:t xml:space="preserve">-4.053</w:t>
                   </w:r>
                 </w:p>
               </w:tc>
@@ -40718,7 +40718,7 @@
                     <w:jc w:val="center"/>
                   </w:pPr>
                   <w:r>
-                    <w:t xml:space="preserve">1.333</w:t>
+                    <w:t xml:space="preserve">1.09</w:t>
                   </w:r>
                 </w:p>
               </w:tc>
@@ -40772,7 +40772,7 @@
                     <w:jc w:val="center"/>
                   </w:pPr>
                   <w:r>
-                    <w:t xml:space="preserve">-3.481</w:t>
+                    <w:t xml:space="preserve">-1.155</w:t>
                   </w:r>
                 </w:p>
               </w:tc>
@@ -40785,7 +40785,7 @@
                     <w:jc w:val="center"/>
                   </w:pPr>
                   <w:r>
-                    <w:t xml:space="preserve">1.504</w:t>
+                    <w:t xml:space="preserve">1.319</w:t>
                   </w:r>
                 </w:p>
               </w:tc>
@@ -40839,7 +40839,7 @@
                     <w:jc w:val="center"/>
                   </w:pPr>
                   <w:r>
-                    <w:t xml:space="preserve">-1.561</w:t>
+                    <w:t xml:space="preserve">-2.645</w:t>
                   </w:r>
                 </w:p>
               </w:tc>
@@ -40852,7 +40852,7 @@
                     <w:jc w:val="center"/>
                   </w:pPr>
                   <w:r>
-                    <w:t xml:space="preserve">1.248</w:t>
+                    <w:t xml:space="preserve">1.077</w:t>
                   </w:r>
                 </w:p>
               </w:tc>
@@ -40906,7 +40906,7 @@
                     <w:jc w:val="center"/>
                   </w:pPr>
                   <w:r>
-                    <w:t xml:space="preserve">-0.0449</w:t>
+                    <w:t xml:space="preserve">0.09484</w:t>
                   </w:r>
                 </w:p>
               </w:tc>
@@ -40919,7 +40919,7 @@
                     <w:jc w:val="center"/>
                   </w:pPr>
                   <w:r>
-                    <w:t xml:space="preserve">0.06845</w:t>
+                    <w:t xml:space="preserve">0.06476</w:t>
                   </w:r>
                 </w:p>
               </w:tc>
@@ -49910,72 +49910,119 @@
                   </m:r>
                 </m:sub>
               </m:sSub>
+              <m:limUpp>
+                <m:e>
+                  <m:r>
+                    <m:rPr>
+                      <m:sty m:val="p"/>
+                    </m:rPr>
+                    <m:t>=</m:t>
+                  </m:r>
+                </m:e>
+                <m:lim>
+                  <m:r>
+                    <m:rPr>
+                      <m:nor/>
+                      <m:sty m:val="p"/>
+                    </m:rPr>
+                    <m:t>def</m:t>
+                  </m:r>
+                </m:lim>
+              </m:limUpp>
+              <m:sSup>
+                <m:e>
+                  <m:r>
+                    <m:rPr>
+                      <m:sty m:val="p"/>
+                    </m:rPr>
+                    <m:t>(</m:t>
+                  </m:r>
+                  <m:sSub>
+                    <m:e>
+                      <m:r>
+                        <m:t>x</m:t>
+                      </m:r>
+                    </m:e>
+                    <m:sub>
+                      <m:r>
+                        <m:t>1</m:t>
+                      </m:r>
+                      <m:r>
+                        <m:t>j</m:t>
+                      </m:r>
+                    </m:sub>
+                  </m:sSub>
+                  <m:r>
+                    <m:rPr>
+                      <m:sty m:val="p"/>
+                    </m:rPr>
+                    <m:t>,</m:t>
+                  </m:r>
+                  <m:r>
+                    <m:rPr>
+                      <m:sty m:val="p"/>
+                    </m:rPr>
+                    <m:t>…</m:t>
+                  </m:r>
+                  <m:r>
+                    <m:rPr>
+                      <m:sty m:val="p"/>
+                    </m:rPr>
+                    <m:t>,</m:t>
+                  </m:r>
+                  <m:sSub>
+                    <m:e>
+                      <m:r>
+                        <m:t>x</m:t>
+                      </m:r>
+                    </m:e>
+                    <m:sub>
+                      <m:r>
+                        <m:t>n</m:t>
+                      </m:r>
+                      <m:r>
+                        <m:t>j</m:t>
+                      </m:r>
+                    </m:sub>
+                  </m:sSub>
+                  <m:r>
+                    <m:rPr>
+                      <m:sty m:val="p"/>
+                    </m:rPr>
+                    <m:t>)</m:t>
+                  </m:r>
+                </m:e>
+                <m:sup>
+                  <m:r>
+                    <m:rPr>
+                      <m:sty m:val="p"/>
+                    </m:rPr>
+                    <m:t>⊤</m:t>
+                  </m:r>
+                </m:sup>
+              </m:sSup>
               <m:r>
                 <m:rPr>
                   <m:sty m:val="p"/>
                 </m:rPr>
-                <m:t>=</m:t>
-              </m:r>
-              <m:r>
-                <m:rPr>
-                  <m:sty m:val="p"/>
-                </m:rPr>
-                <m:t>(</m:t>
-              </m:r>
-              <m:sSub>
+                <m:t>∈</m:t>
+              </m:r>
+              <m:sSup>
                 <m:e>
                   <m:r>
-                    <m:t>x</m:t>
+                    <m:rPr>
+                      <m:scr m:val="double-struck"/>
+                      <m:sty m:val="p"/>
+                    </m:rPr>
+                    <m:t>R</m:t>
                   </m:r>
                 </m:e>
-                <m:sub>
-                  <m:r>
-                    <m:t>1</m:t>
-                  </m:r>
-                  <m:r>
-                    <m:t>j</m:t>
-                  </m:r>
-                </m:sub>
-              </m:sSub>
-              <m:r>
-                <m:rPr>
-                  <m:sty m:val="p"/>
-                </m:rPr>
-                <m:t>,</m:t>
-              </m:r>
-              <m:r>
-                <m:rPr>
-                  <m:sty m:val="p"/>
-                </m:rPr>
-                <m:t>…</m:t>
-              </m:r>
-              <m:r>
-                <m:rPr>
-                  <m:sty m:val="p"/>
-                </m:rPr>
-                <m:t>,</m:t>
-              </m:r>
-              <m:sSub>
-                <m:e>
-                  <m:r>
-                    <m:t>x</m:t>
-                  </m:r>
-                </m:e>
-                <m:sub>
+                <m:sup>
                   <m:r>
                     <m:t>n</m:t>
                   </m:r>
-                  <m:r>
-                    <m:t>j</m:t>
-                  </m:r>
-                </m:sub>
-              </m:sSub>
-              <m:r>
-                <m:rPr>
-                  <m:sty m:val="p"/>
-                </m:rPr>
-                <m:t>)</m:t>
-              </m:r>
+                </m:sup>
+              </m:sSup>
             </m:oMath>
             <w:r>
               <w:t xml:space="preserve"> </w:t>

</xml_diff>

<commit_message>
Deploying to gh-pages from @ d-morrison/rme@9f025a76720630d59871d762155864b188f54e98 🚀
</commit_message>
<xml_diff>
--- a/chapters/count-regression-handout.docx
+++ b/chapters/count-regression-handout.docx
@@ -1648,812 +1648,16 @@
                 <m:t>E</m:t>
               </m:r>
               <m:r>
-                <m:rPr>
-                  <m:sty m:val="p"/>
-                </m:rPr>
-                <m:t>[</m:t>
-              </m:r>
-              <m:r>
-                <m:t>Y</m:t>
-              </m:r>
-              <m:r>
-                <m:rPr>
-                  <m:sty m:val="p"/>
-                </m:rPr>
-                <m:t>∣</m:t>
-              </m:r>
-              <m:acc>
-                <m:accPr>
-                  <m:chr m:val="̃"/>
-                </m:accPr>
-                <m:e>
-                  <m:r>
-                    <m:t>X</m:t>
-                  </m:r>
-                </m:e>
-              </m:acc>
-              <m:r>
-                <m:rPr>
-                  <m:sty m:val="p"/>
-                </m:rPr>
-                <m:t>=</m:t>
-              </m:r>
-              <m:acc>
-                <m:accPr>
-                  <m:chr m:val="̃"/>
-                </m:accPr>
-                <m:e>
-                  <m:r>
-                    <m:t>x</m:t>
-                  </m:r>
-                </m:e>
-              </m:acc>
-              <m:r>
-                <m:rPr>
-                  <m:sty m:val="p"/>
-                </m:rPr>
-                <m:t>,</m:t>
-              </m:r>
-              <m:r>
-                <m:t>T</m:t>
-              </m:r>
-              <m:r>
-                <m:rPr>
-                  <m:sty m:val="p"/>
-                </m:rPr>
-                <m:t>=</m:t>
-              </m:r>
-              <m:r>
-                <m:t>t</m:t>
-              </m:r>
-              <m:r>
-                <m:rPr>
-                  <m:sty m:val="p"/>
-                </m:rPr>
-                <m:t>]</m:t>
-              </m:r>
-              <m:r>
-                <m:t>&amp;</m:t>
-              </m:r>
-              <m:r>
-                <m:rPr>
-                  <m:sty m:val="p"/>
-                </m:rPr>
-                <m:t>=</m:t>
-              </m:r>
-              <m:r>
-                <m:t>μ</m:t>
-              </m:r>
-              <m:r>
-                <m:rPr>
-                  <m:sty m:val="p"/>
-                </m:rPr>
-                <m:t>(</m:t>
-              </m:r>
-              <m:acc>
-                <m:accPr>
-                  <m:chr m:val="̃"/>
-                </m:accPr>
-                <m:e>
-                  <m:r>
-                    <m:t>x</m:t>
-                  </m:r>
-                </m:e>
-              </m:acc>
-              <m:r>
-                <m:rPr>
-                  <m:sty m:val="p"/>
-                </m:rPr>
-                <m:t>,</m:t>
-              </m:r>
-              <m:r>
-                <m:t>t</m:t>
-              </m:r>
-              <m:r>
-                <m:rPr>
-                  <m:sty m:val="p"/>
-                </m:rPr>
-                <m:t>)</m:t>
-              </m:r>
-            </m:e>
-            <m:e>
-              <m:r>
-                <m:t>μ</m:t>
-              </m:r>
-              <m:r>
-                <m:rPr>
-                  <m:sty m:val="p"/>
-                </m:rPr>
-                <m:t>(</m:t>
-              </m:r>
-              <m:acc>
-                <m:accPr>
-                  <m:chr m:val="̃"/>
-                </m:accPr>
-                <m:e>
-                  <m:r>
-                    <m:t>x</m:t>
-                  </m:r>
-                </m:e>
-              </m:acc>
-              <m:r>
-                <m:rPr>
-                  <m:sty m:val="p"/>
-                </m:rPr>
-                <m:t>,</m:t>
-              </m:r>
-              <m:r>
-                <m:t>t</m:t>
-              </m:r>
-              <m:r>
-                <m:rPr>
-                  <m:sty m:val="p"/>
-                </m:rPr>
-                <m:t>)</m:t>
-              </m:r>
-              <m:r>
-                <m:t>&amp;</m:t>
-              </m:r>
-              <m:r>
-                <m:rPr>
-                  <m:sty m:val="p"/>
-                </m:rPr>
-                <m:t>=</m:t>
-              </m:r>
-              <m:r>
-                <m:t>λ</m:t>
-              </m:r>
-              <m:r>
-                <m:rPr>
-                  <m:sty m:val="p"/>
-                </m:rPr>
-                <m:t>(</m:t>
-              </m:r>
-              <m:acc>
-                <m:accPr>
-                  <m:chr m:val="̃"/>
-                </m:accPr>
-                <m:e>
-                  <m:r>
-                    <m:t>x</m:t>
-                  </m:r>
-                </m:e>
-              </m:acc>
-              <m:r>
-                <m:rPr>
-                  <m:sty m:val="p"/>
-                </m:rPr>
-                <m:t>)</m:t>
-              </m:r>
-              <m:r>
-                <m:rPr>
-                  <m:sty m:val="p"/>
-                </m:rPr>
-                <m:t>⋅</m:t>
-              </m:r>
-              <m:r>
-                <m:t>t</m:t>
-              </m:r>
-            </m:e>
-            <m:e>
-              <m:r>
-                <m:t>λ</m:t>
-              </m:r>
-              <m:r>
-                <m:rPr>
-                  <m:sty m:val="p"/>
-                </m:rPr>
-                <m:t>(</m:t>
-              </m:r>
-              <m:acc>
-                <m:accPr>
-                  <m:chr m:val="̃"/>
-                </m:accPr>
-                <m:e>
-                  <m:r>
-                    <m:t>x</m:t>
-                  </m:r>
-                </m:e>
-              </m:acc>
-              <m:r>
-                <m:rPr>
-                  <m:sty m:val="p"/>
-                </m:rPr>
-                <m:t>)</m:t>
-              </m:r>
-              <m:r>
-                <m:t>&amp;</m:t>
-              </m:r>
-              <m:r>
-                <m:rPr>
-                  <m:sty m:val="p"/>
-                </m:rPr>
-                <m:t>=</m:t>
-              </m:r>
-              <m:r>
-                <m:rPr>
-                  <m:sty m:val="p"/>
-                </m:rPr>
-                <m:t>exp</m:t>
-              </m:r>
-              <m:r>
                 <m:t>​</m:t>
               </m:r>
               <m:d>
                 <m:dPr>
-                  <m:begChr m:val="{"/>
+                  <m:begChr m:val="["/>
                   <m:sepChr m:val=""/>
-                  <m:endChr m:val="}"/>
+                  <m:endChr m:val="]"/>
                   <m:grow/>
                 </m:dPr>
                 <m:e>
-                  <m:r>
-                    <m:t>η</m:t>
-                  </m:r>
-                  <m:r>
-                    <m:rPr>
-                      <m:sty m:val="p"/>
-                    </m:rPr>
-                    <m:t>(</m:t>
-                  </m:r>
-                  <m:acc>
-                    <m:accPr>
-                      <m:chr m:val="̃"/>
-                    </m:accPr>
-                    <m:e>
-                      <m:r>
-                        <m:t>x</m:t>
-                      </m:r>
-                    </m:e>
-                  </m:acc>
-                  <m:r>
-                    <m:rPr>
-                      <m:sty m:val="p"/>
-                    </m:rPr>
-                    <m:t>)</m:t>
-                  </m:r>
-                </m:e>
-              </m:d>
-              <m:r>
-                <m:t>​</m:t>
-              </m:r>
-            </m:e>
-            <m:e>
-              <m:r>
-                <m:t>η</m:t>
-              </m:r>
-              <m:r>
-                <m:rPr>
-                  <m:sty m:val="p"/>
-                </m:rPr>
-                <m:t>(</m:t>
-              </m:r>
-              <m:acc>
-                <m:accPr>
-                  <m:chr m:val="̃"/>
-                </m:accPr>
-                <m:e>
-                  <m:r>
-                    <m:t>x</m:t>
-                  </m:r>
-                </m:e>
-              </m:acc>
-              <m:r>
-                <m:rPr>
-                  <m:sty m:val="p"/>
-                </m:rPr>
-                <m:t>)</m:t>
-              </m:r>
-              <m:r>
-                <m:t>&amp;</m:t>
-              </m:r>
-              <m:r>
-                <m:rPr>
-                  <m:sty m:val="p"/>
-                </m:rPr>
-                <m:t>=</m:t>
-              </m:r>
-              <m:sSub>
-                <m:e>
-                  <m:r>
-                    <m:t>β</m:t>
-                  </m:r>
-                </m:e>
-                <m:sub>
-                  <m:r>
-                    <m:t>0</m:t>
-                  </m:r>
-                </m:sub>
-              </m:sSub>
-              <m:r>
-                <m:rPr>
-                  <m:sty m:val="p"/>
-                </m:rPr>
-                <m:t>+</m:t>
-              </m:r>
-              <m:sSub>
-                <m:e>
-                  <m:r>
-                    <m:t>β</m:t>
-                  </m:r>
-                </m:e>
-                <m:sub>
-                  <m:r>
-                    <m:t>1</m:t>
-                  </m:r>
-                </m:sub>
-              </m:sSub>
-              <m:sSub>
-                <m:e>
-                  <m:r>
-                    <m:t>x</m:t>
-                  </m:r>
-                </m:e>
-                <m:sub>
-                  <m:r>
-                    <m:t>1</m:t>
-                  </m:r>
-                </m:sub>
-              </m:sSub>
-              <m:r>
-                <m:rPr>
-                  <m:sty m:val="p"/>
-                </m:rPr>
-                <m:t>+</m:t>
-              </m:r>
-              <m:r>
-                <m:rPr>
-                  <m:sty m:val="p"/>
-                </m:rPr>
-                <m:t>…</m:t>
-              </m:r>
-              <m:r>
-                <m:rPr>
-                  <m:sty m:val="p"/>
-                </m:rPr>
-                <m:t>+</m:t>
-              </m:r>
-              <m:sSub>
-                <m:e>
-                  <m:r>
-                    <m:t>β</m:t>
-                  </m:r>
-                </m:e>
-                <m:sub>
-                  <m:r>
-                    <m:t>p</m:t>
-                  </m:r>
-                </m:sub>
-              </m:sSub>
-              <m:sSub>
-                <m:e>
-                  <m:r>
-                    <m:t>x</m:t>
-                  </m:r>
-                </m:e>
-                <m:sub>
-                  <m:r>
-                    <m:t>p</m:t>
-                  </m:r>
-                </m:sub>
-              </m:sSub>
-            </m:e>
-          </m:eqArr>
-          <m:r>
-            <m:t>  </m:t>
-          </m:r>
-          <m:r>
-            <m:rPr>
-              <m:sty m:val="p"/>
-            </m:rPr>
-            <m:t>(</m:t>
-          </m:r>
-          <m:r>
-            <m:t>1</m:t>
-          </m:r>
-          <m:r>
-            <m:rPr>
-              <m:sty m:val="p"/>
-            </m:rPr>
-            <m:t>)</m:t>
-          </m:r>
-        </m:oMath>
-      </m:oMathPara>
-      <w:bookmarkEnd w:id="12"/>
-    </w:p>
-    <w:p>
-      <w:pPr>
-        <w:pStyle w:val="FirstParagraph"/>
-      </w:pPr>
-      <w:r>
-        <w:t xml:space="preserve">The term</w:t>
-      </w:r>
-      <w:r>
-        <w:t xml:space="preserve"> </w:t>
-      </w:r>
-      <m:oMath>
-        <m:r>
-          <m:t>T</m:t>
-        </m:r>
-        <m:r>
-          <m:rPr>
-            <m:sty m:val="p"/>
-          </m:rPr>
-          <m:t>=</m:t>
-        </m:r>
-        <m:r>
-          <m:t>t</m:t>
-        </m:r>
-      </m:oMath>
-      <w:r>
-        <w:t xml:space="preserve"> </w:t>
-      </w:r>
-      <w:r>
-        <w:t xml:space="preserve">represents the</w:t>
-      </w:r>
-      <w:r>
-        <w:t xml:space="preserve"> </w:t>
-      </w:r>
-      <w:hyperlink r:id="rId13">
-        <w:r>
-          <w:rPr>
-            <w:rStyle w:val="Hyperlink"/>
-          </w:rPr>
-          <w:t xml:space="preserve">exposure magnitude</w:t>
-        </w:r>
-      </w:hyperlink>
-      <w:r>
-        <w:t xml:space="preserve"> </w:t>
-      </w:r>
-      <w:r>
-        <w:t xml:space="preserve">(such as person-years or observation time)</w:t>
-      </w:r>
-      <w:r>
-        <w:t xml:space="preserve"> </w:t>
-      </w:r>
-      <w:r>
-        <w:t xml:space="preserve">and plays a structural role in scaling rates to expected counts.</w:t>
-      </w:r>
-    </w:p>
-    <w:p>
-      <w:r>
-        <w:pict>
-          <v:rect style="width:0;height:1.5pt" o:hralign="center" o:hrstd="t" o:hr="t"/>
-        </w:pict>
-      </w:r>
-    </w:p>
-    <w:tbl>
-      <w:tblPr>
-        <w:tblStyle w:val="Table"/>
-        <w:tblInd w:w="164" w:type="dxa"/>
-        <w:tblBorders>
-          <w:left w:val="single" w:sz="24" w:space="0" w:color="909090"/>
-        </w:tblBorders>
-        <w:tblCellMar>
-          <w:left w:w="0" w:type="dxa"/>
-          <w:right w:w="0" w:type="dxa"/>
-        </w:tblCellMar>
-        <w:tblLook w:firstRow="0" w:lastRow="0" w:firstColumn="0" w:lastColumn="0" w:noHBand="0" w:noVBand="0" w:val="0000"/>
-      </w:tblPr>
-      <w:tblGrid>
-        <w:gridCol w:w="7920"/>
-      </w:tblGrid>
-      <w:tr>
-        <w:trPr>
-          <w:cantSplit/>
-        </w:trPr>
-        <w:tc>
-          <w:tcPr>
-            <w:tcMar>
-              <w:left w:w="144" w:type="dxa"/>
-            </w:tcMar>
-          </w:tcPr>
-          <w:p>
-            <w:pPr>
-              <w:pStyle w:val="FirstParagraph"/>
-            </w:pPr>
-            <w:pPr>
-              <w:spacing w:before="16" w:after="64"/>
-            </w:pPr>
-          </w:p>
-          <w:bookmarkStart w:id="14" w:name="exr-analogy-pois-offset-binom"/>
-          <w:p>
-            <w:pPr>
-              <w:pStyle w:val="BodyText"/>
-            </w:pPr>
-            <w:r>
-              <w:rPr>
-                <w:b/>
-                <w:bCs/>
-              </w:rPr>
-              <w:t xml:space="preserve">Exercise 1</w:t>
-            </w:r>
-            <w:r>
-              <w:t xml:space="preserve"> </w:t>
-            </w:r>
-            <w:r>
-              <w:t xml:space="preserve">Where have we seen a relationship like</w:t>
-            </w:r>
-          </w:p>
-          <w:p>
-            <w:pPr>
-              <w:pStyle w:val="BodyText"/>
-            </w:pPr>
-            <m:oMathPara>
-              <m:oMathParaPr>
-                <m:jc m:val="center"/>
-              </m:oMathParaPr>
-              <m:oMath>
-                <m:r>
-                  <m:t>μ</m:t>
-                </m:r>
-                <m:r>
-                  <m:rPr>
-                    <m:sty m:val="p"/>
-                  </m:rPr>
-                  <m:t>=</m:t>
-                </m:r>
-                <m:r>
-                  <m:t>λ</m:t>
-                </m:r>
-                <m:r>
-                  <m:rPr>
-                    <m:sty m:val="p"/>
-                  </m:rPr>
-                  <m:t>⋅</m:t>
-                </m:r>
-                <m:r>
-                  <m:t>t</m:t>
-                </m:r>
-              </m:oMath>
-            </m:oMathPara>
-          </w:p>
-          <w:p>
-            <w:pPr>
-              <w:pStyle w:val="FirstParagraph"/>
-            </w:pPr>
-            <w:r>
-              <w:t xml:space="preserve">before?</w:t>
-            </w:r>
-          </w:p>
-          <w:bookmarkEnd w:id="14"/>
-        </w:tc>
-      </w:tr>
-    </w:tbl>
-    <w:p>
-      <w:r>
-        <w:pict>
-          <v:rect style="width:0;height:1.5pt" o:hralign="center" o:hrstd="t" o:hr="t"/>
-        </w:pict>
-      </w:r>
-    </w:p>
-    <w:tbl>
-      <w:tblPr>
-        <w:tblStyle w:val="Table"/>
-        <w:tblLook w:firstRow="0" w:lastRow="0" w:firstColumn="0" w:lastColumn="0" w:noHBand="0" w:noVBand="0" w:val="0000"/>
-        <w:tblBorders>
-          <w:top w:val="single" w:sz="4" w:space="0" w:color="909090"/>
-          <w:left w:val="single" w:sz="24" w:space="0" w:color="909090"/>
-          <w:bottom w:val="single" w:sz="4" w:space="0" w:color="909090"/>
-          <w:right w:val="single" w:sz="4" w:space="0" w:color="909090"/>
-        </w:tblBorders>
-        <w:tblCellMar>
-          <w:left w:w="144" w:type="dxa"/>
-          <w:right w:w="144" w:type="dxa"/>
-        </w:tblCellMar>
-        <w:tblLook w:firstRow="0" w:lastRow="0" w:firstColumn="0" w:lastColumn="0" w:noHBand="0" w:noVBand="0" w:val="0000"/>
-      </w:tblPr>
-      <w:tr>
-        <w:trPr>
-          <w:cantSplit/>
-        </w:trPr>
-        <w:tc>
-          <w:tcPr>
-            <w:shd w:color="auto" w:fill="e6e6e6" w:val="clear"/>
-            <w:tcMar>
-              <w:top w:w="92" w:type="dxa"/>
-              <w:bottom w:w="92" w:type="dxa"/>
-            </w:tcMar>
-          </w:tcPr>
-          <w:p>
-            <w:pPr>
-              <w:pStyle w:val="FirstParagraph"/>
-            </w:pPr>
-            <w:pPr>
-              <w:spacing w:before="16" w:after="16"/>
-            </w:pPr>
-            <w:r>
-              <w:t xml:space="preserve">Solution</w:t>
-            </w:r>
-          </w:p>
-        </w:tc>
-      </w:tr>
-      <w:tr>
-        <w:trPr>
-          <w:cantSplit/>
-        </w:trPr>
-        <w:tc>
-          <w:tcPr>
-            <w:tcMar>
-              <w:top w:w="108" w:type="dxa"/>
-              <w:bottom w:w="108" w:type="dxa"/>
-            </w:tcMar>
-          </w:tcPr>
-          <w:bookmarkStart w:id="15" w:name="sol-analogy-pois-offset-binom"/>
-          <w:p>
-            <w:pPr>
-              <w:pStyle w:val="BodyText"/>
-            </w:pPr>
-            <w:r>
-              <w:rPr>
-                <w:i/>
-                <w:iCs/>
-              </w:rPr>
-              <w:t xml:space="preserve">Solution 1</w:t>
-            </w:r>
-            <w:r>
-              <w:t xml:space="preserve">. </w:t>
-            </w:r>
-            <w:r>
-              <w:t xml:space="preserve">The relationship</w:t>
-            </w:r>
-          </w:p>
-          <w:p>
-            <w:pPr>
-              <w:pStyle w:val="BodyText"/>
-            </w:pPr>
-            <m:oMathPara>
-              <m:oMathParaPr>
-                <m:jc m:val="center"/>
-              </m:oMathParaPr>
-              <m:oMath>
-                <m:r>
-                  <m:t>μ</m:t>
-                </m:r>
-                <m:r>
-                  <m:rPr>
-                    <m:sty m:val="p"/>
-                  </m:rPr>
-                  <m:t>=</m:t>
-                </m:r>
-                <m:r>
-                  <m:t>λ</m:t>
-                </m:r>
-                <m:r>
-                  <m:rPr>
-                    <m:sty m:val="p"/>
-                  </m:rPr>
-                  <m:t>⋅</m:t>
-                </m:r>
-                <m:r>
-                  <m:t>t</m:t>
-                </m:r>
-              </m:oMath>
-            </m:oMathPara>
-          </w:p>
-          <w:p>
-            <w:pPr>
-              <w:pStyle w:val="FirstParagraph"/>
-            </w:pPr>
-            <w:r>
-              <w:t xml:space="preserve">in count regression models</w:t>
-            </w:r>
-            <w:r>
-              <w:t xml:space="preserve"> </w:t>
-            </w:r>
-            <w:r>
-              <w:t xml:space="preserve">is analogous to the relationship</w:t>
-            </w:r>
-          </w:p>
-          <w:p>
-            <w:pPr>
-              <w:pStyle w:val="BodyText"/>
-            </w:pPr>
-            <m:oMathPara>
-              <m:oMathParaPr>
-                <m:jc m:val="center"/>
-              </m:oMathParaPr>
-              <m:oMath>
-                <m:r>
-                  <m:t>μ</m:t>
-                </m:r>
-                <m:r>
-                  <m:rPr>
-                    <m:sty m:val="p"/>
-                  </m:rPr>
-                  <m:t>=</m:t>
-                </m:r>
-                <m:r>
-                  <m:t>n</m:t>
-                </m:r>
-                <m:r>
-                  <m:t>π</m:t>
-                </m:r>
-              </m:oMath>
-            </m:oMathPara>
-          </w:p>
-          <w:p>
-            <w:pPr>
-              <w:pStyle w:val="FirstParagraph"/>
-            </w:pPr>
-            <w:r>
-              <w:t xml:space="preserve">in Binomial models.</w:t>
-            </w:r>
-          </w:p>
-          <w:bookmarkEnd w:id="15"/>
-          <w:p/>
-        </w:tc>
-      </w:tr>
-    </w:tbl>
-    <w:p>
-      <w:r>
-        <w:pict>
-          <v:rect style="width:0;height:1.5pt" o:hralign="center" o:hrstd="t" o:hr="t"/>
-        </w:pict>
-      </w:r>
-    </w:p>
-    <w:p>
-      <w:pPr>
-        <w:pStyle w:val="FirstParagraph"/>
-      </w:pPr>
-      <w:r>
-        <w:t xml:space="preserve">We can also express the exposure magnitude</w:t>
-      </w:r>
-      <w:r>
-        <w:t xml:space="preserve"> </w:t>
-      </w:r>
-      <m:oMath>
-        <m:r>
-          <m:t>t</m:t>
-        </m:r>
-      </m:oMath>
-      <w:r>
-        <w:t xml:space="preserve"> </w:t>
-      </w:r>
-      <w:r>
-        <w:t xml:space="preserve">directly as a component of the linear predictor:</w:t>
-      </w:r>
-    </w:p>
-    <w:p>
-      <w:pPr>
-        <w:pStyle w:val="BodyText"/>
-      </w:pPr>
-      <m:oMathPara>
-        <m:oMathParaPr>
-          <m:jc m:val="center"/>
-        </m:oMathParaPr>
-        <m:oMath>
-          <m:eqArr>
-            <m:e>
-              <m:r>
-                <m:rPr>
-                  <m:sty m:val="p"/>
-                </m:rPr>
-                <m:t>log</m:t>
-              </m:r>
-              <m:r>
-                <m:t>​</m:t>
-              </m:r>
-              <m:d>
-                <m:dPr>
-                  <m:begChr m:val="{"/>
-                  <m:sepChr m:val=""/>
-                  <m:endChr m:val="}"/>
-                  <m:grow/>
-                </m:dPr>
-                <m:e>
-                  <m:r>
-                    <m:rPr>
-                      <m:sty m:val="p"/>
-                    </m:rPr>
-                    <m:t>E</m:t>
-                  </m:r>
-                  <m:r>
-                    <m:rPr>
-                      <m:sty m:val="p"/>
-                    </m:rPr>
-                    <m:t>[</m:t>
-                  </m:r>
                   <m:r>
                     <m:t>Y</m:t>
                   </m:r>
@@ -2507,11 +1711,815 @@
                   <m:r>
                     <m:t>t</m:t>
                   </m:r>
+                </m:e>
+              </m:d>
+              <m:r>
+                <m:t>​</m:t>
+              </m:r>
+              <m:r>
+                <m:t>&amp;</m:t>
+              </m:r>
+              <m:r>
+                <m:rPr>
+                  <m:sty m:val="p"/>
+                </m:rPr>
+                <m:t>=</m:t>
+              </m:r>
+              <m:r>
+                <m:t>μ</m:t>
+              </m:r>
+              <m:r>
+                <m:rPr>
+                  <m:sty m:val="p"/>
+                </m:rPr>
+                <m:t>(</m:t>
+              </m:r>
+              <m:acc>
+                <m:accPr>
+                  <m:chr m:val="̃"/>
+                </m:accPr>
+                <m:e>
+                  <m:r>
+                    <m:t>x</m:t>
+                  </m:r>
+                </m:e>
+              </m:acc>
+              <m:r>
+                <m:rPr>
+                  <m:sty m:val="p"/>
+                </m:rPr>
+                <m:t>,</m:t>
+              </m:r>
+              <m:r>
+                <m:t>t</m:t>
+              </m:r>
+              <m:r>
+                <m:rPr>
+                  <m:sty m:val="p"/>
+                </m:rPr>
+                <m:t>)</m:t>
+              </m:r>
+            </m:e>
+            <m:e>
+              <m:r>
+                <m:t>μ</m:t>
+              </m:r>
+              <m:r>
+                <m:rPr>
+                  <m:sty m:val="p"/>
+                </m:rPr>
+                <m:t>(</m:t>
+              </m:r>
+              <m:acc>
+                <m:accPr>
+                  <m:chr m:val="̃"/>
+                </m:accPr>
+                <m:e>
+                  <m:r>
+                    <m:t>x</m:t>
+                  </m:r>
+                </m:e>
+              </m:acc>
+              <m:r>
+                <m:rPr>
+                  <m:sty m:val="p"/>
+                </m:rPr>
+                <m:t>,</m:t>
+              </m:r>
+              <m:r>
+                <m:t>t</m:t>
+              </m:r>
+              <m:r>
+                <m:rPr>
+                  <m:sty m:val="p"/>
+                </m:rPr>
+                <m:t>)</m:t>
+              </m:r>
+              <m:r>
+                <m:t>&amp;</m:t>
+              </m:r>
+              <m:r>
+                <m:rPr>
+                  <m:sty m:val="p"/>
+                </m:rPr>
+                <m:t>=</m:t>
+              </m:r>
+              <m:r>
+                <m:t>λ</m:t>
+              </m:r>
+              <m:r>
+                <m:rPr>
+                  <m:sty m:val="p"/>
+                </m:rPr>
+                <m:t>(</m:t>
+              </m:r>
+              <m:acc>
+                <m:accPr>
+                  <m:chr m:val="̃"/>
+                </m:accPr>
+                <m:e>
+                  <m:r>
+                    <m:t>x</m:t>
+                  </m:r>
+                </m:e>
+              </m:acc>
+              <m:r>
+                <m:rPr>
+                  <m:sty m:val="p"/>
+                </m:rPr>
+                <m:t>)</m:t>
+              </m:r>
+              <m:r>
+                <m:rPr>
+                  <m:sty m:val="p"/>
+                </m:rPr>
+                <m:t>⋅</m:t>
+              </m:r>
+              <m:r>
+                <m:t>t</m:t>
+              </m:r>
+            </m:e>
+            <m:e>
+              <m:r>
+                <m:t>λ</m:t>
+              </m:r>
+              <m:r>
+                <m:rPr>
+                  <m:sty m:val="p"/>
+                </m:rPr>
+                <m:t>(</m:t>
+              </m:r>
+              <m:acc>
+                <m:accPr>
+                  <m:chr m:val="̃"/>
+                </m:accPr>
+                <m:e>
+                  <m:r>
+                    <m:t>x</m:t>
+                  </m:r>
+                </m:e>
+              </m:acc>
+              <m:r>
+                <m:rPr>
+                  <m:sty m:val="p"/>
+                </m:rPr>
+                <m:t>)</m:t>
+              </m:r>
+              <m:r>
+                <m:t>&amp;</m:t>
+              </m:r>
+              <m:r>
+                <m:rPr>
+                  <m:sty m:val="p"/>
+                </m:rPr>
+                <m:t>=</m:t>
+              </m:r>
+              <m:r>
+                <m:rPr>
+                  <m:sty m:val="p"/>
+                </m:rPr>
+                <m:t>exp</m:t>
+              </m:r>
+              <m:r>
+                <m:t>​</m:t>
+              </m:r>
+              <m:d>
+                <m:dPr>
+                  <m:begChr m:val="{"/>
+                  <m:sepChr m:val=""/>
+                  <m:endChr m:val="}"/>
+                  <m:grow/>
+                </m:dPr>
+                <m:e>
+                  <m:r>
+                    <m:t>η</m:t>
+                  </m:r>
                   <m:r>
                     <m:rPr>
                       <m:sty m:val="p"/>
                     </m:rPr>
-                    <m:t>]</m:t>
+                    <m:t>(</m:t>
+                  </m:r>
+                  <m:acc>
+                    <m:accPr>
+                      <m:chr m:val="̃"/>
+                    </m:accPr>
+                    <m:e>
+                      <m:r>
+                        <m:t>x</m:t>
+                      </m:r>
+                    </m:e>
+                  </m:acc>
+                  <m:r>
+                    <m:rPr>
+                      <m:sty m:val="p"/>
+                    </m:rPr>
+                    <m:t>)</m:t>
+                  </m:r>
+                </m:e>
+              </m:d>
+              <m:r>
+                <m:t>​</m:t>
+              </m:r>
+            </m:e>
+            <m:e>
+              <m:r>
+                <m:t>η</m:t>
+              </m:r>
+              <m:r>
+                <m:rPr>
+                  <m:sty m:val="p"/>
+                </m:rPr>
+                <m:t>(</m:t>
+              </m:r>
+              <m:acc>
+                <m:accPr>
+                  <m:chr m:val="̃"/>
+                </m:accPr>
+                <m:e>
+                  <m:r>
+                    <m:t>x</m:t>
+                  </m:r>
+                </m:e>
+              </m:acc>
+              <m:r>
+                <m:rPr>
+                  <m:sty m:val="p"/>
+                </m:rPr>
+                <m:t>)</m:t>
+              </m:r>
+              <m:r>
+                <m:t>&amp;</m:t>
+              </m:r>
+              <m:r>
+                <m:rPr>
+                  <m:sty m:val="p"/>
+                </m:rPr>
+                <m:t>=</m:t>
+              </m:r>
+              <m:sSub>
+                <m:e>
+                  <m:r>
+                    <m:t>β</m:t>
+                  </m:r>
+                </m:e>
+                <m:sub>
+                  <m:r>
+                    <m:t>0</m:t>
+                  </m:r>
+                </m:sub>
+              </m:sSub>
+              <m:r>
+                <m:rPr>
+                  <m:sty m:val="p"/>
+                </m:rPr>
+                <m:t>+</m:t>
+              </m:r>
+              <m:sSub>
+                <m:e>
+                  <m:r>
+                    <m:t>β</m:t>
+                  </m:r>
+                </m:e>
+                <m:sub>
+                  <m:r>
+                    <m:t>1</m:t>
+                  </m:r>
+                </m:sub>
+              </m:sSub>
+              <m:sSub>
+                <m:e>
+                  <m:r>
+                    <m:t>x</m:t>
+                  </m:r>
+                </m:e>
+                <m:sub>
+                  <m:r>
+                    <m:t>1</m:t>
+                  </m:r>
+                </m:sub>
+              </m:sSub>
+              <m:r>
+                <m:rPr>
+                  <m:sty m:val="p"/>
+                </m:rPr>
+                <m:t>+</m:t>
+              </m:r>
+              <m:r>
+                <m:rPr>
+                  <m:sty m:val="p"/>
+                </m:rPr>
+                <m:t>…</m:t>
+              </m:r>
+              <m:r>
+                <m:rPr>
+                  <m:sty m:val="p"/>
+                </m:rPr>
+                <m:t>+</m:t>
+              </m:r>
+              <m:sSub>
+                <m:e>
+                  <m:r>
+                    <m:t>β</m:t>
+                  </m:r>
+                </m:e>
+                <m:sub>
+                  <m:r>
+                    <m:t>p</m:t>
+                  </m:r>
+                </m:sub>
+              </m:sSub>
+              <m:sSub>
+                <m:e>
+                  <m:r>
+                    <m:t>x</m:t>
+                  </m:r>
+                </m:e>
+                <m:sub>
+                  <m:r>
+                    <m:t>p</m:t>
+                  </m:r>
+                </m:sub>
+              </m:sSub>
+            </m:e>
+          </m:eqArr>
+          <m:r>
+            <m:t>  </m:t>
+          </m:r>
+          <m:r>
+            <m:rPr>
+              <m:sty m:val="p"/>
+            </m:rPr>
+            <m:t>(</m:t>
+          </m:r>
+          <m:r>
+            <m:t>1</m:t>
+          </m:r>
+          <m:r>
+            <m:rPr>
+              <m:sty m:val="p"/>
+            </m:rPr>
+            <m:t>)</m:t>
+          </m:r>
+        </m:oMath>
+      </m:oMathPara>
+      <w:bookmarkEnd w:id="12"/>
+    </w:p>
+    <w:p>
+      <w:pPr>
+        <w:pStyle w:val="FirstParagraph"/>
+      </w:pPr>
+      <w:r>
+        <w:t xml:space="preserve">The term</w:t>
+      </w:r>
+      <w:r>
+        <w:t xml:space="preserve"> </w:t>
+      </w:r>
+      <m:oMath>
+        <m:r>
+          <m:t>T</m:t>
+        </m:r>
+        <m:r>
+          <m:rPr>
+            <m:sty m:val="p"/>
+          </m:rPr>
+          <m:t>=</m:t>
+        </m:r>
+        <m:r>
+          <m:t>t</m:t>
+        </m:r>
+      </m:oMath>
+      <w:r>
+        <w:t xml:space="preserve"> </w:t>
+      </w:r>
+      <w:r>
+        <w:t xml:space="preserve">represents the</w:t>
+      </w:r>
+      <w:r>
+        <w:t xml:space="preserve"> </w:t>
+      </w:r>
+      <w:hyperlink r:id="rId13">
+        <w:r>
+          <w:rPr>
+            <w:rStyle w:val="Hyperlink"/>
+          </w:rPr>
+          <w:t xml:space="preserve">exposure magnitude</w:t>
+        </w:r>
+      </w:hyperlink>
+      <w:r>
+        <w:t xml:space="preserve"> </w:t>
+      </w:r>
+      <w:r>
+        <w:t xml:space="preserve">(such as person-years or observation time)</w:t>
+      </w:r>
+      <w:r>
+        <w:t xml:space="preserve"> </w:t>
+      </w:r>
+      <w:r>
+        <w:t xml:space="preserve">and plays a structural role in scaling rates to expected counts.</w:t>
+      </w:r>
+    </w:p>
+    <w:p>
+      <w:r>
+        <w:pict>
+          <v:rect style="width:0;height:1.5pt" o:hralign="center" o:hrstd="t" o:hr="t"/>
+        </w:pict>
+      </w:r>
+    </w:p>
+    <w:tbl>
+      <w:tblPr>
+        <w:tblStyle w:val="Table"/>
+        <w:tblInd w:w="164" w:type="dxa"/>
+        <w:tblBorders>
+          <w:left w:val="single" w:sz="24" w:space="0" w:color="909090"/>
+        </w:tblBorders>
+        <w:tblCellMar>
+          <w:left w:w="0" w:type="dxa"/>
+          <w:right w:w="0" w:type="dxa"/>
+        </w:tblCellMar>
+        <w:tblLook w:firstRow="0" w:lastRow="0" w:firstColumn="0" w:lastColumn="0" w:noHBand="0" w:noVBand="0" w:val="0000"/>
+      </w:tblPr>
+      <w:tblGrid>
+        <w:gridCol w:w="7920"/>
+      </w:tblGrid>
+      <w:tr>
+        <w:trPr>
+          <w:cantSplit/>
+        </w:trPr>
+        <w:tc>
+          <w:tcPr>
+            <w:tcMar>
+              <w:left w:w="144" w:type="dxa"/>
+            </w:tcMar>
+          </w:tcPr>
+          <w:p>
+            <w:pPr>
+              <w:pStyle w:val="FirstParagraph"/>
+            </w:pPr>
+            <w:pPr>
+              <w:spacing w:before="16" w:after="64"/>
+            </w:pPr>
+          </w:p>
+          <w:bookmarkStart w:id="14" w:name="exr-analogy-pois-offset-binom"/>
+          <w:p>
+            <w:pPr>
+              <w:pStyle w:val="BodyText"/>
+            </w:pPr>
+            <w:r>
+              <w:rPr>
+                <w:b/>
+                <w:bCs/>
+              </w:rPr>
+              <w:t xml:space="preserve">Exercise 1</w:t>
+            </w:r>
+            <w:r>
+              <w:t xml:space="preserve"> </w:t>
+            </w:r>
+            <w:r>
+              <w:t xml:space="preserve">Where have we seen a relationship like</w:t>
+            </w:r>
+          </w:p>
+          <w:p>
+            <w:pPr>
+              <w:pStyle w:val="BodyText"/>
+            </w:pPr>
+            <m:oMathPara>
+              <m:oMathParaPr>
+                <m:jc m:val="center"/>
+              </m:oMathParaPr>
+              <m:oMath>
+                <m:r>
+                  <m:t>μ</m:t>
+                </m:r>
+                <m:r>
+                  <m:rPr>
+                    <m:sty m:val="p"/>
+                  </m:rPr>
+                  <m:t>=</m:t>
+                </m:r>
+                <m:r>
+                  <m:t>λ</m:t>
+                </m:r>
+                <m:r>
+                  <m:rPr>
+                    <m:sty m:val="p"/>
+                  </m:rPr>
+                  <m:t>⋅</m:t>
+                </m:r>
+                <m:r>
+                  <m:t>t</m:t>
+                </m:r>
+              </m:oMath>
+            </m:oMathPara>
+          </w:p>
+          <w:p>
+            <w:pPr>
+              <w:pStyle w:val="FirstParagraph"/>
+            </w:pPr>
+            <w:r>
+              <w:t xml:space="preserve">before?</w:t>
+            </w:r>
+          </w:p>
+          <w:bookmarkEnd w:id="14"/>
+        </w:tc>
+      </w:tr>
+    </w:tbl>
+    <w:p>
+      <w:r>
+        <w:pict>
+          <v:rect style="width:0;height:1.5pt" o:hralign="center" o:hrstd="t" o:hr="t"/>
+        </w:pict>
+      </w:r>
+    </w:p>
+    <w:tbl>
+      <w:tblPr>
+        <w:tblStyle w:val="Table"/>
+        <w:tblLook w:firstRow="0" w:lastRow="0" w:firstColumn="0" w:lastColumn="0" w:noHBand="0" w:noVBand="0" w:val="0000"/>
+        <w:tblBorders>
+          <w:top w:val="single" w:sz="4" w:space="0" w:color="909090"/>
+          <w:left w:val="single" w:sz="24" w:space="0" w:color="909090"/>
+          <w:bottom w:val="single" w:sz="4" w:space="0" w:color="909090"/>
+          <w:right w:val="single" w:sz="4" w:space="0" w:color="909090"/>
+        </w:tblBorders>
+        <w:tblCellMar>
+          <w:left w:w="144" w:type="dxa"/>
+          <w:right w:w="144" w:type="dxa"/>
+        </w:tblCellMar>
+        <w:tblLook w:firstRow="0" w:lastRow="0" w:firstColumn="0" w:lastColumn="0" w:noHBand="0" w:noVBand="0" w:val="0000"/>
+      </w:tblPr>
+      <w:tr>
+        <w:trPr>
+          <w:cantSplit/>
+        </w:trPr>
+        <w:tc>
+          <w:tcPr>
+            <w:shd w:color="auto" w:fill="e6e6e6" w:val="clear"/>
+            <w:tcMar>
+              <w:top w:w="92" w:type="dxa"/>
+              <w:bottom w:w="92" w:type="dxa"/>
+            </w:tcMar>
+          </w:tcPr>
+          <w:p>
+            <w:pPr>
+              <w:pStyle w:val="FirstParagraph"/>
+            </w:pPr>
+            <w:pPr>
+              <w:spacing w:before="16" w:after="16"/>
+            </w:pPr>
+            <w:r>
+              <w:t xml:space="preserve">Solution</w:t>
+            </w:r>
+          </w:p>
+        </w:tc>
+      </w:tr>
+      <w:tr>
+        <w:trPr>
+          <w:cantSplit/>
+        </w:trPr>
+        <w:tc>
+          <w:tcPr>
+            <w:tcMar>
+              <w:top w:w="108" w:type="dxa"/>
+              <w:bottom w:w="108" w:type="dxa"/>
+            </w:tcMar>
+          </w:tcPr>
+          <w:bookmarkStart w:id="15" w:name="sol-analogy-pois-offset-binom"/>
+          <w:p>
+            <w:pPr>
+              <w:pStyle w:val="BodyText"/>
+            </w:pPr>
+            <w:r>
+              <w:rPr>
+                <w:i/>
+                <w:iCs/>
+              </w:rPr>
+              <w:t xml:space="preserve">Solution 1</w:t>
+            </w:r>
+            <w:r>
+              <w:t xml:space="preserve">. </w:t>
+            </w:r>
+            <w:r>
+              <w:t xml:space="preserve">The relationship</w:t>
+            </w:r>
+          </w:p>
+          <w:p>
+            <w:pPr>
+              <w:pStyle w:val="BodyText"/>
+            </w:pPr>
+            <m:oMathPara>
+              <m:oMathParaPr>
+                <m:jc m:val="center"/>
+              </m:oMathParaPr>
+              <m:oMath>
+                <m:r>
+                  <m:t>μ</m:t>
+                </m:r>
+                <m:r>
+                  <m:rPr>
+                    <m:sty m:val="p"/>
+                  </m:rPr>
+                  <m:t>=</m:t>
+                </m:r>
+                <m:r>
+                  <m:t>λ</m:t>
+                </m:r>
+                <m:r>
+                  <m:rPr>
+                    <m:sty m:val="p"/>
+                  </m:rPr>
+                  <m:t>⋅</m:t>
+                </m:r>
+                <m:r>
+                  <m:t>t</m:t>
+                </m:r>
+              </m:oMath>
+            </m:oMathPara>
+          </w:p>
+          <w:p>
+            <w:pPr>
+              <w:pStyle w:val="FirstParagraph"/>
+            </w:pPr>
+            <w:r>
+              <w:t xml:space="preserve">in count regression models</w:t>
+            </w:r>
+            <w:r>
+              <w:t xml:space="preserve"> </w:t>
+            </w:r>
+            <w:r>
+              <w:t xml:space="preserve">is analogous to the relationship</w:t>
+            </w:r>
+          </w:p>
+          <w:p>
+            <w:pPr>
+              <w:pStyle w:val="BodyText"/>
+            </w:pPr>
+            <m:oMathPara>
+              <m:oMathParaPr>
+                <m:jc m:val="center"/>
+              </m:oMathParaPr>
+              <m:oMath>
+                <m:r>
+                  <m:t>μ</m:t>
+                </m:r>
+                <m:r>
+                  <m:rPr>
+                    <m:sty m:val="p"/>
+                  </m:rPr>
+                  <m:t>=</m:t>
+                </m:r>
+                <m:r>
+                  <m:t>n</m:t>
+                </m:r>
+                <m:r>
+                  <m:t>π</m:t>
+                </m:r>
+              </m:oMath>
+            </m:oMathPara>
+          </w:p>
+          <w:p>
+            <w:pPr>
+              <w:pStyle w:val="FirstParagraph"/>
+            </w:pPr>
+            <w:r>
+              <w:t xml:space="preserve">in Binomial models.</w:t>
+            </w:r>
+          </w:p>
+          <w:bookmarkEnd w:id="15"/>
+          <w:p/>
+        </w:tc>
+      </w:tr>
+    </w:tbl>
+    <w:p>
+      <w:r>
+        <w:pict>
+          <v:rect style="width:0;height:1.5pt" o:hralign="center" o:hrstd="t" o:hr="t"/>
+        </w:pict>
+      </w:r>
+    </w:p>
+    <w:p>
+      <w:pPr>
+        <w:pStyle w:val="FirstParagraph"/>
+      </w:pPr>
+      <w:r>
+        <w:t xml:space="preserve">We can also express the exposure magnitude</w:t>
+      </w:r>
+      <w:r>
+        <w:t xml:space="preserve"> </w:t>
+      </w:r>
+      <m:oMath>
+        <m:r>
+          <m:t>t</m:t>
+        </m:r>
+      </m:oMath>
+      <w:r>
+        <w:t xml:space="preserve"> </w:t>
+      </w:r>
+      <w:r>
+        <w:t xml:space="preserve">directly as a component of the linear predictor:</w:t>
+      </w:r>
+    </w:p>
+    <w:p>
+      <w:pPr>
+        <w:pStyle w:val="BodyText"/>
+      </w:pPr>
+      <m:oMathPara>
+        <m:oMathParaPr>
+          <m:jc m:val="center"/>
+        </m:oMathParaPr>
+        <m:oMath>
+          <m:eqArr>
+            <m:e>
+              <m:r>
+                <m:rPr>
+                  <m:sty m:val="p"/>
+                </m:rPr>
+                <m:t>log</m:t>
+              </m:r>
+              <m:r>
+                <m:t>​</m:t>
+              </m:r>
+              <m:d>
+                <m:dPr>
+                  <m:begChr m:val="{"/>
+                  <m:sepChr m:val=""/>
+                  <m:endChr m:val="}"/>
+                  <m:grow/>
+                </m:dPr>
+                <m:e>
+                  <m:r>
+                    <m:rPr>
+                      <m:sty m:val="p"/>
+                    </m:rPr>
+                    <m:t>E</m:t>
+                  </m:r>
+                  <m:r>
+                    <m:t>​</m:t>
+                  </m:r>
+                  <m:d>
+                    <m:dPr>
+                      <m:begChr m:val="["/>
+                      <m:sepChr m:val=""/>
+                      <m:endChr m:val="]"/>
+                      <m:grow/>
+                    </m:dPr>
+                    <m:e>
+                      <m:r>
+                        <m:t>Y</m:t>
+                      </m:r>
+                      <m:r>
+                        <m:rPr>
+                          <m:sty m:val="p"/>
+                        </m:rPr>
+                        <m:t>∣</m:t>
+                      </m:r>
+                      <m:acc>
+                        <m:accPr>
+                          <m:chr m:val="̃"/>
+                        </m:accPr>
+                        <m:e>
+                          <m:r>
+                            <m:t>X</m:t>
+                          </m:r>
+                        </m:e>
+                      </m:acc>
+                      <m:r>
+                        <m:rPr>
+                          <m:sty m:val="p"/>
+                        </m:rPr>
+                        <m:t>=</m:t>
+                      </m:r>
+                      <m:acc>
+                        <m:accPr>
+                          <m:chr m:val="̃"/>
+                        </m:accPr>
+                        <m:e>
+                          <m:r>
+                            <m:t>x</m:t>
+                          </m:r>
+                        </m:e>
+                      </m:acc>
+                      <m:r>
+                        <m:rPr>
+                          <m:sty m:val="p"/>
+                        </m:rPr>
+                        <m:t>,</m:t>
+                      </m:r>
+                      <m:r>
+                        <m:t>T</m:t>
+                      </m:r>
+                      <m:r>
+                        <m:rPr>
+                          <m:sty m:val="p"/>
+                        </m:rPr>
+                        <m:t>=</m:t>
+                      </m:r>
+                      <m:r>
+                        <m:t>t</m:t>
+                      </m:r>
+                    </m:e>
+                  </m:d>
+                  <m:r>
+                    <m:t>​</m:t>
                   </m:r>
                 </m:e>
               </m:d>
@@ -28290,87 +28298,91 @@
           <m:t>E</m:t>
         </m:r>
         <m:r>
-          <m:rPr>
-            <m:sty m:val="p"/>
-          </m:rPr>
-          <m:t>[</m:t>
+          <m:t>​</m:t>
         </m:r>
-        <m:r>
-          <m:t>Y</m:t>
-        </m:r>
-        <m:r>
-          <m:rPr>
-            <m:sty m:val="p"/>
-          </m:rPr>
-          <m:t>∣</m:t>
-        </m:r>
-        <m:r>
-          <m:t>Z</m:t>
-        </m:r>
-        <m:r>
-          <m:rPr>
-            <m:sty m:val="p"/>
-          </m:rPr>
-          <m:t>=</m:t>
-        </m:r>
-        <m:r>
-          <m:t>0</m:t>
-        </m:r>
-        <m:r>
-          <m:rPr>
-            <m:sty m:val="p"/>
-          </m:rPr>
-          <m:t>,</m:t>
-        </m:r>
-        <m:acc>
-          <m:accPr>
-            <m:chr m:val="̃"/>
-          </m:accPr>
+        <m:d>
+          <m:dPr>
+            <m:begChr m:val="["/>
+            <m:sepChr m:val=""/>
+            <m:endChr m:val="]"/>
+            <m:grow/>
+          </m:dPr>
           <m:e>
             <m:r>
-              <m:t>X</m:t>
+              <m:t>Y</m:t>
+            </m:r>
+            <m:r>
+              <m:rPr>
+                <m:sty m:val="p"/>
+              </m:rPr>
+              <m:t>∣</m:t>
+            </m:r>
+            <m:r>
+              <m:t>Z</m:t>
+            </m:r>
+            <m:r>
+              <m:rPr>
+                <m:sty m:val="p"/>
+              </m:rPr>
+              <m:t>=</m:t>
+            </m:r>
+            <m:r>
+              <m:t>0</m:t>
+            </m:r>
+            <m:r>
+              <m:rPr>
+                <m:sty m:val="p"/>
+              </m:rPr>
+              <m:t>,</m:t>
+            </m:r>
+            <m:acc>
+              <m:accPr>
+                <m:chr m:val="̃"/>
+              </m:accPr>
+              <m:e>
+                <m:r>
+                  <m:t>X</m:t>
+                </m:r>
+              </m:e>
+            </m:acc>
+            <m:r>
+              <m:rPr>
+                <m:sty m:val="p"/>
+              </m:rPr>
+              <m:t>=</m:t>
+            </m:r>
+            <m:acc>
+              <m:accPr>
+                <m:chr m:val="̃"/>
+              </m:accPr>
+              <m:e>
+                <m:r>
+                  <m:t>x</m:t>
+                </m:r>
+              </m:e>
+            </m:acc>
+            <m:r>
+              <m:rPr>
+                <m:sty m:val="p"/>
+              </m:rPr>
+              <m:t>,</m:t>
+            </m:r>
+            <m:r>
+              <m:t>T</m:t>
+            </m:r>
+            <m:r>
+              <m:rPr>
+                <m:sty m:val="p"/>
+              </m:rPr>
+              <m:t>=</m:t>
+            </m:r>
+            <m:r>
+              <m:t>t</m:t>
             </m:r>
           </m:e>
-        </m:acc>
+        </m:d>
         <m:r>
-          <m:rPr>
-            <m:sty m:val="p"/>
-          </m:rPr>
-          <m:t>=</m:t>
-        </m:r>
-        <m:acc>
-          <m:accPr>
-            <m:chr m:val="̃"/>
-          </m:accPr>
-          <m:e>
-            <m:r>
-              <m:t>x</m:t>
-            </m:r>
-          </m:e>
-        </m:acc>
-        <m:r>
-          <m:rPr>
-            <m:sty m:val="p"/>
-          </m:rPr>
-          <m:t>,</m:t>
-        </m:r>
-        <m:r>
-          <m:t>T</m:t>
-        </m:r>
-        <m:r>
-          <m:rPr>
-            <m:sty m:val="p"/>
-          </m:rPr>
-          <m:t>=</m:t>
-        </m:r>
-        <m:r>
-          <m:t>t</m:t>
-        </m:r>
-        <m:r>
-          <m:rPr>
-            <m:sty m:val="p"/>
-          </m:rPr>
-          <m:t>]</m:t>
+          <m:t>​</m:t>
         </m:r>
       </m:oMath>
       <w:r>
@@ -32611,79 +32623,83 @@
                       <m:t>E</m:t>
                     </m:r>
                     <m:r>
-                      <m:rPr>
-                        <m:sty m:val="p"/>
-                      </m:rPr>
-                      <m:t>[</m:t>
-                    </m:r>
-                    <m:r>
-                      <m:t>Y</m:t>
-                    </m:r>
-                    <m:r>
-                      <m:rPr>
-                        <m:sty m:val="p"/>
-                      </m:rPr>
-                      <m:t>∣</m:t>
-                    </m:r>
-                    <m:acc>
-                      <m:accPr>
-                        <m:chr m:val="̃"/>
-                      </m:accPr>
+                      <m:t>​</m:t>
+                    </m:r>
+                    <m:d>
+                      <m:dPr>
+                        <m:begChr m:val="["/>
+                        <m:sepChr m:val=""/>
+                        <m:endChr m:val="]"/>
+                        <m:grow/>
+                      </m:dPr>
                       <m:e>
                         <m:r>
-                          <m:t>X</m:t>
+                          <m:t>Y</m:t>
+                        </m:r>
+                        <m:r>
+                          <m:rPr>
+                            <m:sty m:val="p"/>
+                          </m:rPr>
+                          <m:t>∣</m:t>
+                        </m:r>
+                        <m:acc>
+                          <m:accPr>
+                            <m:chr m:val="̃"/>
+                          </m:accPr>
+                          <m:e>
+                            <m:r>
+                              <m:t>X</m:t>
+                            </m:r>
+                          </m:e>
+                        </m:acc>
+                        <m:r>
+                          <m:rPr>
+                            <m:sty m:val="p"/>
+                          </m:rPr>
+                          <m:t>=</m:t>
+                        </m:r>
+                        <m:acc>
+                          <m:accPr>
+                            <m:chr m:val="̃"/>
+                          </m:accPr>
+                          <m:e>
+                            <m:r>
+                              <m:t>x</m:t>
+                            </m:r>
+                          </m:e>
+                        </m:acc>
+                        <m:r>
+                          <m:rPr>
+                            <m:sty m:val="p"/>
+                          </m:rPr>
+                          <m:t>,</m:t>
+                        </m:r>
+                        <m:r>
+                          <m:t>T</m:t>
+                        </m:r>
+                        <m:r>
+                          <m:rPr>
+                            <m:sty m:val="p"/>
+                          </m:rPr>
+                          <m:t>=</m:t>
+                        </m:r>
+                        <m:r>
+                          <m:t>t</m:t>
                         </m:r>
                       </m:e>
-                    </m:acc>
+                    </m:d>
+                    <m:r>
+                      <m:t>​</m:t>
+                    </m:r>
+                    <m:r>
+                      <m:t>&amp;</m:t>
+                    </m:r>
                     <m:r>
                       <m:rPr>
                         <m:sty m:val="p"/>
                       </m:rPr>
                       <m:t>=</m:t>
                     </m:r>
-                    <m:acc>
-                      <m:accPr>
-                        <m:chr m:val="̃"/>
-                      </m:accPr>
-                      <m:e>
-                        <m:r>
-                          <m:t>x</m:t>
-                        </m:r>
-                      </m:e>
-                    </m:acc>
-                    <m:r>
-                      <m:rPr>
-                        <m:sty m:val="p"/>
-                      </m:rPr>
-                      <m:t>,</m:t>
-                    </m:r>
-                    <m:r>
-                      <m:t>T</m:t>
-                    </m:r>
-                    <m:r>
-                      <m:rPr>
-                        <m:sty m:val="p"/>
-                      </m:rPr>
-                      <m:t>=</m:t>
-                    </m:r>
-                    <m:r>
-                      <m:t>t</m:t>
-                    </m:r>
-                    <m:r>
-                      <m:rPr>
-                        <m:sty m:val="p"/>
-                      </m:rPr>
-                      <m:t>]</m:t>
-                    </m:r>
-                    <m:r>
-                      <m:t>&amp;</m:t>
-                    </m:r>
-                    <m:r>
-                      <m:rPr>
-                        <m:sty m:val="p"/>
-                      </m:rPr>
-                      <m:t>=</m:t>
-                    </m:r>
                     <m:r>
                       <m:t>π</m:t>
                     </m:r>
@@ -32697,87 +32713,91 @@
                       <m:t>E</m:t>
                     </m:r>
                     <m:r>
-                      <m:rPr>
-                        <m:sty m:val="p"/>
-                      </m:rPr>
-                      <m:t>[</m:t>
-                    </m:r>
-                    <m:r>
-                      <m:t>Y</m:t>
-                    </m:r>
-                    <m:r>
-                      <m:rPr>
-                        <m:sty m:val="p"/>
-                      </m:rPr>
-                      <m:t>∣</m:t>
-                    </m:r>
-                    <m:r>
-                      <m:t>Z</m:t>
-                    </m:r>
-                    <m:r>
-                      <m:rPr>
-                        <m:sty m:val="p"/>
-                      </m:rPr>
-                      <m:t>=</m:t>
-                    </m:r>
-                    <m:r>
-                      <m:t>1</m:t>
-                    </m:r>
-                    <m:r>
-                      <m:rPr>
-                        <m:sty m:val="p"/>
-                      </m:rPr>
-                      <m:t>,</m:t>
-                    </m:r>
-                    <m:acc>
-                      <m:accPr>
-                        <m:chr m:val="̃"/>
-                      </m:accPr>
+                      <m:t>​</m:t>
+                    </m:r>
+                    <m:d>
+                      <m:dPr>
+                        <m:begChr m:val="["/>
+                        <m:sepChr m:val=""/>
+                        <m:endChr m:val="]"/>
+                        <m:grow/>
+                      </m:dPr>
                       <m:e>
                         <m:r>
-                          <m:t>X</m:t>
+                          <m:t>Y</m:t>
+                        </m:r>
+                        <m:r>
+                          <m:rPr>
+                            <m:sty m:val="p"/>
+                          </m:rPr>
+                          <m:t>∣</m:t>
+                        </m:r>
+                        <m:r>
+                          <m:t>Z</m:t>
+                        </m:r>
+                        <m:r>
+                          <m:rPr>
+                            <m:sty m:val="p"/>
+                          </m:rPr>
+                          <m:t>=</m:t>
+                        </m:r>
+                        <m:r>
+                          <m:t>1</m:t>
+                        </m:r>
+                        <m:r>
+                          <m:rPr>
+                            <m:sty m:val="p"/>
+                          </m:rPr>
+                          <m:t>,</m:t>
+                        </m:r>
+                        <m:acc>
+                          <m:accPr>
+                            <m:chr m:val="̃"/>
+                          </m:accPr>
+                          <m:e>
+                            <m:r>
+                              <m:t>X</m:t>
+                            </m:r>
+                          </m:e>
+                        </m:acc>
+                        <m:r>
+                          <m:rPr>
+                            <m:sty m:val="p"/>
+                          </m:rPr>
+                          <m:t>=</m:t>
+                        </m:r>
+                        <m:acc>
+                          <m:accPr>
+                            <m:chr m:val="̃"/>
+                          </m:accPr>
+                          <m:e>
+                            <m:r>
+                              <m:t>x</m:t>
+                            </m:r>
+                          </m:e>
+                        </m:acc>
+                        <m:r>
+                          <m:rPr>
+                            <m:sty m:val="p"/>
+                          </m:rPr>
+                          <m:t>,</m:t>
+                        </m:r>
+                        <m:r>
+                          <m:t>T</m:t>
+                        </m:r>
+                        <m:r>
+                          <m:rPr>
+                            <m:sty m:val="p"/>
+                          </m:rPr>
+                          <m:t>=</m:t>
+                        </m:r>
+                        <m:r>
+                          <m:t>t</m:t>
                         </m:r>
                       </m:e>
-                    </m:acc>
-                    <m:r>
-                      <m:rPr>
-                        <m:sty m:val="p"/>
-                      </m:rPr>
-                      <m:t>=</m:t>
-                    </m:r>
-                    <m:acc>
-                      <m:accPr>
-                        <m:chr m:val="̃"/>
-                      </m:accPr>
-                      <m:e>
-                        <m:r>
-                          <m:t>x</m:t>
-                        </m:r>
-                      </m:e>
-                    </m:acc>
-                    <m:r>
-                      <m:rPr>
-                        <m:sty m:val="p"/>
-                      </m:rPr>
-                      <m:t>,</m:t>
-                    </m:r>
-                    <m:r>
-                      <m:t>T</m:t>
-                    </m:r>
-                    <m:r>
-                      <m:rPr>
-                        <m:sty m:val="p"/>
-                      </m:rPr>
-                      <m:t>=</m:t>
-                    </m:r>
-                    <m:r>
-                      <m:t>t</m:t>
-                    </m:r>
-                    <m:r>
-                      <m:rPr>
-                        <m:sty m:val="p"/>
-                      </m:rPr>
-                      <m:t>]</m:t>
+                    </m:d>
+                    <m:r>
+                      <m:t>​</m:t>
                     </m:r>
                   </m:e>
                   <m:e>
@@ -32840,87 +32860,91 @@
                       <m:t>E</m:t>
                     </m:r>
                     <m:r>
-                      <m:rPr>
-                        <m:sty m:val="p"/>
-                      </m:rPr>
-                      <m:t>[</m:t>
-                    </m:r>
-                    <m:r>
-                      <m:t>Y</m:t>
-                    </m:r>
-                    <m:r>
-                      <m:rPr>
-                        <m:sty m:val="p"/>
-                      </m:rPr>
-                      <m:t>∣</m:t>
-                    </m:r>
-                    <m:r>
-                      <m:t>Z</m:t>
-                    </m:r>
-                    <m:r>
-                      <m:rPr>
-                        <m:sty m:val="p"/>
-                      </m:rPr>
-                      <m:t>=</m:t>
-                    </m:r>
-                    <m:r>
-                      <m:t>0</m:t>
-                    </m:r>
-                    <m:r>
-                      <m:rPr>
-                        <m:sty m:val="p"/>
-                      </m:rPr>
-                      <m:t>,</m:t>
-                    </m:r>
-                    <m:acc>
-                      <m:accPr>
-                        <m:chr m:val="̃"/>
-                      </m:accPr>
+                      <m:t>​</m:t>
+                    </m:r>
+                    <m:d>
+                      <m:dPr>
+                        <m:begChr m:val="["/>
+                        <m:sepChr m:val=""/>
+                        <m:endChr m:val="]"/>
+                        <m:grow/>
+                      </m:dPr>
                       <m:e>
                         <m:r>
-                          <m:t>X</m:t>
+                          <m:t>Y</m:t>
+                        </m:r>
+                        <m:r>
+                          <m:rPr>
+                            <m:sty m:val="p"/>
+                          </m:rPr>
+                          <m:t>∣</m:t>
+                        </m:r>
+                        <m:r>
+                          <m:t>Z</m:t>
+                        </m:r>
+                        <m:r>
+                          <m:rPr>
+                            <m:sty m:val="p"/>
+                          </m:rPr>
+                          <m:t>=</m:t>
+                        </m:r>
+                        <m:r>
+                          <m:t>0</m:t>
+                        </m:r>
+                        <m:r>
+                          <m:rPr>
+                            <m:sty m:val="p"/>
+                          </m:rPr>
+                          <m:t>,</m:t>
+                        </m:r>
+                        <m:acc>
+                          <m:accPr>
+                            <m:chr m:val="̃"/>
+                          </m:accPr>
+                          <m:e>
+                            <m:r>
+                              <m:t>X</m:t>
+                            </m:r>
+                          </m:e>
+                        </m:acc>
+                        <m:r>
+                          <m:rPr>
+                            <m:sty m:val="p"/>
+                          </m:rPr>
+                          <m:t>=</m:t>
+                        </m:r>
+                        <m:acc>
+                          <m:accPr>
+                            <m:chr m:val="̃"/>
+                          </m:accPr>
+                          <m:e>
+                            <m:r>
+                              <m:t>x</m:t>
+                            </m:r>
+                          </m:e>
+                        </m:acc>
+                        <m:r>
+                          <m:rPr>
+                            <m:sty m:val="p"/>
+                          </m:rPr>
+                          <m:t>,</m:t>
+                        </m:r>
+                        <m:r>
+                          <m:t>T</m:t>
+                        </m:r>
+                        <m:r>
+                          <m:rPr>
+                            <m:sty m:val="p"/>
+                          </m:rPr>
+                          <m:t>=</m:t>
+                        </m:r>
+                        <m:r>
+                          <m:t>t</m:t>
                         </m:r>
                       </m:e>
-                    </m:acc>
-                    <m:r>
-                      <m:rPr>
-                        <m:sty m:val="p"/>
-                      </m:rPr>
-                      <m:t>=</m:t>
-                    </m:r>
-                    <m:acc>
-                      <m:accPr>
-                        <m:chr m:val="̃"/>
-                      </m:accPr>
-                      <m:e>
-                        <m:r>
-                          <m:t>x</m:t>
-                        </m:r>
-                      </m:e>
-                    </m:acc>
-                    <m:r>
-                      <m:rPr>
-                        <m:sty m:val="p"/>
-                      </m:rPr>
-                      <m:t>,</m:t>
-                    </m:r>
-                    <m:r>
-                      <m:t>T</m:t>
-                    </m:r>
-                    <m:r>
-                      <m:rPr>
-                        <m:sty m:val="p"/>
-                      </m:rPr>
-                      <m:t>=</m:t>
-                    </m:r>
-                    <m:r>
-                      <m:t>t</m:t>
-                    </m:r>
-                    <m:r>
-                      <m:rPr>
-                        <m:sty m:val="p"/>
-                      </m:rPr>
-                      <m:t>]</m:t>
+                    </m:d>
+                    <m:r>
+                      <m:t>​</m:t>
                     </m:r>
                   </m:e>
                   <m:e>
@@ -33152,87 +33176,91 @@
                 <m:t>E</m:t>
               </m:r>
               <m:r>
-                <m:rPr>
-                  <m:sty m:val="p"/>
-                </m:rPr>
-                <m:t>[</m:t>
-              </m:r>
-              <m:r>
-                <m:t>Y</m:t>
-              </m:r>
-              <m:r>
-                <m:rPr>
-                  <m:sty m:val="p"/>
-                </m:rPr>
-                <m:t>∣</m:t>
-              </m:r>
-              <m:r>
-                <m:t>Z</m:t>
-              </m:r>
-              <m:r>
-                <m:rPr>
-                  <m:sty m:val="p"/>
-                </m:rPr>
-                <m:t>=</m:t>
-              </m:r>
-              <m:r>
-                <m:t>0</m:t>
-              </m:r>
-              <m:r>
-                <m:rPr>
-                  <m:sty m:val="p"/>
-                </m:rPr>
-                <m:t>,</m:t>
-              </m:r>
-              <m:acc>
-                <m:accPr>
-                  <m:chr m:val="̃"/>
-                </m:accPr>
+                <m:t>​</m:t>
+              </m:r>
+              <m:d>
+                <m:dPr>
+                  <m:begChr m:val="["/>
+                  <m:sepChr m:val=""/>
+                  <m:endChr m:val="]"/>
+                  <m:grow/>
+                </m:dPr>
                 <m:e>
                   <m:r>
-                    <m:t>X</m:t>
+                    <m:t>Y</m:t>
+                  </m:r>
+                  <m:r>
+                    <m:rPr>
+                      <m:sty m:val="p"/>
+                    </m:rPr>
+                    <m:t>∣</m:t>
+                  </m:r>
+                  <m:r>
+                    <m:t>Z</m:t>
+                  </m:r>
+                  <m:r>
+                    <m:rPr>
+                      <m:sty m:val="p"/>
+                    </m:rPr>
+                    <m:t>=</m:t>
+                  </m:r>
+                  <m:r>
+                    <m:t>0</m:t>
+                  </m:r>
+                  <m:r>
+                    <m:rPr>
+                      <m:sty m:val="p"/>
+                    </m:rPr>
+                    <m:t>,</m:t>
+                  </m:r>
+                  <m:acc>
+                    <m:accPr>
+                      <m:chr m:val="̃"/>
+                    </m:accPr>
+                    <m:e>
+                      <m:r>
+                        <m:t>X</m:t>
+                      </m:r>
+                    </m:e>
+                  </m:acc>
+                  <m:r>
+                    <m:rPr>
+                      <m:sty m:val="p"/>
+                    </m:rPr>
+                    <m:t>=</m:t>
+                  </m:r>
+                  <m:acc>
+                    <m:accPr>
+                      <m:chr m:val="̃"/>
+                    </m:accPr>
+                    <m:e>
+                      <m:r>
+                        <m:t>x</m:t>
+                      </m:r>
+                    </m:e>
+                  </m:acc>
+                  <m:r>
+                    <m:rPr>
+                      <m:sty m:val="p"/>
+                    </m:rPr>
+                    <m:t>,</m:t>
+                  </m:r>
+                  <m:r>
+                    <m:t>T</m:t>
+                  </m:r>
+                  <m:r>
+                    <m:rPr>
+                      <m:sty m:val="p"/>
+                    </m:rPr>
+                    <m:t>=</m:t>
+                  </m:r>
+                  <m:r>
+                    <m:t>t</m:t>
                   </m:r>
                 </m:e>
-              </m:acc>
-              <m:r>
-                <m:rPr>
-                  <m:sty m:val="p"/>
-                </m:rPr>
-                <m:t>=</m:t>
-              </m:r>
-              <m:acc>
-                <m:accPr>
-                  <m:chr m:val="̃"/>
-                </m:accPr>
-                <m:e>
-                  <m:r>
-                    <m:t>x</m:t>
-                  </m:r>
-                </m:e>
-              </m:acc>
-              <m:r>
-                <m:rPr>
-                  <m:sty m:val="p"/>
-                </m:rPr>
-                <m:t>,</m:t>
-              </m:r>
-              <m:r>
-                <m:t>T</m:t>
-              </m:r>
-              <m:r>
-                <m:rPr>
-                  <m:sty m:val="p"/>
-                </m:rPr>
-                <m:t>=</m:t>
-              </m:r>
-              <m:r>
-                <m:t>t</m:t>
-              </m:r>
-              <m:r>
-                <m:rPr>
-                  <m:sty m:val="p"/>
-                </m:rPr>
-                <m:t>]</m:t>
+              </m:d>
+              <m:r>
+                <m:t>​</m:t>
               </m:r>
               <m:r>
                 <m:rPr>
@@ -33320,34 +33348,38 @@
                 <m:t>E</m:t>
               </m:r>
               <m:r>
-                <m:rPr>
-                  <m:sty m:val="p"/>
-                </m:rPr>
-                <m:t>[</m:t>
-              </m:r>
-              <m:r>
-                <m:t> </m:t>
-              </m:r>
-              <m:r>
-                <m:rPr>
-                  <m:sty m:val="p"/>
-                </m:rPr>
-                <m:t>⋅</m:t>
-              </m:r>
-              <m:r>
-                <m:rPr>
-                  <m:sty m:val="p"/>
-                </m:rPr>
-                <m:t>∣</m:t>
-              </m:r>
-              <m:r>
-                <m:t>Z</m:t>
-              </m:r>
-              <m:r>
-                <m:rPr>
-                  <m:sty m:val="p"/>
-                </m:rPr>
-                <m:t>]</m:t>
+                <m:t>​</m:t>
+              </m:r>
+              <m:d>
+                <m:dPr>
+                  <m:begChr m:val="["/>
+                  <m:sepChr m:val=""/>
+                  <m:endChr m:val="]"/>
+                  <m:grow/>
+                </m:dPr>
+                <m:e>
+                  <m:r>
+                    <m:t> </m:t>
+                  </m:r>
+                  <m:r>
+                    <m:rPr>
+                      <m:sty m:val="p"/>
+                    </m:rPr>
+                    <m:t>⋅</m:t>
+                  </m:r>
+                  <m:r>
+                    <m:rPr>
+                      <m:sty m:val="p"/>
+                    </m:rPr>
+                    <m:t>∣</m:t>
+                  </m:r>
+                  <m:r>
+                    <m:t>Z</m:t>
+                  </m:r>
+                </m:e>
+              </m:d>
+              <m:r>
+                <m:t>​</m:t>
               </m:r>
             </m:oMath>
             <w:r>
@@ -33745,28 +33777,32 @@
                           <m:t>E</m:t>
                         </m:r>
                         <m:r>
-                          <m:rPr>
-                            <m:sty m:val="p"/>
-                          </m:rPr>
-                          <m:t>[</m:t>
+                          <m:t>​</m:t>
                         </m:r>
+                        <m:d>
+                          <m:dPr>
+                            <m:begChr m:val="["/>
+                            <m:sepChr m:val=""/>
+                            <m:endChr m:val="]"/>
+                            <m:grow/>
+                          </m:dPr>
+                          <m:e>
+                            <m:r>
+                              <m:t>Y</m:t>
+                            </m:r>
+                            <m:r>
+                              <m:rPr>
+                                <m:sty m:val="p"/>
+                              </m:rPr>
+                              <m:t>∣</m:t>
+                            </m:r>
+                            <m:r>
+                              <m:t>Z</m:t>
+                            </m:r>
+                          </m:e>
+                        </m:d>
                         <m:r>
-                          <m:t>Y</m:t>
-                        </m:r>
-                        <m:r>
-                          <m:rPr>
-                            <m:sty m:val="p"/>
-                          </m:rPr>
-                          <m:t>∣</m:t>
-                        </m:r>
-                        <m:r>
-                          <m:t>Z</m:t>
-                        </m:r>
-                        <m:r>
-                          <m:rPr>
-                            <m:sty m:val="p"/>
-                          </m:rPr>
-                          <m:t>]</m:t>
+                          <m:t>​</m:t>
                         </m:r>
                         <m:r>
                           <m:rPr>
@@ -34511,28 +34547,32 @@
                 <m:t>E</m:t>
               </m:r>
               <m:r>
-                <m:rPr>
-                  <m:sty m:val="p"/>
-                </m:rPr>
-                <m:t>[</m:t>
-              </m:r>
-              <m:r>
-                <m:t>Y</m:t>
-              </m:r>
-              <m:r>
-                <m:rPr>
-                  <m:sty m:val="p"/>
-                </m:rPr>
-                <m:t>∣</m:t>
-              </m:r>
-              <m:r>
-                <m:t>Z</m:t>
-              </m:r>
-              <m:r>
-                <m:rPr>
-                  <m:sty m:val="p"/>
-                </m:rPr>
-                <m:t>]</m:t>
+                <m:t>​</m:t>
+              </m:r>
+              <m:d>
+                <m:dPr>
+                  <m:begChr m:val="["/>
+                  <m:sepChr m:val=""/>
+                  <m:endChr m:val="]"/>
+                  <m:grow/>
+                </m:dPr>
+                <m:e>
+                  <m:r>
+                    <m:t>Y</m:t>
+                  </m:r>
+                  <m:r>
+                    <m:rPr>
+                      <m:sty m:val="p"/>
+                    </m:rPr>
+                    <m:t>∣</m:t>
+                  </m:r>
+                  <m:r>
+                    <m:t>Z</m:t>
+                  </m:r>
+                </m:e>
+              </m:d>
+              <m:r>
+                <m:t>​</m:t>
               </m:r>
             </m:oMath>
             <w:r>
@@ -34637,28 +34677,32 @@
                           <m:t>E</m:t>
                         </m:r>
                         <m:r>
-                          <m:rPr>
-                            <m:sty m:val="p"/>
-                          </m:rPr>
-                          <m:t>[</m:t>
+                          <m:t>​</m:t>
                         </m:r>
+                        <m:d>
+                          <m:dPr>
+                            <m:begChr m:val="["/>
+                            <m:sepChr m:val=""/>
+                            <m:endChr m:val="]"/>
+                            <m:grow/>
+                          </m:dPr>
+                          <m:e>
+                            <m:r>
+                              <m:t>Y</m:t>
+                            </m:r>
+                            <m:r>
+                              <m:rPr>
+                                <m:sty m:val="p"/>
+                              </m:rPr>
+                              <m:t>∣</m:t>
+                            </m:r>
+                            <m:r>
+                              <m:t>Z</m:t>
+                            </m:r>
+                          </m:e>
+                        </m:d>
                         <m:r>
-                          <m:t>Y</m:t>
-                        </m:r>
-                        <m:r>
-                          <m:rPr>
-                            <m:sty m:val="p"/>
-                          </m:rPr>
-                          <m:t>∣</m:t>
-                        </m:r>
-                        <m:r>
-                          <m:t>Z</m:t>
-                        </m:r>
-                        <m:r>
-                          <m:rPr>
-                            <m:sty m:val="p"/>
-                          </m:rPr>
-                          <m:t>]</m:t>
+                          <m:t>​</m:t>
                         </m:r>
                         <m:r>
                           <m:rPr>
@@ -36058,69 +36102,73 @@
                   <m:t>E</m:t>
                 </m:r>
                 <m:r>
-                  <m:rPr>
-                    <m:sty m:val="p"/>
-                  </m:rPr>
-                  <m:t>[</m:t>
+                  <m:t>​</m:t>
                 </m:r>
+                <m:d>
+                  <m:dPr>
+                    <m:begChr m:val="["/>
+                    <m:sepChr m:val=""/>
+                    <m:endChr m:val="]"/>
+                    <m:grow/>
+                  </m:dPr>
+                  <m:e>
+                    <m:r>
+                      <m:t>Y</m:t>
+                    </m:r>
+                    <m:r>
+                      <m:rPr>
+                        <m:sty m:val="p"/>
+                      </m:rPr>
+                      <m:t>∣</m:t>
+                    </m:r>
+                    <m:acc>
+                      <m:accPr>
+                        <m:chr m:val="̃"/>
+                      </m:accPr>
+                      <m:e>
+                        <m:r>
+                          <m:t>X</m:t>
+                        </m:r>
+                      </m:e>
+                    </m:acc>
+                    <m:r>
+                      <m:rPr>
+                        <m:sty m:val="p"/>
+                      </m:rPr>
+                      <m:t>=</m:t>
+                    </m:r>
+                    <m:acc>
+                      <m:accPr>
+                        <m:chr m:val="̃"/>
+                      </m:accPr>
+                      <m:e>
+                        <m:r>
+                          <m:t>x</m:t>
+                        </m:r>
+                      </m:e>
+                    </m:acc>
+                    <m:r>
+                      <m:rPr>
+                        <m:sty m:val="p"/>
+                      </m:rPr>
+                      <m:t>,</m:t>
+                    </m:r>
+                    <m:r>
+                      <m:t>T</m:t>
+                    </m:r>
+                    <m:r>
+                      <m:rPr>
+                        <m:sty m:val="p"/>
+                      </m:rPr>
+                      <m:t>=</m:t>
+                    </m:r>
+                    <m:r>
+                      <m:t>t</m:t>
+                    </m:r>
+                  </m:e>
+                </m:d>
                 <m:r>
-                  <m:t>Y</m:t>
-                </m:r>
-                <m:r>
-                  <m:rPr>
-                    <m:sty m:val="p"/>
-                  </m:rPr>
-                  <m:t>∣</m:t>
-                </m:r>
-                <m:acc>
-                  <m:accPr>
-                    <m:chr m:val="̃"/>
-                  </m:accPr>
-                  <m:e>
-                    <m:r>
-                      <m:t>X</m:t>
-                    </m:r>
-                  </m:e>
-                </m:acc>
-                <m:r>
-                  <m:rPr>
-                    <m:sty m:val="p"/>
-                  </m:rPr>
-                  <m:t>=</m:t>
-                </m:r>
-                <m:acc>
-                  <m:accPr>
-                    <m:chr m:val="̃"/>
-                  </m:accPr>
-                  <m:e>
-                    <m:r>
-                      <m:t>x</m:t>
-                    </m:r>
-                  </m:e>
-                </m:acc>
-                <m:r>
-                  <m:rPr>
-                    <m:sty m:val="p"/>
-                  </m:rPr>
-                  <m:t>,</m:t>
-                </m:r>
-                <m:r>
-                  <m:t>T</m:t>
-                </m:r>
-                <m:r>
-                  <m:rPr>
-                    <m:sty m:val="p"/>
-                  </m:rPr>
-                  <m:t>=</m:t>
-                </m:r>
-                <m:r>
-                  <m:t>t</m:t>
-                </m:r>
-                <m:r>
-                  <m:rPr>
-                    <m:sty m:val="p"/>
-                  </m:rPr>
-                  <m:t>]</m:t>
+                  <m:t>​</m:t>
                 </m:r>
               </m:oMath>
             </m:oMathPara>
@@ -36291,69 +36339,73 @@
           <m:t>E</m:t>
         </m:r>
         <m:r>
-          <m:rPr>
-            <m:sty m:val="p"/>
-          </m:rPr>
-          <m:t>[</m:t>
+          <m:t>​</m:t>
         </m:r>
-        <m:r>
-          <m:t>Y</m:t>
-        </m:r>
-        <m:r>
-          <m:rPr>
-            <m:sty m:val="p"/>
-          </m:rPr>
-          <m:t>∣</m:t>
-        </m:r>
-        <m:acc>
-          <m:accPr>
-            <m:chr m:val="̃"/>
-          </m:accPr>
+        <m:d>
+          <m:dPr>
+            <m:begChr m:val="["/>
+            <m:sepChr m:val=""/>
+            <m:endChr m:val="]"/>
+            <m:grow/>
+          </m:dPr>
           <m:e>
             <m:r>
-              <m:t>X</m:t>
+              <m:t>Y</m:t>
+            </m:r>
+            <m:r>
+              <m:rPr>
+                <m:sty m:val="p"/>
+              </m:rPr>
+              <m:t>∣</m:t>
+            </m:r>
+            <m:acc>
+              <m:accPr>
+                <m:chr m:val="̃"/>
+              </m:accPr>
+              <m:e>
+                <m:r>
+                  <m:t>X</m:t>
+                </m:r>
+              </m:e>
+            </m:acc>
+            <m:r>
+              <m:rPr>
+                <m:sty m:val="p"/>
+              </m:rPr>
+              <m:t>=</m:t>
+            </m:r>
+            <m:acc>
+              <m:accPr>
+                <m:chr m:val="̃"/>
+              </m:accPr>
+              <m:e>
+                <m:r>
+                  <m:t>x</m:t>
+                </m:r>
+              </m:e>
+            </m:acc>
+            <m:r>
+              <m:rPr>
+                <m:sty m:val="p"/>
+              </m:rPr>
+              <m:t>,</m:t>
+            </m:r>
+            <m:r>
+              <m:t>T</m:t>
+            </m:r>
+            <m:r>
+              <m:rPr>
+                <m:sty m:val="p"/>
+              </m:rPr>
+              <m:t>=</m:t>
+            </m:r>
+            <m:r>
+              <m:t>t</m:t>
             </m:r>
           </m:e>
-        </m:acc>
+        </m:d>
         <m:r>
-          <m:rPr>
-            <m:sty m:val="p"/>
-          </m:rPr>
-          <m:t>=</m:t>
-        </m:r>
-        <m:acc>
-          <m:accPr>
-            <m:chr m:val="̃"/>
-          </m:accPr>
-          <m:e>
-            <m:r>
-              <m:t>x</m:t>
-            </m:r>
-          </m:e>
-        </m:acc>
-        <m:r>
-          <m:rPr>
-            <m:sty m:val="p"/>
-          </m:rPr>
-          <m:t>,</m:t>
-        </m:r>
-        <m:r>
-          <m:t>T</m:t>
-        </m:r>
-        <m:r>
-          <m:rPr>
-            <m:sty m:val="p"/>
-          </m:rPr>
-          <m:t>=</m:t>
-        </m:r>
-        <m:r>
-          <m:t>t</m:t>
-        </m:r>
-        <m:r>
-          <m:rPr>
-            <m:sty m:val="p"/>
-          </m:rPr>
-          <m:t>]</m:t>
+          <m:t>​</m:t>
         </m:r>
       </m:oMath>
       <w:r>
@@ -36896,69 +36948,73 @@
                 <m:t>E</m:t>
               </m:r>
               <m:r>
-                <m:rPr>
-                  <m:sty m:val="p"/>
-                </m:rPr>
-                <m:t>[</m:t>
-              </m:r>
-              <m:r>
-                <m:t>Y</m:t>
-              </m:r>
-              <m:r>
-                <m:rPr>
-                  <m:sty m:val="p"/>
-                </m:rPr>
-                <m:t>∣</m:t>
-              </m:r>
-              <m:acc>
-                <m:accPr>
-                  <m:chr m:val="̃"/>
-                </m:accPr>
+                <m:t>​</m:t>
+              </m:r>
+              <m:d>
+                <m:dPr>
+                  <m:begChr m:val="["/>
+                  <m:sepChr m:val=""/>
+                  <m:endChr m:val="]"/>
+                  <m:grow/>
+                </m:dPr>
                 <m:e>
                   <m:r>
-                    <m:t>X</m:t>
+                    <m:t>Y</m:t>
+                  </m:r>
+                  <m:r>
+                    <m:rPr>
+                      <m:sty m:val="p"/>
+                    </m:rPr>
+                    <m:t>∣</m:t>
+                  </m:r>
+                  <m:acc>
+                    <m:accPr>
+                      <m:chr m:val="̃"/>
+                    </m:accPr>
+                    <m:e>
+                      <m:r>
+                        <m:t>X</m:t>
+                      </m:r>
+                    </m:e>
+                  </m:acc>
+                  <m:r>
+                    <m:rPr>
+                      <m:sty m:val="p"/>
+                    </m:rPr>
+                    <m:t>=</m:t>
+                  </m:r>
+                  <m:acc>
+                    <m:accPr>
+                      <m:chr m:val="̃"/>
+                    </m:accPr>
+                    <m:e>
+                      <m:r>
+                        <m:t>x</m:t>
+                      </m:r>
+                    </m:e>
+                  </m:acc>
+                  <m:r>
+                    <m:rPr>
+                      <m:sty m:val="p"/>
+                    </m:rPr>
+                    <m:t>,</m:t>
+                  </m:r>
+                  <m:r>
+                    <m:t>T</m:t>
+                  </m:r>
+                  <m:r>
+                    <m:rPr>
+                      <m:sty m:val="p"/>
+                    </m:rPr>
+                    <m:t>=</m:t>
+                  </m:r>
+                  <m:r>
+                    <m:t>t</m:t>
                   </m:r>
                 </m:e>
-              </m:acc>
-              <m:r>
-                <m:rPr>
-                  <m:sty m:val="p"/>
-                </m:rPr>
-                <m:t>=</m:t>
-              </m:r>
-              <m:acc>
-                <m:accPr>
-                  <m:chr m:val="̃"/>
-                </m:accPr>
-                <m:e>
-                  <m:r>
-                    <m:t>x</m:t>
-                  </m:r>
-                </m:e>
-              </m:acc>
-              <m:r>
-                <m:rPr>
-                  <m:sty m:val="p"/>
-                </m:rPr>
-                <m:t>,</m:t>
-              </m:r>
-              <m:r>
-                <m:t>T</m:t>
-              </m:r>
-              <m:r>
-                <m:rPr>
-                  <m:sty m:val="p"/>
-                </m:rPr>
-                <m:t>=</m:t>
-              </m:r>
-              <m:r>
-                <m:t>t</m:t>
-              </m:r>
-              <m:r>
-                <m:rPr>
-                  <m:sty m:val="p"/>
-                </m:rPr>
-                <m:t>]</m:t>
+              </m:d>
+              <m:r>
+                <m:t>​</m:t>
               </m:r>
             </m:oMath>
             <w:r>
@@ -37964,69 +38020,73 @@
             <m:t>E</m:t>
           </m:r>
           <m:r>
-            <m:rPr>
-              <m:sty m:val="p"/>
-            </m:rPr>
-            <m:t>[</m:t>
+            <m:t>​</m:t>
           </m:r>
+          <m:d>
+            <m:dPr>
+              <m:begChr m:val="["/>
+              <m:sepChr m:val=""/>
+              <m:endChr m:val="]"/>
+              <m:grow/>
+            </m:dPr>
+            <m:e>
+              <m:r>
+                <m:t>Y</m:t>
+              </m:r>
+              <m:r>
+                <m:rPr>
+                  <m:sty m:val="p"/>
+                </m:rPr>
+                <m:t>∣</m:t>
+              </m:r>
+              <m:acc>
+                <m:accPr>
+                  <m:chr m:val="̃"/>
+                </m:accPr>
+                <m:e>
+                  <m:r>
+                    <m:t>X</m:t>
+                  </m:r>
+                </m:e>
+              </m:acc>
+              <m:r>
+                <m:rPr>
+                  <m:sty m:val="p"/>
+                </m:rPr>
+                <m:t>=</m:t>
+              </m:r>
+              <m:acc>
+                <m:accPr>
+                  <m:chr m:val="̃"/>
+                </m:accPr>
+                <m:e>
+                  <m:r>
+                    <m:t>x</m:t>
+                  </m:r>
+                </m:e>
+              </m:acc>
+              <m:r>
+                <m:rPr>
+                  <m:sty m:val="p"/>
+                </m:rPr>
+                <m:t>,</m:t>
+              </m:r>
+              <m:r>
+                <m:t>T</m:t>
+              </m:r>
+              <m:r>
+                <m:rPr>
+                  <m:sty m:val="p"/>
+                </m:rPr>
+                <m:t>=</m:t>
+              </m:r>
+              <m:r>
+                <m:t>t</m:t>
+              </m:r>
+            </m:e>
+          </m:d>
           <m:r>
-            <m:t>Y</m:t>
-          </m:r>
-          <m:r>
-            <m:rPr>
-              <m:sty m:val="p"/>
-            </m:rPr>
-            <m:t>∣</m:t>
-          </m:r>
-          <m:acc>
-            <m:accPr>
-              <m:chr m:val="̃"/>
-            </m:accPr>
-            <m:e>
-              <m:r>
-                <m:t>X</m:t>
-              </m:r>
-            </m:e>
-          </m:acc>
-          <m:r>
-            <m:rPr>
-              <m:sty m:val="p"/>
-            </m:rPr>
-            <m:t>=</m:t>
-          </m:r>
-          <m:acc>
-            <m:accPr>
-              <m:chr m:val="̃"/>
-            </m:accPr>
-            <m:e>
-              <m:r>
-                <m:t>x</m:t>
-              </m:r>
-            </m:e>
-          </m:acc>
-          <m:r>
-            <m:rPr>
-              <m:sty m:val="p"/>
-            </m:rPr>
-            <m:t>,</m:t>
-          </m:r>
-          <m:r>
-            <m:t>T</m:t>
-          </m:r>
-          <m:r>
-            <m:rPr>
-              <m:sty m:val="p"/>
-            </m:rPr>
-            <m:t>=</m:t>
-          </m:r>
-          <m:r>
-            <m:t>t</m:t>
-          </m:r>
-          <m:r>
-            <m:rPr>
-              <m:sty m:val="p"/>
-            </m:rPr>
-            <m:t>]</m:t>
+            <m:t>​</m:t>
           </m:r>
         </m:oMath>
       </m:oMathPara>

</xml_diff>

<commit_message>
Deploying to gh-pages from @ d-morrison/rme@f51da0c160e08777028836c5ef9c5fc406b2e7d6 🚀
</commit_message>
<xml_diff>
--- a/chapters/count-regression-handout.docx
+++ b/chapters/count-regression-handout.docx
@@ -39407,7 +39407,7 @@
               <w:rPr>
                 <w:rStyle w:val="CommentTok"/>
               </w:rPr>
-              <w:t xml:space="preserve">#&gt;     hivstat + sexabuse + hplsns, data = needles, init.theta = 0.08315440712, </w:t>
+              <w:t xml:space="preserve">#&gt;     hivstat + sexabuse + hplsns, data = needles, init.theta = 0.0903642555, </w:t>
             </w:r>
             <w:r>
               <w:br/>
@@ -39443,7 +39443,7 @@
               <w:rPr>
                 <w:rStyle w:val="CommentTok"/>
               </w:rPr>
-              <w:t xml:space="preserve">#&gt;                             Estimate Std. Error z value Pr(&gt;|z|)    </w:t>
+              <w:t xml:space="preserve">#&gt;                             Estimate Std. Error z value Pr(&gt;|z|)   </w:t>
             </w:r>
             <w:r>
               <w:br/>
@@ -39452,7 +39452,7 @@
               <w:rPr>
                 <w:rStyle w:val="CommentTok"/>
               </w:rPr>
-              <w:t xml:space="preserve">#&gt; (Intercept)                   6.4536     1.8421    3.50  0.00046 ***</w:t>
+              <w:t xml:space="preserve">#&gt; (Intercept)                   2.8948     1.9293    1.50   0.1335   </w:t>
             </w:r>
             <w:r>
               <w:br/>
@@ -39461,7 +39461,7 @@
               <w:rPr>
                 <w:rStyle w:val="CommentTok"/>
               </w:rPr>
-              <w:t xml:space="preserve">#&gt; homelesshomeless              1.1508     0.7366    1.56  0.11820    </w:t>
+              <w:t xml:space="preserve">#&gt; homelesshomeless              2.5534     0.8024    3.18   0.0015 **</w:t>
             </w:r>
             <w:r>
               <w:br/>
@@ -39470,7 +39470,7 @@
               <w:rPr>
                 <w:rStyle w:val="CommentTok"/>
               </w:rPr>
-              <w:t xml:space="preserve">#&gt; age                          -0.1485     0.0433   -3.43  0.00059 ***</w:t>
+              <w:t xml:space="preserve">#&gt; age                          -0.0729     0.0447   -1.63   0.1027   </w:t>
             </w:r>
             <w:r>
               <w:br/>
@@ -39479,7 +39479,7 @@
               <w:rPr>
                 <w:rStyle w:val="CommentTok"/>
               </w:rPr>
-              <w:t xml:space="preserve">#&gt; sexF                          0.2198     0.8179    0.27  0.78813    </w:t>
+              <w:t xml:space="preserve">#&gt; sexF                         -0.5545     0.8869   -0.63   0.5318   </w:t>
             </w:r>
             <w:r>
               <w:br/>
@@ -39488,7 +39488,7 @@
               <w:rPr>
                 <w:rStyle w:val="CommentTok"/>
               </w:rPr>
-              <w:t xml:space="preserve">#&gt; ethnAA                        1.5958     0.8890    1.79  0.07265 .  </w:t>
+              <w:t xml:space="preserve">#&gt; ethnAA                        0.9100     0.9416    0.97   0.3339   </w:t>
             </w:r>
             <w:r>
               <w:br/>
@@ -39497,7 +39497,7 @@
               <w:rPr>
                 <w:rStyle w:val="CommentTok"/>
               </w:rPr>
-              <w:t xml:space="preserve">#&gt; ethnHispanic                  3.7763     1.5240    2.48  0.01322 *  </w:t>
+              <w:t xml:space="preserve">#&gt; ethnHispanic                  2.6222     1.5835    1.66   0.0977 . </w:t>
             </w:r>
             <w:r>
               <w:br/>
@@ -39506,7 +39506,7 @@
               <w:rPr>
                 <w:rStyle w:val="CommentTok"/>
               </w:rPr>
-              <w:t xml:space="preserve">#&gt; ethnOther                    -3.2365     2.2663   -1.43  0.15327    </w:t>
+              <w:t xml:space="preserve">#&gt; ethnOther                    -1.5963     2.1745   -0.73   0.4629   </w:t>
             </w:r>
             <w:r>
               <w:br/>
@@ -39515,7 +39515,7 @@
               <w:rPr>
                 <w:rStyle w:val="CommentTok"/>
               </w:rPr>
-              <w:t xml:space="preserve">#&gt; polydrugmultiple drugs used  -4.0532     1.0898   -3.72  0.00020 ***</w:t>
+              <w:t xml:space="preserve">#&gt; polydrugmultiple drugs used  -3.7062     1.3330   -2.78   0.0054 **</w:t>
             </w:r>
             <w:r>
               <w:br/>
@@ -39524,7 +39524,7 @@
               <w:rPr>
                 <w:rStyle w:val="CommentTok"/>
               </w:rPr>
-              <w:t xml:space="preserve">#&gt; hivstatHIV+                  -1.1548     1.3185   -0.88  0.38113    </w:t>
+              <w:t xml:space="preserve">#&gt; hivstatHIV+                  -3.4809     1.5036   -2.32   0.0206 * </w:t>
             </w:r>
             <w:r>
               <w:br/>
@@ -39533,7 +39533,7 @@
               <w:rPr>
                 <w:rStyle w:val="CommentTok"/>
               </w:rPr>
-              <w:t xml:space="preserve">#&gt; sexabuseyes                  -2.6449     1.0772   -2.46  0.01408 *  </w:t>
+              <w:t xml:space="preserve">#&gt; sexabuseyes                  -1.5612     1.2484   -1.25   0.2111   </w:t>
             </w:r>
             <w:r>
               <w:br/>
@@ -39542,7 +39542,7 @@
               <w:rPr>
                 <w:rStyle w:val="CommentTok"/>
               </w:rPr>
-              <w:t xml:space="preserve">#&gt; hplsns                        0.0948     0.0648    1.46  0.14306    </w:t>
+              <w:t xml:space="preserve">#&gt; hplsns                       -0.0449     0.0685   -0.66   0.5119   </w:t>
             </w:r>
             <w:r>
               <w:br/>
@@ -39578,7 +39578,7 @@
               <w:rPr>
                 <w:rStyle w:val="CommentTok"/>
               </w:rPr>
-              <w:t xml:space="preserve">#&gt; (Dispersion parameter for Negative Binomial(0.0913) family taken to be 1)</w:t>
+              <w:t xml:space="preserve">#&gt; (Dispersion parameter for Negative Binomial(0.0899) family taken to be 1)</w:t>
             </w:r>
             <w:r>
               <w:br/>
@@ -39596,7 +39596,7 @@
               <w:rPr>
                 <w:rStyle w:val="CommentTok"/>
               </w:rPr>
-              <w:t xml:space="preserve">#&gt;     Null deviance: 62.231  on 108  degrees of freedom</w:t>
+              <w:t xml:space="preserve">#&gt;     Null deviance: 61.511  on 108  degrees of freedom</w:t>
             </w:r>
             <w:r>
               <w:br/>
@@ -39605,7 +39605,7 @@
               <w:rPr>
                 <w:rStyle w:val="CommentTok"/>
               </w:rPr>
-              <w:t xml:space="preserve">#&gt; Residual deviance: 60.031  on  98  degrees of freedom</w:t>
+              <w:t xml:space="preserve">#&gt; Residual deviance: 52.284  on  98  degrees of freedom</w:t>
             </w:r>
             <w:r>
               <w:br/>
@@ -39623,7 +39623,7 @@
               <w:rPr>
                 <w:rStyle w:val="CommentTok"/>
               </w:rPr>
-              <w:t xml:space="preserve">#&gt; AIC: 267.9</w:t>
+              <w:t xml:space="preserve">#&gt; AIC: 261.5</w:t>
             </w:r>
             <w:r>
               <w:br/>
@@ -39668,7 +39668,7 @@
               <w:rPr>
                 <w:rStyle w:val="CommentTok"/>
               </w:rPr>
-              <w:t xml:space="preserve">#&gt;               Theta:  0.0832 </w:t>
+              <w:t xml:space="preserve">#&gt;               Theta:  0.0904 </w:t>
             </w:r>
             <w:r>
               <w:br/>
@@ -39677,7 +39677,7 @@
               <w:rPr>
                 <w:rStyle w:val="CommentTok"/>
               </w:rPr>
-              <w:t xml:space="preserve">#&gt;           Std. Err.:  0.0216 </w:t>
+              <w:t xml:space="preserve">#&gt;           Std. Err.:  0.0239 </w:t>
             </w:r>
             <w:r>
               <w:br/>
@@ -39704,7 +39704,7 @@
               <w:rPr>
                 <w:rStyle w:val="CommentTok"/>
               </w:rPr>
-              <w:t xml:space="preserve">#&gt;  2 x log-likelihood:  -243.8880</w:t>
+              <w:t xml:space="preserve">#&gt;  2 x log-likelihood:  -237.5430</w:t>
             </w:r>
           </w:p>
           <w:bookmarkEnd w:id="88"/>
@@ -40171,11 +40171,11 @@
               <w:tblLook w:firstRow="1" w:lastRow="0" w:firstColumn="0" w:lastColumn="0" w:noHBand="0" w:noVBand="0" w:val="0020"/>
             </w:tblPr>
             <w:tblGrid>
-              <w:gridCol w:w="3046"/>
-              <w:gridCol w:w="1523"/>
-              <w:gridCol w:w="1320"/>
-              <w:gridCol w:w="1015"/>
-              <w:gridCol w:w="1015"/>
+              <w:gridCol w:w="2970"/>
+              <w:gridCol w:w="1485"/>
+              <w:gridCol w:w="1287"/>
+              <w:gridCol w:w="1089"/>
+              <w:gridCol w:w="1089"/>
             </w:tblGrid>
             <w:tr>
               <w:trPr>
@@ -40296,7 +40296,7 @@
                     <w:jc w:val="center"/>
                   </w:pPr>
                   <w:r>
-                    <w:t xml:space="preserve">6.454</w:t>
+                    <w:t xml:space="preserve">2.895</w:t>
                   </w:r>
                 </w:p>
               </w:tc>
@@ -40309,7 +40309,7 @@
                     <w:jc w:val="center"/>
                   </w:pPr>
                   <w:r>
-                    <w:t xml:space="preserve">1.842</w:t>
+                    <w:t xml:space="preserve">1.929</w:t>
                   </w:r>
                 </w:p>
               </w:tc>
@@ -40363,7 +40363,7 @@
                     <w:jc w:val="center"/>
                   </w:pPr>
                   <w:r>
-                    <w:t xml:space="preserve">1.151</w:t>
+                    <w:t xml:space="preserve">2.553</w:t>
                   </w:r>
                 </w:p>
               </w:tc>
@@ -40376,7 +40376,7 @@
                     <w:jc w:val="center"/>
                   </w:pPr>
                   <w:r>
-                    <w:t xml:space="preserve">0.7366</w:t>
+                    <w:t xml:space="preserve">0.8024</w:t>
                   </w:r>
                 </w:p>
               </w:tc>
@@ -40430,7 +40430,7 @@
                     <w:jc w:val="center"/>
                   </w:pPr>
                   <w:r>
-                    <w:t xml:space="preserve">-0.1485</w:t>
+                    <w:t xml:space="preserve">-0.07291</w:t>
                   </w:r>
                 </w:p>
               </w:tc>
@@ -40443,7 +40443,7 @@
                     <w:jc w:val="center"/>
                   </w:pPr>
                   <w:r>
-                    <w:t xml:space="preserve">0.04326</w:t>
+                    <w:t xml:space="preserve">0.04468</w:t>
                   </w:r>
                 </w:p>
               </w:tc>
@@ -40497,7 +40497,7 @@
                     <w:jc w:val="center"/>
                   </w:pPr>
                   <w:r>
-                    <w:t xml:space="preserve">0.2198</w:t>
+                    <w:t xml:space="preserve">-0.5545</w:t>
                   </w:r>
                 </w:p>
               </w:tc>
@@ -40510,7 +40510,7 @@
                     <w:jc w:val="center"/>
                   </w:pPr>
                   <w:r>
-                    <w:t xml:space="preserve">0.8179</w:t>
+                    <w:t xml:space="preserve">0.8869</w:t>
                   </w:r>
                 </w:p>
               </w:tc>
@@ -40564,7 +40564,7 @@
                     <w:jc w:val="center"/>
                   </w:pPr>
                   <w:r>
-                    <w:t xml:space="preserve">1.596</w:t>
+                    <w:t xml:space="preserve">0.91</w:t>
                   </w:r>
                 </w:p>
               </w:tc>
@@ -40577,7 +40577,7 @@
                     <w:jc w:val="center"/>
                   </w:pPr>
                   <w:r>
-                    <w:t xml:space="preserve">0.889</w:t>
+                    <w:t xml:space="preserve">0.9416</w:t>
                   </w:r>
                 </w:p>
               </w:tc>
@@ -40631,7 +40631,7 @@
                     <w:jc w:val="center"/>
                   </w:pPr>
                   <w:r>
-                    <w:t xml:space="preserve">3.776</w:t>
+                    <w:t xml:space="preserve">2.622</w:t>
                   </w:r>
                 </w:p>
               </w:tc>
@@ -40644,7 +40644,7 @@
                     <w:jc w:val="center"/>
                   </w:pPr>
                   <w:r>
-                    <w:t xml:space="preserve">1.524</w:t>
+                    <w:t xml:space="preserve">1.584</w:t>
                   </w:r>
                 </w:p>
               </w:tc>
@@ -40698,7 +40698,7 @@
                     <w:jc w:val="center"/>
                   </w:pPr>
                   <w:r>
-                    <w:t xml:space="preserve">-3.236</w:t>
+                    <w:t xml:space="preserve">-1.596</w:t>
                   </w:r>
                 </w:p>
               </w:tc>
@@ -40711,7 +40711,7 @@
                     <w:jc w:val="center"/>
                   </w:pPr>
                   <w:r>
-                    <w:t xml:space="preserve">2.266</w:t>
+                    <w:t xml:space="preserve">2.175</w:t>
                   </w:r>
                 </w:p>
               </w:tc>
@@ -40765,7 +40765,7 @@
                     <w:jc w:val="center"/>
                   </w:pPr>
                   <w:r>
-                    <w:t xml:space="preserve">-4.053</w:t>
+                    <w:t xml:space="preserve">-3.706</w:t>
                   </w:r>
                 </w:p>
               </w:tc>
@@ -40778,7 +40778,7 @@
                     <w:jc w:val="center"/>
                   </w:pPr>
                   <w:r>
-                    <w:t xml:space="preserve">1.09</w:t>
+                    <w:t xml:space="preserve">1.333</w:t>
                   </w:r>
                 </w:p>
               </w:tc>
@@ -40832,7 +40832,7 @@
                     <w:jc w:val="center"/>
                   </w:pPr>
                   <w:r>
-                    <w:t xml:space="preserve">-1.155</w:t>
+                    <w:t xml:space="preserve">-3.481</w:t>
                   </w:r>
                 </w:p>
               </w:tc>
@@ -40845,7 +40845,7 @@
                     <w:jc w:val="center"/>
                   </w:pPr>
                   <w:r>
-                    <w:t xml:space="preserve">1.319</w:t>
+                    <w:t xml:space="preserve">1.504</w:t>
                   </w:r>
                 </w:p>
               </w:tc>
@@ -40899,7 +40899,7 @@
                     <w:jc w:val="center"/>
                   </w:pPr>
                   <w:r>
-                    <w:t xml:space="preserve">-2.645</w:t>
+                    <w:t xml:space="preserve">-1.561</w:t>
                   </w:r>
                 </w:p>
               </w:tc>
@@ -40912,7 +40912,7 @@
                     <w:jc w:val="center"/>
                   </w:pPr>
                   <w:r>
-                    <w:t xml:space="preserve">1.077</w:t>
+                    <w:t xml:space="preserve">1.248</w:t>
                   </w:r>
                 </w:p>
               </w:tc>
@@ -40966,7 +40966,7 @@
                     <w:jc w:val="center"/>
                   </w:pPr>
                   <w:r>
-                    <w:t xml:space="preserve">0.09484</w:t>
+                    <w:t xml:space="preserve">-0.0449</w:t>
                   </w:r>
                 </w:p>
               </w:tc>
@@ -40979,7 +40979,7 @@
                     <w:jc w:val="center"/>
                   </w:pPr>
                   <w:r>
-                    <w:t xml:space="preserve">0.06476</w:t>
+                    <w:t xml:space="preserve">0.06845</w:t>
                   </w:r>
                 </w:p>
               </w:tc>

</xml_diff>

<commit_message>
Deploying to gh-pages from @ d-morrison/rme@a5c27e1784df9af74bb54a87cf23255f63a1feb1 🚀
</commit_message>
<xml_diff>
--- a/chapters/count-regression-handout.docx
+++ b/chapters/count-regression-handout.docx
@@ -39407,7 +39407,7 @@
               <w:rPr>
                 <w:rStyle w:val="CommentTok"/>
               </w:rPr>
-              <w:t xml:space="preserve">#&gt;     hivstat + sexabuse + hplsns, data = needles, init.theta = 0.0903642555, </w:t>
+              <w:t xml:space="preserve">#&gt;     hivstat + sexabuse + hplsns, data = needles, init.theta = 0.08315440712, </w:t>
             </w:r>
             <w:r>
               <w:br/>
@@ -39443,7 +39443,7 @@
               <w:rPr>
                 <w:rStyle w:val="CommentTok"/>
               </w:rPr>
-              <w:t xml:space="preserve">#&gt;                             Estimate Std. Error z value Pr(&gt;|z|)   </w:t>
+              <w:t xml:space="preserve">#&gt;                             Estimate Std. Error z value Pr(&gt;|z|)    </w:t>
             </w:r>
             <w:r>
               <w:br/>
@@ -39452,7 +39452,7 @@
               <w:rPr>
                 <w:rStyle w:val="CommentTok"/>
               </w:rPr>
-              <w:t xml:space="preserve">#&gt; (Intercept)                   2.8948     1.9293    1.50   0.1335   </w:t>
+              <w:t xml:space="preserve">#&gt; (Intercept)                   6.4536     1.8421    3.50  0.00046 ***</w:t>
             </w:r>
             <w:r>
               <w:br/>
@@ -39461,7 +39461,7 @@
               <w:rPr>
                 <w:rStyle w:val="CommentTok"/>
               </w:rPr>
-              <w:t xml:space="preserve">#&gt; homelesshomeless              2.5534     0.8024    3.18   0.0015 **</w:t>
+              <w:t xml:space="preserve">#&gt; homelesshomeless              1.1508     0.7366    1.56  0.11820    </w:t>
             </w:r>
             <w:r>
               <w:br/>
@@ -39470,7 +39470,7 @@
               <w:rPr>
                 <w:rStyle w:val="CommentTok"/>
               </w:rPr>
-              <w:t xml:space="preserve">#&gt; age                          -0.0729     0.0447   -1.63   0.1027   </w:t>
+              <w:t xml:space="preserve">#&gt; age                          -0.1485     0.0433   -3.43  0.00059 ***</w:t>
             </w:r>
             <w:r>
               <w:br/>
@@ -39479,7 +39479,7 @@
               <w:rPr>
                 <w:rStyle w:val="CommentTok"/>
               </w:rPr>
-              <w:t xml:space="preserve">#&gt; sexF                         -0.5545     0.8869   -0.63   0.5318   </w:t>
+              <w:t xml:space="preserve">#&gt; sexF                          0.2198     0.8179    0.27  0.78813    </w:t>
             </w:r>
             <w:r>
               <w:br/>
@@ -39488,7 +39488,7 @@
               <w:rPr>
                 <w:rStyle w:val="CommentTok"/>
               </w:rPr>
-              <w:t xml:space="preserve">#&gt; ethnAA                        0.9100     0.9416    0.97   0.3339   </w:t>
+              <w:t xml:space="preserve">#&gt; ethnAA                        1.5958     0.8890    1.79  0.07265 .  </w:t>
             </w:r>
             <w:r>
               <w:br/>
@@ -39497,7 +39497,7 @@
               <w:rPr>
                 <w:rStyle w:val="CommentTok"/>
               </w:rPr>
-              <w:t xml:space="preserve">#&gt; ethnHispanic                  2.6222     1.5835    1.66   0.0977 . </w:t>
+              <w:t xml:space="preserve">#&gt; ethnHispanic                  3.7763     1.5240    2.48  0.01322 *  </w:t>
             </w:r>
             <w:r>
               <w:br/>
@@ -39506,7 +39506,7 @@
               <w:rPr>
                 <w:rStyle w:val="CommentTok"/>
               </w:rPr>
-              <w:t xml:space="preserve">#&gt; ethnOther                    -1.5963     2.1745   -0.73   0.4629   </w:t>
+              <w:t xml:space="preserve">#&gt; ethnOther                    -3.2365     2.2663   -1.43  0.15327    </w:t>
             </w:r>
             <w:r>
               <w:br/>
@@ -39515,7 +39515,7 @@
               <w:rPr>
                 <w:rStyle w:val="CommentTok"/>
               </w:rPr>
-              <w:t xml:space="preserve">#&gt; polydrugmultiple drugs used  -3.7062     1.3330   -2.78   0.0054 **</w:t>
+              <w:t xml:space="preserve">#&gt; polydrugmultiple drugs used  -4.0532     1.0898   -3.72  0.00020 ***</w:t>
             </w:r>
             <w:r>
               <w:br/>
@@ -39524,7 +39524,7 @@
               <w:rPr>
                 <w:rStyle w:val="CommentTok"/>
               </w:rPr>
-              <w:t xml:space="preserve">#&gt; hivstatHIV+                  -3.4809     1.5036   -2.32   0.0206 * </w:t>
+              <w:t xml:space="preserve">#&gt; hivstatHIV+                  -1.1548     1.3185   -0.88  0.38113    </w:t>
             </w:r>
             <w:r>
               <w:br/>
@@ -39533,7 +39533,7 @@
               <w:rPr>
                 <w:rStyle w:val="CommentTok"/>
               </w:rPr>
-              <w:t xml:space="preserve">#&gt; sexabuseyes                  -1.5612     1.2484   -1.25   0.2111   </w:t>
+              <w:t xml:space="preserve">#&gt; sexabuseyes                  -2.6449     1.0772   -2.46  0.01408 *  </w:t>
             </w:r>
             <w:r>
               <w:br/>
@@ -39542,7 +39542,7 @@
               <w:rPr>
                 <w:rStyle w:val="CommentTok"/>
               </w:rPr>
-              <w:t xml:space="preserve">#&gt; hplsns                       -0.0449     0.0685   -0.66   0.5119   </w:t>
+              <w:t xml:space="preserve">#&gt; hplsns                        0.0948     0.0648    1.46  0.14306    </w:t>
             </w:r>
             <w:r>
               <w:br/>
@@ -39578,7 +39578,7 @@
               <w:rPr>
                 <w:rStyle w:val="CommentTok"/>
               </w:rPr>
-              <w:t xml:space="preserve">#&gt; (Dispersion parameter for Negative Binomial(0.0899) family taken to be 1)</w:t>
+              <w:t xml:space="preserve">#&gt; (Dispersion parameter for Negative Binomial(0.0913) family taken to be 1)</w:t>
             </w:r>
             <w:r>
               <w:br/>
@@ -39596,7 +39596,7 @@
               <w:rPr>
                 <w:rStyle w:val="CommentTok"/>
               </w:rPr>
-              <w:t xml:space="preserve">#&gt;     Null deviance: 61.511  on 108  degrees of freedom</w:t>
+              <w:t xml:space="preserve">#&gt;     Null deviance: 62.231  on 108  degrees of freedom</w:t>
             </w:r>
             <w:r>
               <w:br/>
@@ -39605,7 +39605,7 @@
               <w:rPr>
                 <w:rStyle w:val="CommentTok"/>
               </w:rPr>
-              <w:t xml:space="preserve">#&gt; Residual deviance: 52.284  on  98  degrees of freedom</w:t>
+              <w:t xml:space="preserve">#&gt; Residual deviance: 60.031  on  98  degrees of freedom</w:t>
             </w:r>
             <w:r>
               <w:br/>
@@ -39623,7 +39623,7 @@
               <w:rPr>
                 <w:rStyle w:val="CommentTok"/>
               </w:rPr>
-              <w:t xml:space="preserve">#&gt; AIC: 261.5</w:t>
+              <w:t xml:space="preserve">#&gt; AIC: 267.9</w:t>
             </w:r>
             <w:r>
               <w:br/>
@@ -39668,7 +39668,7 @@
               <w:rPr>
                 <w:rStyle w:val="CommentTok"/>
               </w:rPr>
-              <w:t xml:space="preserve">#&gt;               Theta:  0.0904 </w:t>
+              <w:t xml:space="preserve">#&gt;               Theta:  0.0832 </w:t>
             </w:r>
             <w:r>
               <w:br/>
@@ -39677,7 +39677,7 @@
               <w:rPr>
                 <w:rStyle w:val="CommentTok"/>
               </w:rPr>
-              <w:t xml:space="preserve">#&gt;           Std. Err.:  0.0239 </w:t>
+              <w:t xml:space="preserve">#&gt;           Std. Err.:  0.0216 </w:t>
             </w:r>
             <w:r>
               <w:br/>
@@ -39704,7 +39704,7 @@
               <w:rPr>
                 <w:rStyle w:val="CommentTok"/>
               </w:rPr>
-              <w:t xml:space="preserve">#&gt;  2 x log-likelihood:  -237.5430</w:t>
+              <w:t xml:space="preserve">#&gt;  2 x log-likelihood:  -243.8880</w:t>
             </w:r>
           </w:p>
           <w:bookmarkEnd w:id="88"/>
@@ -40171,11 +40171,11 @@
               <w:tblLook w:firstRow="1" w:lastRow="0" w:firstColumn="0" w:lastColumn="0" w:noHBand="0" w:noVBand="0" w:val="0020"/>
             </w:tblPr>
             <w:tblGrid>
-              <w:gridCol w:w="2970"/>
-              <w:gridCol w:w="1485"/>
-              <w:gridCol w:w="1287"/>
-              <w:gridCol w:w="1089"/>
-              <w:gridCol w:w="1089"/>
+              <w:gridCol w:w="3046"/>
+              <w:gridCol w:w="1523"/>
+              <w:gridCol w:w="1320"/>
+              <w:gridCol w:w="1015"/>
+              <w:gridCol w:w="1015"/>
             </w:tblGrid>
             <w:tr>
               <w:trPr>
@@ -40296,7 +40296,7 @@
                     <w:jc w:val="center"/>
                   </w:pPr>
                   <w:r>
-                    <w:t xml:space="preserve">2.895</w:t>
+                    <w:t xml:space="preserve">6.454</w:t>
                   </w:r>
                 </w:p>
               </w:tc>
@@ -40309,7 +40309,7 @@
                     <w:jc w:val="center"/>
                   </w:pPr>
                   <w:r>
-                    <w:t xml:space="preserve">1.929</w:t>
+                    <w:t xml:space="preserve">1.842</w:t>
                   </w:r>
                 </w:p>
               </w:tc>
@@ -40363,7 +40363,7 @@
                     <w:jc w:val="center"/>
                   </w:pPr>
                   <w:r>
-                    <w:t xml:space="preserve">2.553</w:t>
+                    <w:t xml:space="preserve">1.151</w:t>
                   </w:r>
                 </w:p>
               </w:tc>
@@ -40376,7 +40376,7 @@
                     <w:jc w:val="center"/>
                   </w:pPr>
                   <w:r>
-                    <w:t xml:space="preserve">0.8024</w:t>
+                    <w:t xml:space="preserve">0.7366</w:t>
                   </w:r>
                 </w:p>
               </w:tc>
@@ -40430,7 +40430,7 @@
                     <w:jc w:val="center"/>
                   </w:pPr>
                   <w:r>
-                    <w:t xml:space="preserve">-0.07291</w:t>
+                    <w:t xml:space="preserve">-0.1485</w:t>
                   </w:r>
                 </w:p>
               </w:tc>
@@ -40443,7 +40443,7 @@
                     <w:jc w:val="center"/>
                   </w:pPr>
                   <w:r>
-                    <w:t xml:space="preserve">0.04468</w:t>
+                    <w:t xml:space="preserve">0.04326</w:t>
                   </w:r>
                 </w:p>
               </w:tc>
@@ -40497,7 +40497,7 @@
                     <w:jc w:val="center"/>
                   </w:pPr>
                   <w:r>
-                    <w:t xml:space="preserve">-0.5545</w:t>
+                    <w:t xml:space="preserve">0.2198</w:t>
                   </w:r>
                 </w:p>
               </w:tc>
@@ -40510,7 +40510,7 @@
                     <w:jc w:val="center"/>
                   </w:pPr>
                   <w:r>
-                    <w:t xml:space="preserve">0.8869</w:t>
+                    <w:t xml:space="preserve">0.8179</w:t>
                   </w:r>
                 </w:p>
               </w:tc>
@@ -40564,7 +40564,7 @@
                     <w:jc w:val="center"/>
                   </w:pPr>
                   <w:r>
-                    <w:t xml:space="preserve">0.91</w:t>
+                    <w:t xml:space="preserve">1.596</w:t>
                   </w:r>
                 </w:p>
               </w:tc>
@@ -40577,7 +40577,7 @@
                     <w:jc w:val="center"/>
                   </w:pPr>
                   <w:r>
-                    <w:t xml:space="preserve">0.9416</w:t>
+                    <w:t xml:space="preserve">0.889</w:t>
                   </w:r>
                 </w:p>
               </w:tc>
@@ -40631,7 +40631,7 @@
                     <w:jc w:val="center"/>
                   </w:pPr>
                   <w:r>
-                    <w:t xml:space="preserve">2.622</w:t>
+                    <w:t xml:space="preserve">3.776</w:t>
                   </w:r>
                 </w:p>
               </w:tc>
@@ -40644,7 +40644,7 @@
                     <w:jc w:val="center"/>
                   </w:pPr>
                   <w:r>
-                    <w:t xml:space="preserve">1.584</w:t>
+                    <w:t xml:space="preserve">1.524</w:t>
                   </w:r>
                 </w:p>
               </w:tc>
@@ -40698,7 +40698,7 @@
                     <w:jc w:val="center"/>
                   </w:pPr>
                   <w:r>
-                    <w:t xml:space="preserve">-1.596</w:t>
+                    <w:t xml:space="preserve">-3.236</w:t>
                   </w:r>
                 </w:p>
               </w:tc>
@@ -40711,7 +40711,7 @@
                     <w:jc w:val="center"/>
                   </w:pPr>
                   <w:r>
-                    <w:t xml:space="preserve">2.175</w:t>
+                    <w:t xml:space="preserve">2.266</w:t>
                   </w:r>
                 </w:p>
               </w:tc>
@@ -40765,7 +40765,7 @@
                     <w:jc w:val="center"/>
                   </w:pPr>
                   <w:r>
-                    <w:t xml:space="preserve">-3.706</w:t>
+                    <w:t xml:space="preserve">-4.053</w:t>
                   </w:r>
                 </w:p>
               </w:tc>
@@ -40778,7 +40778,7 @@
                     <w:jc w:val="center"/>
                   </w:pPr>
                   <w:r>
-                    <w:t xml:space="preserve">1.333</w:t>
+                    <w:t xml:space="preserve">1.09</w:t>
                   </w:r>
                 </w:p>
               </w:tc>
@@ -40832,7 +40832,7 @@
                     <w:jc w:val="center"/>
                   </w:pPr>
                   <w:r>
-                    <w:t xml:space="preserve">-3.481</w:t>
+                    <w:t xml:space="preserve">-1.155</w:t>
                   </w:r>
                 </w:p>
               </w:tc>
@@ -40845,7 +40845,7 @@
                     <w:jc w:val="center"/>
                   </w:pPr>
                   <w:r>
-                    <w:t xml:space="preserve">1.504</w:t>
+                    <w:t xml:space="preserve">1.319</w:t>
                   </w:r>
                 </w:p>
               </w:tc>
@@ -40899,7 +40899,7 @@
                     <w:jc w:val="center"/>
                   </w:pPr>
                   <w:r>
-                    <w:t xml:space="preserve">-1.561</w:t>
+                    <w:t xml:space="preserve">-2.645</w:t>
                   </w:r>
                 </w:p>
               </w:tc>
@@ -40912,7 +40912,7 @@
                     <w:jc w:val="center"/>
                   </w:pPr>
                   <w:r>
-                    <w:t xml:space="preserve">1.248</w:t>
+                    <w:t xml:space="preserve">1.077</w:t>
                   </w:r>
                 </w:p>
               </w:tc>
@@ -40966,7 +40966,7 @@
                     <w:jc w:val="center"/>
                   </w:pPr>
                   <w:r>
-                    <w:t xml:space="preserve">-0.0449</w:t>
+                    <w:t xml:space="preserve">0.09484</w:t>
                   </w:r>
                 </w:p>
               </w:tc>
@@ -40979,7 +40979,7 @@
                     <w:jc w:val="center"/>
                   </w:pPr>
                   <w:r>
-                    <w:t xml:space="preserve">0.06845</w:t>
+                    <w:t xml:space="preserve">0.06476</w:t>
                   </w:r>
                 </w:p>
               </w:tc>

</xml_diff>

<commit_message>
Deploying to gh-pages from @ d-morrison/rme@abe864e7e4977816f955ed0be67af87e23818810 🚀
</commit_message>
<xml_diff>
--- a/chapters/count-regression-handout.docx
+++ b/chapters/count-regression-handout.docx
@@ -39407,7 +39407,7 @@
               <w:rPr>
                 <w:rStyle w:val="CommentTok"/>
               </w:rPr>
-              <w:t xml:space="preserve">#&gt;     hivstat + sexabuse + hplsns, data = needles, init.theta = 0.08315440712, </w:t>
+              <w:t xml:space="preserve">#&gt;     hivstat + sexabuse + hplsns, data = needles, init.theta = 0.0903642555, </w:t>
             </w:r>
             <w:r>
               <w:br/>
@@ -39443,7 +39443,7 @@
               <w:rPr>
                 <w:rStyle w:val="CommentTok"/>
               </w:rPr>
-              <w:t xml:space="preserve">#&gt;                             Estimate Std. Error z value Pr(&gt;|z|)    </w:t>
+              <w:t xml:space="preserve">#&gt;                             Estimate Std. Error z value Pr(&gt;|z|)   </w:t>
             </w:r>
             <w:r>
               <w:br/>
@@ -39452,7 +39452,7 @@
               <w:rPr>
                 <w:rStyle w:val="CommentTok"/>
               </w:rPr>
-              <w:t xml:space="preserve">#&gt; (Intercept)                   6.4536     1.8421    3.50  0.00046 ***</w:t>
+              <w:t xml:space="preserve">#&gt; (Intercept)                   2.8948     1.9293    1.50   0.1335   </w:t>
             </w:r>
             <w:r>
               <w:br/>
@@ -39461,7 +39461,7 @@
               <w:rPr>
                 <w:rStyle w:val="CommentTok"/>
               </w:rPr>
-              <w:t xml:space="preserve">#&gt; homelesshomeless              1.1508     0.7366    1.56  0.11820    </w:t>
+              <w:t xml:space="preserve">#&gt; homelesshomeless              2.5534     0.8024    3.18   0.0015 **</w:t>
             </w:r>
             <w:r>
               <w:br/>
@@ -39470,7 +39470,7 @@
               <w:rPr>
                 <w:rStyle w:val="CommentTok"/>
               </w:rPr>
-              <w:t xml:space="preserve">#&gt; age                          -0.1485     0.0433   -3.43  0.00059 ***</w:t>
+              <w:t xml:space="preserve">#&gt; age                          -0.0729     0.0447   -1.63   0.1027   </w:t>
             </w:r>
             <w:r>
               <w:br/>
@@ -39479,7 +39479,7 @@
               <w:rPr>
                 <w:rStyle w:val="CommentTok"/>
               </w:rPr>
-              <w:t xml:space="preserve">#&gt; sexF                          0.2198     0.8179    0.27  0.78813    </w:t>
+              <w:t xml:space="preserve">#&gt; sexF                         -0.5545     0.8869   -0.63   0.5318   </w:t>
             </w:r>
             <w:r>
               <w:br/>
@@ -39488,7 +39488,7 @@
               <w:rPr>
                 <w:rStyle w:val="CommentTok"/>
               </w:rPr>
-              <w:t xml:space="preserve">#&gt; ethnAA                        1.5958     0.8890    1.79  0.07265 .  </w:t>
+              <w:t xml:space="preserve">#&gt; ethnAA                        0.9100     0.9416    0.97   0.3339   </w:t>
             </w:r>
             <w:r>
               <w:br/>
@@ -39497,7 +39497,7 @@
               <w:rPr>
                 <w:rStyle w:val="CommentTok"/>
               </w:rPr>
-              <w:t xml:space="preserve">#&gt; ethnHispanic                  3.7763     1.5240    2.48  0.01322 *  </w:t>
+              <w:t xml:space="preserve">#&gt; ethnHispanic                  2.6222     1.5835    1.66   0.0977 . </w:t>
             </w:r>
             <w:r>
               <w:br/>
@@ -39506,7 +39506,7 @@
               <w:rPr>
                 <w:rStyle w:val="CommentTok"/>
               </w:rPr>
-              <w:t xml:space="preserve">#&gt; ethnOther                    -3.2365     2.2663   -1.43  0.15327    </w:t>
+              <w:t xml:space="preserve">#&gt; ethnOther                    -1.5963     2.1745   -0.73   0.4629   </w:t>
             </w:r>
             <w:r>
               <w:br/>
@@ -39515,7 +39515,7 @@
               <w:rPr>
                 <w:rStyle w:val="CommentTok"/>
               </w:rPr>
-              <w:t xml:space="preserve">#&gt; polydrugmultiple drugs used  -4.0532     1.0898   -3.72  0.00020 ***</w:t>
+              <w:t xml:space="preserve">#&gt; polydrugmultiple drugs used  -3.7062     1.3330   -2.78   0.0054 **</w:t>
             </w:r>
             <w:r>
               <w:br/>
@@ -39524,7 +39524,7 @@
               <w:rPr>
                 <w:rStyle w:val="CommentTok"/>
               </w:rPr>
-              <w:t xml:space="preserve">#&gt; hivstatHIV+                  -1.1548     1.3185   -0.88  0.38113    </w:t>
+              <w:t xml:space="preserve">#&gt; hivstatHIV+                  -3.4809     1.5036   -2.32   0.0206 * </w:t>
             </w:r>
             <w:r>
               <w:br/>
@@ -39533,7 +39533,7 @@
               <w:rPr>
                 <w:rStyle w:val="CommentTok"/>
               </w:rPr>
-              <w:t xml:space="preserve">#&gt; sexabuseyes                  -2.6449     1.0772   -2.46  0.01408 *  </w:t>
+              <w:t xml:space="preserve">#&gt; sexabuseyes                  -1.5612     1.2484   -1.25   0.2111   </w:t>
             </w:r>
             <w:r>
               <w:br/>
@@ -39542,7 +39542,7 @@
               <w:rPr>
                 <w:rStyle w:val="CommentTok"/>
               </w:rPr>
-              <w:t xml:space="preserve">#&gt; hplsns                        0.0948     0.0648    1.46  0.14306    </w:t>
+              <w:t xml:space="preserve">#&gt; hplsns                       -0.0449     0.0685   -0.66   0.5119   </w:t>
             </w:r>
             <w:r>
               <w:br/>
@@ -39578,7 +39578,7 @@
               <w:rPr>
                 <w:rStyle w:val="CommentTok"/>
               </w:rPr>
-              <w:t xml:space="preserve">#&gt; (Dispersion parameter for Negative Binomial(0.0913) family taken to be 1)</w:t>
+              <w:t xml:space="preserve">#&gt; (Dispersion parameter for Negative Binomial(0.0899) family taken to be 1)</w:t>
             </w:r>
             <w:r>
               <w:br/>
@@ -39596,7 +39596,7 @@
               <w:rPr>
                 <w:rStyle w:val="CommentTok"/>
               </w:rPr>
-              <w:t xml:space="preserve">#&gt;     Null deviance: 62.231  on 108  degrees of freedom</w:t>
+              <w:t xml:space="preserve">#&gt;     Null deviance: 61.511  on 108  degrees of freedom</w:t>
             </w:r>
             <w:r>
               <w:br/>
@@ -39605,7 +39605,7 @@
               <w:rPr>
                 <w:rStyle w:val="CommentTok"/>
               </w:rPr>
-              <w:t xml:space="preserve">#&gt; Residual deviance: 60.031  on  98  degrees of freedom</w:t>
+              <w:t xml:space="preserve">#&gt; Residual deviance: 52.284  on  98  degrees of freedom</w:t>
             </w:r>
             <w:r>
               <w:br/>
@@ -39623,7 +39623,7 @@
               <w:rPr>
                 <w:rStyle w:val="CommentTok"/>
               </w:rPr>
-              <w:t xml:space="preserve">#&gt; AIC: 267.9</w:t>
+              <w:t xml:space="preserve">#&gt; AIC: 261.5</w:t>
             </w:r>
             <w:r>
               <w:br/>
@@ -39668,7 +39668,7 @@
               <w:rPr>
                 <w:rStyle w:val="CommentTok"/>
               </w:rPr>
-              <w:t xml:space="preserve">#&gt;               Theta:  0.0832 </w:t>
+              <w:t xml:space="preserve">#&gt;               Theta:  0.0904 </w:t>
             </w:r>
             <w:r>
               <w:br/>
@@ -39677,7 +39677,7 @@
               <w:rPr>
                 <w:rStyle w:val="CommentTok"/>
               </w:rPr>
-              <w:t xml:space="preserve">#&gt;           Std. Err.:  0.0216 </w:t>
+              <w:t xml:space="preserve">#&gt;           Std. Err.:  0.0239 </w:t>
             </w:r>
             <w:r>
               <w:br/>
@@ -39704,7 +39704,7 @@
               <w:rPr>
                 <w:rStyle w:val="CommentTok"/>
               </w:rPr>
-              <w:t xml:space="preserve">#&gt;  2 x log-likelihood:  -243.8880</w:t>
+              <w:t xml:space="preserve">#&gt;  2 x log-likelihood:  -237.5430</w:t>
             </w:r>
           </w:p>
           <w:bookmarkEnd w:id="88"/>
@@ -40171,11 +40171,11 @@
               <w:tblLook w:firstRow="1" w:lastRow="0" w:firstColumn="0" w:lastColumn="0" w:noHBand="0" w:noVBand="0" w:val="0020"/>
             </w:tblPr>
             <w:tblGrid>
-              <w:gridCol w:w="3046"/>
-              <w:gridCol w:w="1523"/>
-              <w:gridCol w:w="1320"/>
-              <w:gridCol w:w="1015"/>
-              <w:gridCol w:w="1015"/>
+              <w:gridCol w:w="2970"/>
+              <w:gridCol w:w="1485"/>
+              <w:gridCol w:w="1287"/>
+              <w:gridCol w:w="1089"/>
+              <w:gridCol w:w="1089"/>
             </w:tblGrid>
             <w:tr>
               <w:trPr>
@@ -40296,7 +40296,7 @@
                     <w:jc w:val="center"/>
                   </w:pPr>
                   <w:r>
-                    <w:t xml:space="preserve">6.454</w:t>
+                    <w:t xml:space="preserve">2.895</w:t>
                   </w:r>
                 </w:p>
               </w:tc>
@@ -40309,7 +40309,7 @@
                     <w:jc w:val="center"/>
                   </w:pPr>
                   <w:r>
-                    <w:t xml:space="preserve">1.842</w:t>
+                    <w:t xml:space="preserve">1.929</w:t>
                   </w:r>
                 </w:p>
               </w:tc>
@@ -40363,7 +40363,7 @@
                     <w:jc w:val="center"/>
                   </w:pPr>
                   <w:r>
-                    <w:t xml:space="preserve">1.151</w:t>
+                    <w:t xml:space="preserve">2.553</w:t>
                   </w:r>
                 </w:p>
               </w:tc>
@@ -40376,7 +40376,7 @@
                     <w:jc w:val="center"/>
                   </w:pPr>
                   <w:r>
-                    <w:t xml:space="preserve">0.7366</w:t>
+                    <w:t xml:space="preserve">0.8024</w:t>
                   </w:r>
                 </w:p>
               </w:tc>
@@ -40430,7 +40430,7 @@
                     <w:jc w:val="center"/>
                   </w:pPr>
                   <w:r>
-                    <w:t xml:space="preserve">-0.1485</w:t>
+                    <w:t xml:space="preserve">-0.07291</w:t>
                   </w:r>
                 </w:p>
               </w:tc>
@@ -40443,7 +40443,7 @@
                     <w:jc w:val="center"/>
                   </w:pPr>
                   <w:r>
-                    <w:t xml:space="preserve">0.04326</w:t>
+                    <w:t xml:space="preserve">0.04468</w:t>
                   </w:r>
                 </w:p>
               </w:tc>
@@ -40497,7 +40497,7 @@
                     <w:jc w:val="center"/>
                   </w:pPr>
                   <w:r>
-                    <w:t xml:space="preserve">0.2198</w:t>
+                    <w:t xml:space="preserve">-0.5545</w:t>
                   </w:r>
                 </w:p>
               </w:tc>
@@ -40510,7 +40510,7 @@
                     <w:jc w:val="center"/>
                   </w:pPr>
                   <w:r>
-                    <w:t xml:space="preserve">0.8179</w:t>
+                    <w:t xml:space="preserve">0.8869</w:t>
                   </w:r>
                 </w:p>
               </w:tc>
@@ -40564,7 +40564,7 @@
                     <w:jc w:val="center"/>
                   </w:pPr>
                   <w:r>
-                    <w:t xml:space="preserve">1.596</w:t>
+                    <w:t xml:space="preserve">0.91</w:t>
                   </w:r>
                 </w:p>
               </w:tc>
@@ -40577,7 +40577,7 @@
                     <w:jc w:val="center"/>
                   </w:pPr>
                   <w:r>
-                    <w:t xml:space="preserve">0.889</w:t>
+                    <w:t xml:space="preserve">0.9416</w:t>
                   </w:r>
                 </w:p>
               </w:tc>
@@ -40631,7 +40631,7 @@
                     <w:jc w:val="center"/>
                   </w:pPr>
                   <w:r>
-                    <w:t xml:space="preserve">3.776</w:t>
+                    <w:t xml:space="preserve">2.622</w:t>
                   </w:r>
                 </w:p>
               </w:tc>
@@ -40644,7 +40644,7 @@
                     <w:jc w:val="center"/>
                   </w:pPr>
                   <w:r>
-                    <w:t xml:space="preserve">1.524</w:t>
+                    <w:t xml:space="preserve">1.584</w:t>
                   </w:r>
                 </w:p>
               </w:tc>
@@ -40698,7 +40698,7 @@
                     <w:jc w:val="center"/>
                   </w:pPr>
                   <w:r>
-                    <w:t xml:space="preserve">-3.236</w:t>
+                    <w:t xml:space="preserve">-1.596</w:t>
                   </w:r>
                 </w:p>
               </w:tc>
@@ -40711,7 +40711,7 @@
                     <w:jc w:val="center"/>
                   </w:pPr>
                   <w:r>
-                    <w:t xml:space="preserve">2.266</w:t>
+                    <w:t xml:space="preserve">2.175</w:t>
                   </w:r>
                 </w:p>
               </w:tc>
@@ -40765,7 +40765,7 @@
                     <w:jc w:val="center"/>
                   </w:pPr>
                   <w:r>
-                    <w:t xml:space="preserve">-4.053</w:t>
+                    <w:t xml:space="preserve">-3.706</w:t>
                   </w:r>
                 </w:p>
               </w:tc>
@@ -40778,7 +40778,7 @@
                     <w:jc w:val="center"/>
                   </w:pPr>
                   <w:r>
-                    <w:t xml:space="preserve">1.09</w:t>
+                    <w:t xml:space="preserve">1.333</w:t>
                   </w:r>
                 </w:p>
               </w:tc>
@@ -40832,7 +40832,7 @@
                     <w:jc w:val="center"/>
                   </w:pPr>
                   <w:r>
-                    <w:t xml:space="preserve">-1.155</w:t>
+                    <w:t xml:space="preserve">-3.481</w:t>
                   </w:r>
                 </w:p>
               </w:tc>
@@ -40845,7 +40845,7 @@
                     <w:jc w:val="center"/>
                   </w:pPr>
                   <w:r>
-                    <w:t xml:space="preserve">1.319</w:t>
+                    <w:t xml:space="preserve">1.504</w:t>
                   </w:r>
                 </w:p>
               </w:tc>
@@ -40899,7 +40899,7 @@
                     <w:jc w:val="center"/>
                   </w:pPr>
                   <w:r>
-                    <w:t xml:space="preserve">-2.645</w:t>
+                    <w:t xml:space="preserve">-1.561</w:t>
                   </w:r>
                 </w:p>
               </w:tc>
@@ -40912,7 +40912,7 @@
                     <w:jc w:val="center"/>
                   </w:pPr>
                   <w:r>
-                    <w:t xml:space="preserve">1.077</w:t>
+                    <w:t xml:space="preserve">1.248</w:t>
                   </w:r>
                 </w:p>
               </w:tc>
@@ -40966,7 +40966,7 @@
                     <w:jc w:val="center"/>
                   </w:pPr>
                   <w:r>
-                    <w:t xml:space="preserve">0.09484</w:t>
+                    <w:t xml:space="preserve">-0.0449</w:t>
                   </w:r>
                 </w:p>
               </w:tc>
@@ -40979,7 +40979,7 @@
                     <w:jc w:val="center"/>
                   </w:pPr>
                   <w:r>
-                    <w:t xml:space="preserve">0.06476</w:t>
+                    <w:t xml:space="preserve">0.06845</w:t>
                   </w:r>
                 </w:p>
               </w:tc>

</xml_diff>

<commit_message>
Deploying to gh-pages from @ Morrison-Lab/rme@e5ab2794587f824951729a04aef7e0c77c3e2e00 🚀
</commit_message>
<xml_diff>
--- a/chapters/count-regression-handout.docx
+++ b/chapters/count-regression-handout.docx
@@ -39407,7 +39407,7 @@
               <w:rPr>
                 <w:rStyle w:val="CommentTok"/>
               </w:rPr>
-              <w:t xml:space="preserve">#&gt;     hivstat + sexabuse + hplsns, data = needles, init.theta = 0.0903642555, </w:t>
+              <w:t xml:space="preserve">#&gt;     hivstat + sexabuse + hplsns, data = needles, init.theta = 0.08315440712, </w:t>
             </w:r>
             <w:r>
               <w:br/>
@@ -39443,7 +39443,7 @@
               <w:rPr>
                 <w:rStyle w:val="CommentTok"/>
               </w:rPr>
-              <w:t xml:space="preserve">#&gt;                             Estimate Std. Error z value Pr(&gt;|z|)   </w:t>
+              <w:t xml:space="preserve">#&gt;                             Estimate Std. Error z value Pr(&gt;|z|)    </w:t>
             </w:r>
             <w:r>
               <w:br/>
@@ -39452,7 +39452,7 @@
               <w:rPr>
                 <w:rStyle w:val="CommentTok"/>
               </w:rPr>
-              <w:t xml:space="preserve">#&gt; (Intercept)                   2.8948     1.9293    1.50   0.1335   </w:t>
+              <w:t xml:space="preserve">#&gt; (Intercept)                   6.4536     1.8421    3.50  0.00046 ***</w:t>
             </w:r>
             <w:r>
               <w:br/>
@@ -39461,7 +39461,7 @@
               <w:rPr>
                 <w:rStyle w:val="CommentTok"/>
               </w:rPr>
-              <w:t xml:space="preserve">#&gt; homelesshomeless              2.5534     0.8024    3.18   0.0015 **</w:t>
+              <w:t xml:space="preserve">#&gt; homelesshomeless              1.1508     0.7366    1.56  0.11820    </w:t>
             </w:r>
             <w:r>
               <w:br/>
@@ -39470,7 +39470,7 @@
               <w:rPr>
                 <w:rStyle w:val="CommentTok"/>
               </w:rPr>
-              <w:t xml:space="preserve">#&gt; age                          -0.0729     0.0447   -1.63   0.1027   </w:t>
+              <w:t xml:space="preserve">#&gt; age                          -0.1485     0.0433   -3.43  0.00059 ***</w:t>
             </w:r>
             <w:r>
               <w:br/>
@@ -39479,7 +39479,7 @@
               <w:rPr>
                 <w:rStyle w:val="CommentTok"/>
               </w:rPr>
-              <w:t xml:space="preserve">#&gt; sexF                         -0.5545     0.8869   -0.63   0.5318   </w:t>
+              <w:t xml:space="preserve">#&gt; sexF                          0.2198     0.8179    0.27  0.78813    </w:t>
             </w:r>
             <w:r>
               <w:br/>
@@ -39488,7 +39488,7 @@
               <w:rPr>
                 <w:rStyle w:val="CommentTok"/>
               </w:rPr>
-              <w:t xml:space="preserve">#&gt; ethnAA                        0.9100     0.9416    0.97   0.3339   </w:t>
+              <w:t xml:space="preserve">#&gt; ethnAA                        1.5958     0.8890    1.79  0.07265 .  </w:t>
             </w:r>
             <w:r>
               <w:br/>
@@ -39497,7 +39497,7 @@
               <w:rPr>
                 <w:rStyle w:val="CommentTok"/>
               </w:rPr>
-              <w:t xml:space="preserve">#&gt; ethnHispanic                  2.6222     1.5835    1.66   0.0977 . </w:t>
+              <w:t xml:space="preserve">#&gt; ethnHispanic                  3.7763     1.5240    2.48  0.01322 *  </w:t>
             </w:r>
             <w:r>
               <w:br/>
@@ -39506,7 +39506,7 @@
               <w:rPr>
                 <w:rStyle w:val="CommentTok"/>
               </w:rPr>
-              <w:t xml:space="preserve">#&gt; ethnOther                    -1.5963     2.1745   -0.73   0.4629   </w:t>
+              <w:t xml:space="preserve">#&gt; ethnOther                    -3.2365     2.2663   -1.43  0.15327    </w:t>
             </w:r>
             <w:r>
               <w:br/>
@@ -39515,7 +39515,7 @@
               <w:rPr>
                 <w:rStyle w:val="CommentTok"/>
               </w:rPr>
-              <w:t xml:space="preserve">#&gt; polydrugmultiple drugs used  -3.7062     1.3330   -2.78   0.0054 **</w:t>
+              <w:t xml:space="preserve">#&gt; polydrugmultiple drugs used  -4.0532     1.0898   -3.72  0.00020 ***</w:t>
             </w:r>
             <w:r>
               <w:br/>
@@ -39524,7 +39524,7 @@
               <w:rPr>
                 <w:rStyle w:val="CommentTok"/>
               </w:rPr>
-              <w:t xml:space="preserve">#&gt; hivstatHIV+                  -3.4809     1.5036   -2.32   0.0206 * </w:t>
+              <w:t xml:space="preserve">#&gt; hivstatHIV+                  -1.1548     1.3185   -0.88  0.38113    </w:t>
             </w:r>
             <w:r>
               <w:br/>
@@ -39533,7 +39533,7 @@
               <w:rPr>
                 <w:rStyle w:val="CommentTok"/>
               </w:rPr>
-              <w:t xml:space="preserve">#&gt; sexabuseyes                  -1.5612     1.2484   -1.25   0.2111   </w:t>
+              <w:t xml:space="preserve">#&gt; sexabuseyes                  -2.6449     1.0772   -2.46  0.01408 *  </w:t>
             </w:r>
             <w:r>
               <w:br/>
@@ -39542,7 +39542,7 @@
               <w:rPr>
                 <w:rStyle w:val="CommentTok"/>
               </w:rPr>
-              <w:t xml:space="preserve">#&gt; hplsns                       -0.0449     0.0685   -0.66   0.5119   </w:t>
+              <w:t xml:space="preserve">#&gt; hplsns                        0.0948     0.0648    1.46  0.14306    </w:t>
             </w:r>
             <w:r>
               <w:br/>
@@ -39578,7 +39578,7 @@
               <w:rPr>
                 <w:rStyle w:val="CommentTok"/>
               </w:rPr>
-              <w:t xml:space="preserve">#&gt; (Dispersion parameter for Negative Binomial(0.0899) family taken to be 1)</w:t>
+              <w:t xml:space="preserve">#&gt; (Dispersion parameter for Negative Binomial(0.0913) family taken to be 1)</w:t>
             </w:r>
             <w:r>
               <w:br/>
@@ -39596,7 +39596,7 @@
               <w:rPr>
                 <w:rStyle w:val="CommentTok"/>
               </w:rPr>
-              <w:t xml:space="preserve">#&gt;     Null deviance: 61.511  on 108  degrees of freedom</w:t>
+              <w:t xml:space="preserve">#&gt;     Null deviance: 62.231  on 108  degrees of freedom</w:t>
             </w:r>
             <w:r>
               <w:br/>
@@ -39605,7 +39605,7 @@
               <w:rPr>
                 <w:rStyle w:val="CommentTok"/>
               </w:rPr>
-              <w:t xml:space="preserve">#&gt; Residual deviance: 52.284  on  98  degrees of freedom</w:t>
+              <w:t xml:space="preserve">#&gt; Residual deviance: 60.031  on  98  degrees of freedom</w:t>
             </w:r>
             <w:r>
               <w:br/>
@@ -39623,7 +39623,7 @@
               <w:rPr>
                 <w:rStyle w:val="CommentTok"/>
               </w:rPr>
-              <w:t xml:space="preserve">#&gt; AIC: 261.5</w:t>
+              <w:t xml:space="preserve">#&gt; AIC: 267.9</w:t>
             </w:r>
             <w:r>
               <w:br/>
@@ -39668,7 +39668,7 @@
               <w:rPr>
                 <w:rStyle w:val="CommentTok"/>
               </w:rPr>
-              <w:t xml:space="preserve">#&gt;               Theta:  0.0904 </w:t>
+              <w:t xml:space="preserve">#&gt;               Theta:  0.0832 </w:t>
             </w:r>
             <w:r>
               <w:br/>
@@ -39677,7 +39677,7 @@
               <w:rPr>
                 <w:rStyle w:val="CommentTok"/>
               </w:rPr>
-              <w:t xml:space="preserve">#&gt;           Std. Err.:  0.0239 </w:t>
+              <w:t xml:space="preserve">#&gt;           Std. Err.:  0.0216 </w:t>
             </w:r>
             <w:r>
               <w:br/>
@@ -39704,7 +39704,7 @@
               <w:rPr>
                 <w:rStyle w:val="CommentTok"/>
               </w:rPr>
-              <w:t xml:space="preserve">#&gt;  2 x log-likelihood:  -237.5430</w:t>
+              <w:t xml:space="preserve">#&gt;  2 x log-likelihood:  -243.8880</w:t>
             </w:r>
           </w:p>
           <w:bookmarkEnd w:id="88"/>
@@ -40171,11 +40171,11 @@
               <w:tblLook w:firstRow="1" w:lastRow="0" w:firstColumn="0" w:lastColumn="0" w:noHBand="0" w:noVBand="0" w:val="0020"/>
             </w:tblPr>
             <w:tblGrid>
-              <w:gridCol w:w="2970"/>
-              <w:gridCol w:w="1485"/>
-              <w:gridCol w:w="1287"/>
-              <w:gridCol w:w="1089"/>
-              <w:gridCol w:w="1089"/>
+              <w:gridCol w:w="3046"/>
+              <w:gridCol w:w="1523"/>
+              <w:gridCol w:w="1320"/>
+              <w:gridCol w:w="1015"/>
+              <w:gridCol w:w="1015"/>
             </w:tblGrid>
             <w:tr>
               <w:trPr>
@@ -40296,7 +40296,7 @@
                     <w:jc w:val="center"/>
                   </w:pPr>
                   <w:r>
-                    <w:t xml:space="preserve">2.895</w:t>
+                    <w:t xml:space="preserve">6.454</w:t>
                   </w:r>
                 </w:p>
               </w:tc>
@@ -40309,7 +40309,7 @@
                     <w:jc w:val="center"/>
                   </w:pPr>
                   <w:r>
-                    <w:t xml:space="preserve">1.929</w:t>
+                    <w:t xml:space="preserve">1.842</w:t>
                   </w:r>
                 </w:p>
               </w:tc>
@@ -40363,7 +40363,7 @@
                     <w:jc w:val="center"/>
                   </w:pPr>
                   <w:r>
-                    <w:t xml:space="preserve">2.553</w:t>
+                    <w:t xml:space="preserve">1.151</w:t>
                   </w:r>
                 </w:p>
               </w:tc>
@@ -40376,7 +40376,7 @@
                     <w:jc w:val="center"/>
                   </w:pPr>
                   <w:r>
-                    <w:t xml:space="preserve">0.8024</w:t>
+                    <w:t xml:space="preserve">0.7366</w:t>
                   </w:r>
                 </w:p>
               </w:tc>
@@ -40430,7 +40430,7 @@
                     <w:jc w:val="center"/>
                   </w:pPr>
                   <w:r>
-                    <w:t xml:space="preserve">-0.07291</w:t>
+                    <w:t xml:space="preserve">-0.1485</w:t>
                   </w:r>
                 </w:p>
               </w:tc>
@@ -40443,7 +40443,7 @@
                     <w:jc w:val="center"/>
                   </w:pPr>
                   <w:r>
-                    <w:t xml:space="preserve">0.04468</w:t>
+                    <w:t xml:space="preserve">0.04326</w:t>
                   </w:r>
                 </w:p>
               </w:tc>
@@ -40497,7 +40497,7 @@
                     <w:jc w:val="center"/>
                   </w:pPr>
                   <w:r>
-                    <w:t xml:space="preserve">-0.5545</w:t>
+                    <w:t xml:space="preserve">0.2198</w:t>
                   </w:r>
                 </w:p>
               </w:tc>
@@ -40510,7 +40510,7 @@
                     <w:jc w:val="center"/>
                   </w:pPr>
                   <w:r>
-                    <w:t xml:space="preserve">0.8869</w:t>
+                    <w:t xml:space="preserve">0.8179</w:t>
                   </w:r>
                 </w:p>
               </w:tc>
@@ -40564,7 +40564,7 @@
                     <w:jc w:val="center"/>
                   </w:pPr>
                   <w:r>
-                    <w:t xml:space="preserve">0.91</w:t>
+                    <w:t xml:space="preserve">1.596</w:t>
                   </w:r>
                 </w:p>
               </w:tc>
@@ -40577,7 +40577,7 @@
                     <w:jc w:val="center"/>
                   </w:pPr>
                   <w:r>
-                    <w:t xml:space="preserve">0.9416</w:t>
+                    <w:t xml:space="preserve">0.889</w:t>
                   </w:r>
                 </w:p>
               </w:tc>
@@ -40631,7 +40631,7 @@
                     <w:jc w:val="center"/>
                   </w:pPr>
                   <w:r>
-                    <w:t xml:space="preserve">2.622</w:t>
+                    <w:t xml:space="preserve">3.776</w:t>
                   </w:r>
                 </w:p>
               </w:tc>
@@ -40644,7 +40644,7 @@
                     <w:jc w:val="center"/>
                   </w:pPr>
                   <w:r>
-                    <w:t xml:space="preserve">1.584</w:t>
+                    <w:t xml:space="preserve">1.524</w:t>
                   </w:r>
                 </w:p>
               </w:tc>
@@ -40698,7 +40698,7 @@
                     <w:jc w:val="center"/>
                   </w:pPr>
                   <w:r>
-                    <w:t xml:space="preserve">-1.596</w:t>
+                    <w:t xml:space="preserve">-3.236</w:t>
                   </w:r>
                 </w:p>
               </w:tc>
@@ -40711,7 +40711,7 @@
                     <w:jc w:val="center"/>
                   </w:pPr>
                   <w:r>
-                    <w:t xml:space="preserve">2.175</w:t>
+                    <w:t xml:space="preserve">2.266</w:t>
                   </w:r>
                 </w:p>
               </w:tc>
@@ -40765,7 +40765,7 @@
                     <w:jc w:val="center"/>
                   </w:pPr>
                   <w:r>
-                    <w:t xml:space="preserve">-3.706</w:t>
+                    <w:t xml:space="preserve">-4.053</w:t>
                   </w:r>
                 </w:p>
               </w:tc>
@@ -40778,7 +40778,7 @@
                     <w:jc w:val="center"/>
                   </w:pPr>
                   <w:r>
-                    <w:t xml:space="preserve">1.333</w:t>
+                    <w:t xml:space="preserve">1.09</w:t>
                   </w:r>
                 </w:p>
               </w:tc>
@@ -40832,7 +40832,7 @@
                     <w:jc w:val="center"/>
                   </w:pPr>
                   <w:r>
-                    <w:t xml:space="preserve">-3.481</w:t>
+                    <w:t xml:space="preserve">-1.155</w:t>
                   </w:r>
                 </w:p>
               </w:tc>
@@ -40845,7 +40845,7 @@
                     <w:jc w:val="center"/>
                   </w:pPr>
                   <w:r>
-                    <w:t xml:space="preserve">1.504</w:t>
+                    <w:t xml:space="preserve">1.319</w:t>
                   </w:r>
                 </w:p>
               </w:tc>
@@ -40899,7 +40899,7 @@
                     <w:jc w:val="center"/>
                   </w:pPr>
                   <w:r>
-                    <w:t xml:space="preserve">-1.561</w:t>
+                    <w:t xml:space="preserve">-2.645</w:t>
                   </w:r>
                 </w:p>
               </w:tc>
@@ -40912,7 +40912,7 @@
                     <w:jc w:val="center"/>
                   </w:pPr>
                   <w:r>
-                    <w:t xml:space="preserve">1.248</w:t>
+                    <w:t xml:space="preserve">1.077</w:t>
                   </w:r>
                 </w:p>
               </w:tc>
@@ -40966,7 +40966,7 @@
                     <w:jc w:val="center"/>
                   </w:pPr>
                   <w:r>
-                    <w:t xml:space="preserve">-0.0449</w:t>
+                    <w:t xml:space="preserve">0.09484</w:t>
                   </w:r>
                 </w:p>
               </w:tc>
@@ -40979,7 +40979,7 @@
                     <w:jc w:val="center"/>
                   </w:pPr>
                   <w:r>
-                    <w:t xml:space="preserve">0.06845</w:t>
+                    <w:t xml:space="preserve">0.06476</w:t>
                   </w:r>
                 </w:p>
               </w:tc>

</xml_diff>

<commit_message>
Deploying to gh-pages from @ Morrison-Lab/rme@8e9882fdde0ac9acccb31beb513e906eef53d1e4 🚀
</commit_message>
<xml_diff>
--- a/chapters/count-regression-handout.docx
+++ b/chapters/count-regression-handout.docx
@@ -39407,7 +39407,7 @@
               <w:rPr>
                 <w:rStyle w:val="CommentTok"/>
               </w:rPr>
-              <w:t xml:space="preserve">#&gt;     hivstat + sexabuse + hplsns, data = needles, init.theta = 0.08315440712, </w:t>
+              <w:t xml:space="preserve">#&gt;     hivstat + sexabuse + hplsns, data = needles, init.theta = 0.0903642555, </w:t>
             </w:r>
             <w:r>
               <w:br/>
@@ -39443,7 +39443,7 @@
               <w:rPr>
                 <w:rStyle w:val="CommentTok"/>
               </w:rPr>
-              <w:t xml:space="preserve">#&gt;                             Estimate Std. Error z value Pr(&gt;|z|)    </w:t>
+              <w:t xml:space="preserve">#&gt;                             Estimate Std. Error z value Pr(&gt;|z|)   </w:t>
             </w:r>
             <w:r>
               <w:br/>
@@ -39452,7 +39452,7 @@
               <w:rPr>
                 <w:rStyle w:val="CommentTok"/>
               </w:rPr>
-              <w:t xml:space="preserve">#&gt; (Intercept)                   6.4536     1.8421    3.50  0.00046 ***</w:t>
+              <w:t xml:space="preserve">#&gt; (Intercept)                   2.8948     1.9293    1.50   0.1335   </w:t>
             </w:r>
             <w:r>
               <w:br/>
@@ -39461,7 +39461,7 @@
               <w:rPr>
                 <w:rStyle w:val="CommentTok"/>
               </w:rPr>
-              <w:t xml:space="preserve">#&gt; homelesshomeless              1.1508     0.7366    1.56  0.11820    </w:t>
+              <w:t xml:space="preserve">#&gt; homelesshomeless              2.5534     0.8024    3.18   0.0015 **</w:t>
             </w:r>
             <w:r>
               <w:br/>
@@ -39470,7 +39470,7 @@
               <w:rPr>
                 <w:rStyle w:val="CommentTok"/>
               </w:rPr>
-              <w:t xml:space="preserve">#&gt; age                          -0.1485     0.0433   -3.43  0.00059 ***</w:t>
+              <w:t xml:space="preserve">#&gt; age                          -0.0729     0.0447   -1.63   0.1027   </w:t>
             </w:r>
             <w:r>
               <w:br/>
@@ -39479,7 +39479,7 @@
               <w:rPr>
                 <w:rStyle w:val="CommentTok"/>
               </w:rPr>
-              <w:t xml:space="preserve">#&gt; sexF                          0.2198     0.8179    0.27  0.78813    </w:t>
+              <w:t xml:space="preserve">#&gt; sexF                         -0.5545     0.8869   -0.63   0.5318   </w:t>
             </w:r>
             <w:r>
               <w:br/>
@@ -39488,7 +39488,7 @@
               <w:rPr>
                 <w:rStyle w:val="CommentTok"/>
               </w:rPr>
-              <w:t xml:space="preserve">#&gt; ethnAA                        1.5958     0.8890    1.79  0.07265 .  </w:t>
+              <w:t xml:space="preserve">#&gt; ethnAA                        0.9100     0.9416    0.97   0.3339   </w:t>
             </w:r>
             <w:r>
               <w:br/>
@@ -39497,7 +39497,7 @@
               <w:rPr>
                 <w:rStyle w:val="CommentTok"/>
               </w:rPr>
-              <w:t xml:space="preserve">#&gt; ethnHispanic                  3.7763     1.5240    2.48  0.01322 *  </w:t>
+              <w:t xml:space="preserve">#&gt; ethnHispanic                  2.6222     1.5835    1.66   0.0977 . </w:t>
             </w:r>
             <w:r>
               <w:br/>
@@ -39506,7 +39506,7 @@
               <w:rPr>
                 <w:rStyle w:val="CommentTok"/>
               </w:rPr>
-              <w:t xml:space="preserve">#&gt; ethnOther                    -3.2365     2.2663   -1.43  0.15327    </w:t>
+              <w:t xml:space="preserve">#&gt; ethnOther                    -1.5963     2.1745   -0.73   0.4629   </w:t>
             </w:r>
             <w:r>
               <w:br/>
@@ -39515,7 +39515,7 @@
               <w:rPr>
                 <w:rStyle w:val="CommentTok"/>
               </w:rPr>
-              <w:t xml:space="preserve">#&gt; polydrugmultiple drugs used  -4.0532     1.0898   -3.72  0.00020 ***</w:t>
+              <w:t xml:space="preserve">#&gt; polydrugmultiple drugs used  -3.7062     1.3330   -2.78   0.0054 **</w:t>
             </w:r>
             <w:r>
               <w:br/>
@@ -39524,7 +39524,7 @@
               <w:rPr>
                 <w:rStyle w:val="CommentTok"/>
               </w:rPr>
-              <w:t xml:space="preserve">#&gt; hivstatHIV+                  -1.1548     1.3185   -0.88  0.38113    </w:t>
+              <w:t xml:space="preserve">#&gt; hivstatHIV+                  -3.4809     1.5036   -2.32   0.0206 * </w:t>
             </w:r>
             <w:r>
               <w:br/>
@@ -39533,7 +39533,7 @@
               <w:rPr>
                 <w:rStyle w:val="CommentTok"/>
               </w:rPr>
-              <w:t xml:space="preserve">#&gt; sexabuseyes                  -2.6449     1.0772   -2.46  0.01408 *  </w:t>
+              <w:t xml:space="preserve">#&gt; sexabuseyes                  -1.5612     1.2484   -1.25   0.2111   </w:t>
             </w:r>
             <w:r>
               <w:br/>
@@ -39542,7 +39542,7 @@
               <w:rPr>
                 <w:rStyle w:val="CommentTok"/>
               </w:rPr>
-              <w:t xml:space="preserve">#&gt; hplsns                        0.0948     0.0648    1.46  0.14306    </w:t>
+              <w:t xml:space="preserve">#&gt; hplsns                       -0.0449     0.0685   -0.66   0.5119   </w:t>
             </w:r>
             <w:r>
               <w:br/>
@@ -39578,7 +39578,7 @@
               <w:rPr>
                 <w:rStyle w:val="CommentTok"/>
               </w:rPr>
-              <w:t xml:space="preserve">#&gt; (Dispersion parameter for Negative Binomial(0.0913) family taken to be 1)</w:t>
+              <w:t xml:space="preserve">#&gt; (Dispersion parameter for Negative Binomial(0.0899) family taken to be 1)</w:t>
             </w:r>
             <w:r>
               <w:br/>
@@ -39596,7 +39596,7 @@
               <w:rPr>
                 <w:rStyle w:val="CommentTok"/>
               </w:rPr>
-              <w:t xml:space="preserve">#&gt;     Null deviance: 62.231  on 108  degrees of freedom</w:t>
+              <w:t xml:space="preserve">#&gt;     Null deviance: 61.511  on 108  degrees of freedom</w:t>
             </w:r>
             <w:r>
               <w:br/>
@@ -39605,7 +39605,7 @@
               <w:rPr>
                 <w:rStyle w:val="CommentTok"/>
               </w:rPr>
-              <w:t xml:space="preserve">#&gt; Residual deviance: 60.031  on  98  degrees of freedom</w:t>
+              <w:t xml:space="preserve">#&gt; Residual deviance: 52.284  on  98  degrees of freedom</w:t>
             </w:r>
             <w:r>
               <w:br/>
@@ -39623,7 +39623,7 @@
               <w:rPr>
                 <w:rStyle w:val="CommentTok"/>
               </w:rPr>
-              <w:t xml:space="preserve">#&gt; AIC: 267.9</w:t>
+              <w:t xml:space="preserve">#&gt; AIC: 261.5</w:t>
             </w:r>
             <w:r>
               <w:br/>
@@ -39668,7 +39668,7 @@
               <w:rPr>
                 <w:rStyle w:val="CommentTok"/>
               </w:rPr>
-              <w:t xml:space="preserve">#&gt;               Theta:  0.0832 </w:t>
+              <w:t xml:space="preserve">#&gt;               Theta:  0.0904 </w:t>
             </w:r>
             <w:r>
               <w:br/>
@@ -39677,7 +39677,7 @@
               <w:rPr>
                 <w:rStyle w:val="CommentTok"/>
               </w:rPr>
-              <w:t xml:space="preserve">#&gt;           Std. Err.:  0.0216 </w:t>
+              <w:t xml:space="preserve">#&gt;           Std. Err.:  0.0239 </w:t>
             </w:r>
             <w:r>
               <w:br/>
@@ -39704,7 +39704,7 @@
               <w:rPr>
                 <w:rStyle w:val="CommentTok"/>
               </w:rPr>
-              <w:t xml:space="preserve">#&gt;  2 x log-likelihood:  -243.8880</w:t>
+              <w:t xml:space="preserve">#&gt;  2 x log-likelihood:  -237.5430</w:t>
             </w:r>
           </w:p>
           <w:bookmarkEnd w:id="88"/>
@@ -40171,11 +40171,11 @@
               <w:tblLook w:firstRow="1" w:lastRow="0" w:firstColumn="0" w:lastColumn="0" w:noHBand="0" w:noVBand="0" w:val="0020"/>
             </w:tblPr>
             <w:tblGrid>
-              <w:gridCol w:w="3046"/>
-              <w:gridCol w:w="1523"/>
-              <w:gridCol w:w="1320"/>
-              <w:gridCol w:w="1015"/>
-              <w:gridCol w:w="1015"/>
+              <w:gridCol w:w="2970"/>
+              <w:gridCol w:w="1485"/>
+              <w:gridCol w:w="1287"/>
+              <w:gridCol w:w="1089"/>
+              <w:gridCol w:w="1089"/>
             </w:tblGrid>
             <w:tr>
               <w:trPr>
@@ -40296,7 +40296,7 @@
                     <w:jc w:val="center"/>
                   </w:pPr>
                   <w:r>
-                    <w:t xml:space="preserve">6.454</w:t>
+                    <w:t xml:space="preserve">2.895</w:t>
                   </w:r>
                 </w:p>
               </w:tc>
@@ -40309,7 +40309,7 @@
                     <w:jc w:val="center"/>
                   </w:pPr>
                   <w:r>
-                    <w:t xml:space="preserve">1.842</w:t>
+                    <w:t xml:space="preserve">1.929</w:t>
                   </w:r>
                 </w:p>
               </w:tc>
@@ -40363,7 +40363,7 @@
                     <w:jc w:val="center"/>
                   </w:pPr>
                   <w:r>
-                    <w:t xml:space="preserve">1.151</w:t>
+                    <w:t xml:space="preserve">2.553</w:t>
                   </w:r>
                 </w:p>
               </w:tc>
@@ -40376,7 +40376,7 @@
                     <w:jc w:val="center"/>
                   </w:pPr>
                   <w:r>
-                    <w:t xml:space="preserve">0.7366</w:t>
+                    <w:t xml:space="preserve">0.8024</w:t>
                   </w:r>
                 </w:p>
               </w:tc>
@@ -40430,7 +40430,7 @@
                     <w:jc w:val="center"/>
                   </w:pPr>
                   <w:r>
-                    <w:t xml:space="preserve">-0.1485</w:t>
+                    <w:t xml:space="preserve">-0.07291</w:t>
                   </w:r>
                 </w:p>
               </w:tc>
@@ -40443,7 +40443,7 @@
                     <w:jc w:val="center"/>
                   </w:pPr>
                   <w:r>
-                    <w:t xml:space="preserve">0.04326</w:t>
+                    <w:t xml:space="preserve">0.04468</w:t>
                   </w:r>
                 </w:p>
               </w:tc>
@@ -40497,7 +40497,7 @@
                     <w:jc w:val="center"/>
                   </w:pPr>
                   <w:r>
-                    <w:t xml:space="preserve">0.2198</w:t>
+                    <w:t xml:space="preserve">-0.5545</w:t>
                   </w:r>
                 </w:p>
               </w:tc>
@@ -40510,7 +40510,7 @@
                     <w:jc w:val="center"/>
                   </w:pPr>
                   <w:r>
-                    <w:t xml:space="preserve">0.8179</w:t>
+                    <w:t xml:space="preserve">0.8869</w:t>
                   </w:r>
                 </w:p>
               </w:tc>
@@ -40564,7 +40564,7 @@
                     <w:jc w:val="center"/>
                   </w:pPr>
                   <w:r>
-                    <w:t xml:space="preserve">1.596</w:t>
+                    <w:t xml:space="preserve">0.91</w:t>
                   </w:r>
                 </w:p>
               </w:tc>
@@ -40577,7 +40577,7 @@
                     <w:jc w:val="center"/>
                   </w:pPr>
                   <w:r>
-                    <w:t xml:space="preserve">0.889</w:t>
+                    <w:t xml:space="preserve">0.9416</w:t>
                   </w:r>
                 </w:p>
               </w:tc>
@@ -40631,7 +40631,7 @@
                     <w:jc w:val="center"/>
                   </w:pPr>
                   <w:r>
-                    <w:t xml:space="preserve">3.776</w:t>
+                    <w:t xml:space="preserve">2.622</w:t>
                   </w:r>
                 </w:p>
               </w:tc>
@@ -40644,7 +40644,7 @@
                     <w:jc w:val="center"/>
                   </w:pPr>
                   <w:r>
-                    <w:t xml:space="preserve">1.524</w:t>
+                    <w:t xml:space="preserve">1.584</w:t>
                   </w:r>
                 </w:p>
               </w:tc>
@@ -40698,7 +40698,7 @@
                     <w:jc w:val="center"/>
                   </w:pPr>
                   <w:r>
-                    <w:t xml:space="preserve">-3.236</w:t>
+                    <w:t xml:space="preserve">-1.596</w:t>
                   </w:r>
                 </w:p>
               </w:tc>
@@ -40711,7 +40711,7 @@
                     <w:jc w:val="center"/>
                   </w:pPr>
                   <w:r>
-                    <w:t xml:space="preserve">2.266</w:t>
+                    <w:t xml:space="preserve">2.175</w:t>
                   </w:r>
                 </w:p>
               </w:tc>
@@ -40765,7 +40765,7 @@
                     <w:jc w:val="center"/>
                   </w:pPr>
                   <w:r>
-                    <w:t xml:space="preserve">-4.053</w:t>
+                    <w:t xml:space="preserve">-3.706</w:t>
                   </w:r>
                 </w:p>
               </w:tc>
@@ -40778,7 +40778,7 @@
                     <w:jc w:val="center"/>
                   </w:pPr>
                   <w:r>
-                    <w:t xml:space="preserve">1.09</w:t>
+                    <w:t xml:space="preserve">1.333</w:t>
                   </w:r>
                 </w:p>
               </w:tc>
@@ -40832,7 +40832,7 @@
                     <w:jc w:val="center"/>
                   </w:pPr>
                   <w:r>
-                    <w:t xml:space="preserve">-1.155</w:t>
+                    <w:t xml:space="preserve">-3.481</w:t>
                   </w:r>
                 </w:p>
               </w:tc>
@@ -40845,7 +40845,7 @@
                     <w:jc w:val="center"/>
                   </w:pPr>
                   <w:r>
-                    <w:t xml:space="preserve">1.319</w:t>
+                    <w:t xml:space="preserve">1.504</w:t>
                   </w:r>
                 </w:p>
               </w:tc>
@@ -40899,7 +40899,7 @@
                     <w:jc w:val="center"/>
                   </w:pPr>
                   <w:r>
-                    <w:t xml:space="preserve">-2.645</w:t>
+                    <w:t xml:space="preserve">-1.561</w:t>
                   </w:r>
                 </w:p>
               </w:tc>
@@ -40912,7 +40912,7 @@
                     <w:jc w:val="center"/>
                   </w:pPr>
                   <w:r>
-                    <w:t xml:space="preserve">1.077</w:t>
+                    <w:t xml:space="preserve">1.248</w:t>
                   </w:r>
                 </w:p>
               </w:tc>
@@ -40966,7 +40966,7 @@
                     <w:jc w:val="center"/>
                   </w:pPr>
                   <w:r>
-                    <w:t xml:space="preserve">0.09484</w:t>
+                    <w:t xml:space="preserve">-0.0449</w:t>
                   </w:r>
                 </w:p>
               </w:tc>
@@ -40979,7 +40979,7 @@
                     <w:jc w:val="center"/>
                   </w:pPr>
                   <w:r>
-                    <w:t xml:space="preserve">0.06476</w:t>
+                    <w:t xml:space="preserve">0.06845</w:t>
                   </w:r>
                 </w:p>
               </w:tc>

</xml_diff>